<commit_message>
docs(project): revise final project deliverable
</commit_message>
<xml_diff>
--- a/课题交付件.docx
+++ b/课题交付件.docx
@@ -1,6 +1,6 @@
 
 <file path=word/document.xml><?xml version="1.0" encoding="utf-8"?>
-<w:document xmlns:wpc="http://schemas.microsoft.com/office/word/2010/wordprocessingCanvas" xmlns:cx="http://schemas.microsoft.com/office/drawing/2014/chartex" xmlns:cx1="http://schemas.microsoft.com/office/drawing/2015/9/8/chartex" xmlns:cx2="http://schemas.microsoft.com/office/drawing/2015/10/21/chartex" xmlns:cx3="http://schemas.microsoft.com/office/drawing/2016/5/9/chartex" xmlns:cx4="http://schemas.microsoft.com/office/drawing/2016/5/10/chartex" xmlns:cx5="http://schemas.microsoft.com/office/drawing/2016/5/11/chartex" xmlns:cx6="http://schemas.microsoft.com/office/drawing/2016/5/12/chartex" xmlns:cx7="http://schemas.microsoft.com/office/drawing/2016/5/13/chartex" xmlns:cx8="http://schemas.microsoft.com/office/drawing/2016/5/14/chartex" xmlns:mc="http://schemas.openxmlformats.org/markup-compatibility/2006" xmlns:aink="http://schemas.microsoft.com/office/drawing/2016/ink" xmlns:am3d="http://schemas.microsoft.com/office/drawing/2017/model3d" xmlns:o="urn:schemas-microsoft-com:office:office" xmlns:oel="http://schemas.microsoft.com/office/2019/extlst" xmlns:r="http://schemas.openxmlformats.org/officeDocument/2006/relationships" xmlns:m="http://schemas.openxmlformats.org/officeDocument/2006/math" xmlns:v="urn:schemas-microsoft-com:vml" xmlns:wp14="http://schemas.microsoft.com/office/word/2010/wordprocessingDrawing" xmlns:wp="http://schemas.openxmlformats.org/drawingml/2006/wordprocessingDrawing" xmlns:w10="urn:schemas-microsoft-com:office:word" xmlns:w="http://schemas.openxmlformats.org/wordprocessingml/2006/main" xmlns:w14="http://schemas.microsoft.com/office/word/2010/wordml" xmlns:w15="http://schemas.microsoft.com/office/word/2012/wordml" xmlns:w16cex="http://schemas.microsoft.com/office/word/2018/wordml/cex" xmlns:w16cid="http://schemas.microsoft.com/office/word/2016/wordml/cid" xmlns:w16="http://schemas.microsoft.com/office/word/2018/wordml" xmlns:w16du="http://schemas.microsoft.com/office/word/2023/wordml/word16du" xmlns:w16sdtdh="http://schemas.microsoft.com/office/word/2020/wordml/sdtdatahash" xmlns:w16sdtfl="http://schemas.microsoft.com/office/word/2024/wordml/sdtformatlock" xmlns:w16se="http://schemas.microsoft.com/office/word/2015/wordml/symex" xmlns:wpg="http://schemas.microsoft.com/office/word/2010/wordprocessingGroup" xmlns:wpi="http://schemas.microsoft.com/office/word/2010/wordprocessingInk" xmlns:wne="http://schemas.microsoft.com/office/word/2006/wordml" xmlns:wps="http://schemas.microsoft.com/office/word/2010/wordprocessingShape" mc:Ignorable="w14 w15 w16se w16cid w16 w16cex w16sdtdh w16sdtfl w16du wp14">
+<w:document xmlns:wpc="http://schemas.microsoft.com/office/word/2010/wordprocessingCanvas" xmlns:cx="http://schemas.microsoft.com/office/drawing/2014/chartex" xmlns:cx1="http://schemas.microsoft.com/office/drawing/2015/9/8/chartex" xmlns:cx2="http://schemas.microsoft.com/office/drawing/2015/10/21/chartex" xmlns:cx3="http://schemas.microsoft.com/office/drawing/2016/5/9/chartex" xmlns:cx4="http://schemas.microsoft.com/office/drawing/2016/5/10/chartex" xmlns:cx5="http://schemas.microsoft.com/office/drawing/2016/5/11/chartex" xmlns:cx6="http://schemas.microsoft.com/office/drawing/2016/5/12/chartex" xmlns:cx7="http://schemas.microsoft.com/office/drawing/2016/5/13/chartex" xmlns:cx8="http://schemas.microsoft.com/office/drawing/2016/5/14/chartex" xmlns:mc="http://schemas.openxmlformats.org/markup-compatibility/2006" xmlns:aink="http://schemas.microsoft.com/office/drawing/2016/ink" xmlns:am3d="http://schemas.microsoft.com/office/drawing/2017/model3d" xmlns:o="urn:schemas-microsoft-com:office:office" xmlns:oel="http://schemas.microsoft.com/office/2019/extlst" xmlns:r="http://schemas.openxmlformats.org/officeDocument/2006/relationships" xmlns:m="http://schemas.openxmlformats.org/officeDocument/2006/math" xmlns:v="urn:schemas-microsoft-com:vml" xmlns:wp14="http://schemas.microsoft.com/office/word/2010/wordprocessingDrawing" xmlns:wp="http://schemas.openxmlformats.org/drawingml/2006/wordprocessingDrawing" xmlns:w10="urn:schemas-microsoft-com:office:word" xmlns:w="http://schemas.openxmlformats.org/wordprocessingml/2006/main" xmlns:w14="http://schemas.microsoft.com/office/word/2010/wordml" xmlns:w15="http://schemas.microsoft.com/office/word/2012/wordml" xmlns:w16cex="http://schemas.microsoft.com/office/word/2018/wordml/cex" xmlns:w16cid="http://schemas.microsoft.com/office/word/2016/wordml/cid" xmlns:w16="http://schemas.microsoft.com/office/word/2018/wordml" xmlns:w16sdtdh="http://schemas.microsoft.com/office/word/2020/wordml/sdtdatahash" xmlns:w16se="http://schemas.microsoft.com/office/word/2015/wordml/symex" xmlns:wpg="http://schemas.microsoft.com/office/word/2010/wordprocessingGroup" xmlns:wpi="http://schemas.microsoft.com/office/word/2010/wordprocessingInk" xmlns:wne="http://schemas.microsoft.com/office/word/2006/wordml" xmlns:wps="http://schemas.microsoft.com/office/word/2010/wordprocessingShape" mc:Ignorable="w14 w15 w16se w16cid w16 w16cex w16sdtdh wp14">
   <w:body>
     <w:p>
       <w:pPr>
@@ -24,8 +24,16 @@
         <w:rPr>
           <w:rFonts w:hint="eastAsia"/>
         </w:rPr>
-        <w:t>总览</w:t>
+        <w:t>总</w:t>
       </w:r>
+      <w:proofErr w:type="gramStart"/>
+      <w:r>
+        <w:rPr>
+          <w:rFonts w:hint="eastAsia"/>
+        </w:rPr>
+        <w:t>览</w:t>
+      </w:r>
+      <w:proofErr w:type="gramEnd"/>
     </w:p>
     <w:p>
       <w:pPr>
@@ -76,100 +84,67 @@
         <w:adjustRightInd/>
         <w:snapToGrid/>
         <w:spacing w:before="100" w:beforeAutospacing="1" w:after="100" w:afterAutospacing="1" w:line="324" w:lineRule="auto"/>
+        <w:ind w:left="420"/>
       </w:pPr>
       <w:r>
         <w:rPr>
           <w:rFonts w:ascii="微软雅黑" w:eastAsia="微软雅黑" w:hAnsi="微软雅黑"/>
         </w:rPr>
-        <w:t>开发者留存雷达是一套面向高校开发者训练营的统一运营与转化分析平台。系统将活动报名、账号开通、首次任务、最终提交等分散节点统一到同一套签到链路中，通过学号或手机号匹配参与者身份，并以实时漏斗展示各阶段人数、环比转化率和整体完成率。</w:t>
+        <w:t>开发者留存雷达是一套面向高校开发</w:t>
+      </w:r>
+      <w:proofErr w:type="gramStart"/>
+      <w:r>
+        <w:rPr>
+          <w:rFonts w:ascii="微软雅黑" w:eastAsia="微软雅黑" w:hAnsi="微软雅黑"/>
+        </w:rPr>
+        <w:t>者训练</w:t>
+      </w:r>
+      <w:proofErr w:type="gramEnd"/>
+      <w:r>
+        <w:rPr>
+          <w:rFonts w:ascii="微软雅黑" w:eastAsia="微软雅黑" w:hAnsi="微软雅黑"/>
+        </w:rPr>
+        <w:t>营的统一运营与转化分析平台。系统将活动报名、账号开通、首次任务、最终提交等分散节点统一到同一套签到链路中，通过学号或手机号匹配参与者身份，并以实时漏斗展示各阶段人数、环比转化率和整体完成率。</w:t>
       </w:r>
     </w:p>
     <w:p>
       <w:pPr>
-        <w:topLinePunct w:val="0"/>
-        <w:adjustRightInd/>
-        <w:snapToGrid/>
-        <w:spacing w:before="100" w:beforeAutospacing="1" w:after="100" w:afterAutospacing="1" w:line="240" w:lineRule="auto"/>
-      </w:pPr>
-    </w:p>
-    <w:p>
-      <w:pPr>
-        <w:topLinePunct w:val="0"/>
-        <w:adjustRightInd/>
-        <w:snapToGrid/>
-        <w:spacing w:before="100" w:beforeAutospacing="1" w:after="100" w:afterAutospacing="1" w:line="240" w:lineRule="auto"/>
-      </w:pPr>
-    </w:p>
-    <w:p>
-      <w:pPr>
         <w:pStyle w:val="aff8"/>
         <w:spacing w:after="100" w:line="324" w:lineRule="auto"/>
+        <w:ind w:left="420"/>
       </w:pPr>
       <w:r>
         <w:rPr>
           <w:rFonts w:ascii="微软雅黑" w:eastAsia="微软雅黑" w:hAnsi="微软雅黑"/>
         </w:rPr>
-        <w:t>参与者免登录即可通过二维码或链接完成操作；管理员使用账号密码登录后台，完成活动管理、阶段配置、名单筛选、</w:t>
+        <w:t>参与者免登录即可通过</w:t>
       </w:r>
+      <w:proofErr w:type="gramStart"/>
       <w:r>
         <w:rPr>
           <w:rFonts w:ascii="微软雅黑" w:eastAsia="微软雅黑" w:hAnsi="微软雅黑"/>
         </w:rPr>
-        <w:t xml:space="preserve">CSV </w:t>
+        <w:t>二维码或</w:t>
       </w:r>
+      <w:proofErr w:type="gramEnd"/>
       <w:r>
         <w:rPr>
           <w:rFonts w:ascii="微软雅黑" w:eastAsia="微软雅黑" w:hAnsi="微软雅黑"/>
         </w:rPr>
-        <w:t>导出、活动关闭和演示数据重置。项目已使用</w:t>
-      </w:r>
-      <w:r>
-        <w:rPr>
-          <w:rFonts w:ascii="微软雅黑" w:eastAsia="微软雅黑" w:hAnsi="微软雅黑"/>
-        </w:rPr>
-        <w:t xml:space="preserve"> Docker Compose </w:t>
-      </w:r>
-      <w:r>
-        <w:rPr>
-          <w:rFonts w:ascii="微软雅黑" w:eastAsia="微软雅黑" w:hAnsi="微软雅黑"/>
-        </w:rPr>
-        <w:t>部署至华为云</w:t>
-      </w:r>
-      <w:r>
-        <w:rPr>
-          <w:rFonts w:ascii="微软雅黑" w:eastAsia="微软雅黑" w:hAnsi="微软雅黑"/>
-        </w:rPr>
-        <w:t xml:space="preserve"> Flexus </w:t>
-      </w:r>
-      <w:r>
-        <w:rPr>
-          <w:rFonts w:ascii="微软雅黑" w:eastAsia="微软雅黑" w:hAnsi="微软雅黑"/>
-        </w:rPr>
-        <w:t>应用服务器</w:t>
-      </w:r>
-      <w:r>
-        <w:rPr>
-          <w:rFonts w:ascii="微软雅黑" w:eastAsia="微软雅黑" w:hAnsi="微软雅黑"/>
-        </w:rPr>
-        <w:t xml:space="preserve"> L </w:t>
-      </w:r>
-      <w:r>
-        <w:rPr>
-          <w:rFonts w:ascii="微软雅黑" w:eastAsia="微软雅黑" w:hAnsi="微软雅黑"/>
-        </w:rPr>
-        <w:t>实例。</w:t>
+        <w:t>链接完成操作；管理员使用账号密码登录后台，完成活动管理、阶段配置、名单筛选、CSV 导出、活动关闭和演示数据重置。项目已使用 Docker Compose 部署至华为云 Flexus 应用服务器 L 实例。</w:t>
       </w:r>
     </w:p>
     <w:tbl>
       <w:tblPr>
         <w:tblStyle w:val="affc"/>
-        <w:tblW w:w="0" w:type="auto"/>
+        <w:tblW w:w="9216" w:type="dxa"/>
+        <w:tblInd w:w="421" w:type="dxa"/>
         <w:tblLayout w:type="fixed"/>
         <w:tblLook w:val="04A0" w:firstRow="1" w:lastRow="0" w:firstColumn="1" w:lastColumn="0" w:noHBand="0" w:noVBand="1"/>
       </w:tblPr>
       <w:tblGrid>
-        <w:gridCol w:w="2088"/>
-        <w:gridCol w:w="6840"/>
+        <w:gridCol w:w="2551"/>
+        <w:gridCol w:w="6665"/>
       </w:tblGrid>
       <w:tr>
         <w:trPr>
@@ -177,7 +152,7 @@
         </w:trPr>
         <w:tc>
           <w:tcPr>
-            <w:tcW w:w="2088" w:type="dxa"/>
+            <w:tcW w:w="2551" w:type="dxa"/>
             <w:shd w:val="clear" w:color="auto" w:fill="D9EAF7"/>
             <w:tcMar>
               <w:top w:w="35" w:type="dxa"/>
@@ -189,6 +164,8 @@
           <w:p>
             <w:pPr>
               <w:spacing w:after="0" w:line="240" w:lineRule="auto"/>
+              <w:ind w:left="0"/>
+              <w:jc w:val="center"/>
             </w:pPr>
             <w:r>
               <w:rPr>
@@ -202,7 +179,7 @@
         </w:tc>
         <w:tc>
           <w:tcPr>
-            <w:tcW w:w="6840" w:type="dxa"/>
+            <w:tcW w:w="6665" w:type="dxa"/>
             <w:shd w:val="clear" w:color="auto" w:fill="D9EAF7"/>
             <w:tcMar>
               <w:top w:w="35" w:type="dxa"/>
@@ -214,6 +191,8 @@
           <w:p>
             <w:pPr>
               <w:spacing w:after="0" w:line="240" w:lineRule="auto"/>
+              <w:ind w:left="0"/>
+              <w:jc w:val="center"/>
             </w:pPr>
             <w:r>
               <w:rPr>
@@ -229,7 +208,7 @@
       <w:tr>
         <w:tc>
           <w:tcPr>
-            <w:tcW w:w="2088" w:type="dxa"/>
+            <w:tcW w:w="2551" w:type="dxa"/>
             <w:tcMar>
               <w:top w:w="35" w:type="dxa"/>
               <w:left w:w="90" w:type="dxa"/>
@@ -240,11 +219,15 @@
           <w:p>
             <w:pPr>
               <w:spacing w:after="0" w:line="240" w:lineRule="auto"/>
+              <w:ind w:left="0"/>
+              <w:jc w:val="center"/>
+              <w:rPr>
+                <w:rFonts w:ascii="微软雅黑" w:eastAsia="微软雅黑" w:hAnsi="微软雅黑" w:hint="eastAsia"/>
+              </w:rPr>
             </w:pPr>
             <w:r>
               <w:rPr>
                 <w:rFonts w:ascii="微软雅黑" w:eastAsia="微软雅黑" w:hAnsi="微软雅黑"/>
-                <w:sz w:val="18"/>
               </w:rPr>
               <w:t>参赛者</w:t>
             </w:r>
@@ -252,7 +235,7 @@
         </w:tc>
         <w:tc>
           <w:tcPr>
-            <w:tcW w:w="6840" w:type="dxa"/>
+            <w:tcW w:w="6665" w:type="dxa"/>
             <w:tcMar>
               <w:top w:w="35" w:type="dxa"/>
               <w:left w:w="90" w:type="dxa"/>
@@ -263,27 +246,17 @@
           <w:p>
             <w:pPr>
               <w:spacing w:after="0" w:line="240" w:lineRule="auto"/>
+              <w:ind w:left="0"/>
+              <w:jc w:val="center"/>
+              <w:rPr>
+                <w:rFonts w:ascii="微软雅黑" w:eastAsia="微软雅黑" w:hAnsi="微软雅黑" w:hint="eastAsia"/>
+              </w:rPr>
             </w:pPr>
             <w:r>
               <w:rPr>
                 <w:rFonts w:ascii="微软雅黑" w:eastAsia="微软雅黑" w:hAnsi="微软雅黑"/>
-                <w:sz w:val="18"/>
               </w:rPr>
-              <w:t>葛禹贡（学号：</w:t>
-            </w:r>
-            <w:r>
-              <w:rPr>
-                <w:rFonts w:ascii="微软雅黑" w:eastAsia="微软雅黑" w:hAnsi="微软雅黑"/>
-                <w:sz w:val="18"/>
-              </w:rPr>
-              <w:t>20243121880</w:t>
-            </w:r>
-            <w:r>
-              <w:rPr>
-                <w:rFonts w:ascii="微软雅黑" w:eastAsia="微软雅黑" w:hAnsi="微软雅黑"/>
-                <w:sz w:val="18"/>
-              </w:rPr>
-              <w:t>）</w:t>
+              <w:t>葛禹贡（学号：20243121880）</w:t>
             </w:r>
           </w:p>
         </w:tc>
@@ -291,7 +264,7 @@
       <w:tr>
         <w:tc>
           <w:tcPr>
-            <w:tcW w:w="2088" w:type="dxa"/>
+            <w:tcW w:w="2551" w:type="dxa"/>
             <w:tcMar>
               <w:top w:w="35" w:type="dxa"/>
               <w:left w:w="90" w:type="dxa"/>
@@ -302,17 +275,15 @@
           <w:p>
             <w:pPr>
               <w:spacing w:after="0" w:line="240" w:lineRule="auto"/>
+              <w:ind w:left="0"/>
+              <w:jc w:val="center"/>
               <w:rPr>
-                <w:rFonts w:ascii="微软雅黑" w:eastAsia="微软雅黑" w:hAnsi="微软雅黑"/>
-                <w:b/>
-                <w:sz w:val="18"/>
+                <w:rFonts w:ascii="微软雅黑" w:eastAsia="微软雅黑" w:hAnsi="微软雅黑" w:hint="eastAsia"/>
               </w:rPr>
             </w:pPr>
             <w:r>
               <w:rPr>
                 <w:rFonts w:ascii="微软雅黑" w:eastAsia="微软雅黑" w:hAnsi="微软雅黑" w:hint="eastAsia"/>
-                <w:b/>
-                <w:sz w:val="18"/>
               </w:rPr>
               <w:t>组长</w:t>
             </w:r>
@@ -320,7 +291,7 @@
         </w:tc>
         <w:tc>
           <w:tcPr>
-            <w:tcW w:w="6840" w:type="dxa"/>
+            <w:tcW w:w="6665" w:type="dxa"/>
             <w:tcMar>
               <w:top w:w="35" w:type="dxa"/>
               <w:left w:w="90" w:type="dxa"/>
@@ -331,15 +302,15 @@
           <w:p>
             <w:pPr>
               <w:spacing w:after="0" w:line="240" w:lineRule="auto"/>
+              <w:ind w:left="0"/>
+              <w:jc w:val="center"/>
               <w:rPr>
-                <w:rFonts w:ascii="微软雅黑" w:eastAsia="微软雅黑" w:hAnsi="微软雅黑"/>
-                <w:sz w:val="18"/>
+                <w:rFonts w:ascii="微软雅黑" w:eastAsia="微软雅黑" w:hAnsi="微软雅黑" w:hint="eastAsia"/>
               </w:rPr>
             </w:pPr>
             <w:r>
               <w:rPr>
                 <w:rFonts w:ascii="微软雅黑" w:eastAsia="微软雅黑" w:hAnsi="微软雅黑" w:hint="eastAsia"/>
-                <w:sz w:val="18"/>
               </w:rPr>
               <w:t>葛禹贡</w:t>
             </w:r>
@@ -349,7 +320,7 @@
       <w:tr>
         <w:tc>
           <w:tcPr>
-            <w:tcW w:w="2088" w:type="dxa"/>
+            <w:tcW w:w="2551" w:type="dxa"/>
             <w:tcMar>
               <w:top w:w="35" w:type="dxa"/>
               <w:left w:w="90" w:type="dxa"/>
@@ -360,17 +331,15 @@
           <w:p>
             <w:pPr>
               <w:spacing w:after="0" w:line="240" w:lineRule="auto"/>
+              <w:ind w:left="0"/>
+              <w:jc w:val="center"/>
               <w:rPr>
-                <w:rFonts w:ascii="微软雅黑" w:eastAsia="微软雅黑" w:hAnsi="微软雅黑"/>
-                <w:b/>
-                <w:sz w:val="18"/>
+                <w:rFonts w:ascii="微软雅黑" w:eastAsia="微软雅黑" w:hAnsi="微软雅黑" w:hint="eastAsia"/>
               </w:rPr>
             </w:pPr>
             <w:r>
               <w:rPr>
                 <w:rFonts w:ascii="微软雅黑" w:eastAsia="微软雅黑" w:hAnsi="微软雅黑" w:hint="eastAsia"/>
-                <w:b/>
-                <w:sz w:val="18"/>
               </w:rPr>
               <w:t>组员</w:t>
             </w:r>
@@ -378,7 +347,7 @@
         </w:tc>
         <w:tc>
           <w:tcPr>
-            <w:tcW w:w="6840" w:type="dxa"/>
+            <w:tcW w:w="6665" w:type="dxa"/>
             <w:tcMar>
               <w:top w:w="35" w:type="dxa"/>
               <w:left w:w="90" w:type="dxa"/>
@@ -389,17 +358,43 @@
           <w:p>
             <w:pPr>
               <w:spacing w:after="0" w:line="240" w:lineRule="auto"/>
+              <w:ind w:left="0"/>
+              <w:jc w:val="center"/>
               <w:rPr>
-                <w:rFonts w:ascii="微软雅黑" w:eastAsia="微软雅黑" w:hAnsi="微软雅黑"/>
-                <w:sz w:val="18"/>
+                <w:rFonts w:ascii="微软雅黑" w:eastAsia="微软雅黑" w:hAnsi="微软雅黑" w:hint="eastAsia"/>
               </w:rPr>
             </w:pPr>
             <w:r>
               <w:rPr>
                 <w:rFonts w:ascii="微软雅黑" w:eastAsia="微软雅黑" w:hAnsi="微软雅黑" w:hint="eastAsia"/>
-                <w:sz w:val="18"/>
               </w:rPr>
-              <w:t>胡嘉祺、王福洪、赵靖羽、冯天浩、何依瞳、蓝海洋、曾欣欣、张雅</w:t>
+              <w:t>胡嘉祺、王福</w:t>
+            </w:r>
+            <w:r>
+              <w:rPr>
+                <w:rFonts w:ascii="微软雅黑" w:eastAsia="微软雅黑" w:hAnsi="微软雅黑" w:hint="eastAsia"/>
+              </w:rPr>
+              <w:t>淇</w:t>
+            </w:r>
+            <w:r>
+              <w:rPr>
+                <w:rFonts w:ascii="微软雅黑" w:eastAsia="微软雅黑" w:hAnsi="微软雅黑" w:hint="eastAsia"/>
+              </w:rPr>
+              <w:t>、赵靖羽、冯天浩、何依</w:t>
+            </w:r>
+            <w:proofErr w:type="gramStart"/>
+            <w:r>
+              <w:rPr>
+                <w:rFonts w:ascii="微软雅黑" w:eastAsia="微软雅黑" w:hAnsi="微软雅黑" w:hint="eastAsia"/>
+              </w:rPr>
+              <w:t>瞳</w:t>
+            </w:r>
+            <w:proofErr w:type="gramEnd"/>
+            <w:r>
+              <w:rPr>
+                <w:rFonts w:ascii="微软雅黑" w:eastAsia="微软雅黑" w:hAnsi="微软雅黑" w:hint="eastAsia"/>
+              </w:rPr>
+              <w:t>、蓝海洋、曾欣欣、张雅</w:t>
             </w:r>
           </w:p>
         </w:tc>
@@ -407,7 +402,7 @@
       <w:tr>
         <w:tc>
           <w:tcPr>
-            <w:tcW w:w="2088" w:type="dxa"/>
+            <w:tcW w:w="2551" w:type="dxa"/>
             <w:tcMar>
               <w:top w:w="35" w:type="dxa"/>
               <w:left w:w="90" w:type="dxa"/>
@@ -418,33 +413,23 @@
           <w:p>
             <w:pPr>
               <w:spacing w:after="0" w:line="240" w:lineRule="auto"/>
+              <w:ind w:left="0"/>
+              <w:jc w:val="center"/>
+              <w:rPr>
+                <w:rFonts w:ascii="微软雅黑" w:eastAsia="微软雅黑" w:hAnsi="微软雅黑" w:hint="eastAsia"/>
+              </w:rPr>
             </w:pPr>
             <w:r>
               <w:rPr>
                 <w:rFonts w:ascii="微软雅黑" w:eastAsia="微软雅黑" w:hAnsi="微软雅黑"/>
-                <w:sz w:val="18"/>
               </w:rPr>
-              <w:t>学校</w:t>
-            </w:r>
-            <w:r>
-              <w:rPr>
-                <w:rFonts w:ascii="微软雅黑" w:eastAsia="微软雅黑" w:hAnsi="微软雅黑"/>
-                <w:sz w:val="18"/>
-              </w:rPr>
-              <w:t xml:space="preserve"> / </w:t>
-            </w:r>
-            <w:r>
-              <w:rPr>
-                <w:rFonts w:ascii="微软雅黑" w:eastAsia="微软雅黑" w:hAnsi="微软雅黑"/>
-                <w:sz w:val="18"/>
-              </w:rPr>
-              <w:t>指导教师</w:t>
+              <w:t>学校 / 指导教师</w:t>
             </w:r>
           </w:p>
         </w:tc>
         <w:tc>
           <w:tcPr>
-            <w:tcW w:w="6840" w:type="dxa"/>
+            <w:tcW w:w="6665" w:type="dxa"/>
             <w:tcMar>
               <w:top w:w="35" w:type="dxa"/>
               <w:left w:w="90" w:type="dxa"/>
@@ -455,27 +440,17 @@
           <w:p>
             <w:pPr>
               <w:spacing w:after="0" w:line="240" w:lineRule="auto"/>
+              <w:ind w:left="0"/>
+              <w:jc w:val="center"/>
+              <w:rPr>
+                <w:rFonts w:ascii="微软雅黑" w:eastAsia="微软雅黑" w:hAnsi="微软雅黑" w:hint="eastAsia"/>
+              </w:rPr>
             </w:pPr>
             <w:r>
               <w:rPr>
                 <w:rFonts w:ascii="微软雅黑" w:eastAsia="微软雅黑" w:hAnsi="微软雅黑"/>
-                <w:sz w:val="18"/>
               </w:rPr>
-              <w:t>大连理工大学</w:t>
-            </w:r>
-            <w:r>
-              <w:rPr>
-                <w:rFonts w:ascii="微软雅黑" w:eastAsia="微软雅黑" w:hAnsi="微软雅黑"/>
-                <w:sz w:val="18"/>
-              </w:rPr>
-              <w:t xml:space="preserve"> / </w:t>
-            </w:r>
-            <w:r>
-              <w:rPr>
-                <w:rFonts w:ascii="微软雅黑" w:eastAsia="微软雅黑" w:hAnsi="微软雅黑"/>
-                <w:sz w:val="18"/>
-              </w:rPr>
-              <w:t>马瑞新</w:t>
+              <w:t>大连理工大学 / 马瑞新</w:t>
             </w:r>
           </w:p>
         </w:tc>
@@ -483,7 +458,7 @@
       <w:tr>
         <w:tc>
           <w:tcPr>
-            <w:tcW w:w="2088" w:type="dxa"/>
+            <w:tcW w:w="2551" w:type="dxa"/>
             <w:tcMar>
               <w:top w:w="35" w:type="dxa"/>
               <w:left w:w="90" w:type="dxa"/>
@@ -494,11 +469,15 @@
           <w:p>
             <w:pPr>
               <w:spacing w:after="0" w:line="240" w:lineRule="auto"/>
+              <w:ind w:left="0"/>
+              <w:jc w:val="center"/>
+              <w:rPr>
+                <w:rFonts w:ascii="微软雅黑" w:eastAsia="微软雅黑" w:hAnsi="微软雅黑" w:hint="eastAsia"/>
+              </w:rPr>
             </w:pPr>
             <w:r>
               <w:rPr>
                 <w:rFonts w:ascii="微软雅黑" w:eastAsia="微软雅黑" w:hAnsi="微软雅黑"/>
-                <w:sz w:val="18"/>
               </w:rPr>
               <w:t>对应命题</w:t>
             </w:r>
@@ -506,7 +485,7 @@
         </w:tc>
         <w:tc>
           <w:tcPr>
-            <w:tcW w:w="6840" w:type="dxa"/>
+            <w:tcW w:w="6665" w:type="dxa"/>
             <w:tcMar>
               <w:top w:w="35" w:type="dxa"/>
               <w:left w:w="90" w:type="dxa"/>
@@ -517,27 +496,17 @@
           <w:p>
             <w:pPr>
               <w:spacing w:after="0" w:line="240" w:lineRule="auto"/>
+              <w:ind w:left="0"/>
+              <w:jc w:val="center"/>
+              <w:rPr>
+                <w:rFonts w:ascii="微软雅黑" w:eastAsia="微软雅黑" w:hAnsi="微软雅黑" w:hint="eastAsia"/>
+              </w:rPr>
             </w:pPr>
             <w:r>
               <w:rPr>
                 <w:rFonts w:ascii="微软雅黑" w:eastAsia="微软雅黑" w:hAnsi="微软雅黑"/>
-                <w:sz w:val="18"/>
               </w:rPr>
-              <w:t>命题</w:t>
-            </w:r>
-            <w:r>
-              <w:rPr>
-                <w:rFonts w:ascii="微软雅黑" w:eastAsia="微软雅黑" w:hAnsi="微软雅黑"/>
-                <w:sz w:val="18"/>
-              </w:rPr>
-              <w:t xml:space="preserve"> B</w:t>
-            </w:r>
-            <w:r>
-              <w:rPr>
-                <w:rFonts w:ascii="微软雅黑" w:eastAsia="微软雅黑" w:hAnsi="微软雅黑"/>
-                <w:sz w:val="18"/>
-              </w:rPr>
-              <w:t>：促进开发者活跃</w:t>
+              <w:t>命题 B：促进开发者活跃</w:t>
             </w:r>
           </w:p>
         </w:tc>
@@ -545,7 +514,7 @@
       <w:tr>
         <w:tc>
           <w:tcPr>
-            <w:tcW w:w="2088" w:type="dxa"/>
+            <w:tcW w:w="2551" w:type="dxa"/>
             <w:tcMar>
               <w:top w:w="35" w:type="dxa"/>
               <w:left w:w="90" w:type="dxa"/>
@@ -556,11 +525,15 @@
           <w:p>
             <w:pPr>
               <w:spacing w:after="0" w:line="240" w:lineRule="auto"/>
+              <w:ind w:left="0"/>
+              <w:jc w:val="center"/>
+              <w:rPr>
+                <w:rFonts w:ascii="微软雅黑" w:eastAsia="微软雅黑" w:hAnsi="微软雅黑" w:hint="eastAsia"/>
+              </w:rPr>
             </w:pPr>
             <w:r>
               <w:rPr>
                 <w:rFonts w:ascii="微软雅黑" w:eastAsia="微软雅黑" w:hAnsi="微软雅黑"/>
-                <w:sz w:val="18"/>
               </w:rPr>
               <w:t>公网地址</w:t>
             </w:r>
@@ -568,7 +541,7 @@
         </w:tc>
         <w:tc>
           <w:tcPr>
-            <w:tcW w:w="6840" w:type="dxa"/>
+            <w:tcW w:w="6665" w:type="dxa"/>
             <w:tcMar>
               <w:top w:w="35" w:type="dxa"/>
               <w:left w:w="90" w:type="dxa"/>
@@ -579,11 +552,15 @@
           <w:p>
             <w:pPr>
               <w:spacing w:after="0" w:line="240" w:lineRule="auto"/>
+              <w:ind w:left="0"/>
+              <w:jc w:val="center"/>
+              <w:rPr>
+                <w:rFonts w:ascii="微软雅黑" w:eastAsia="微软雅黑" w:hAnsi="微软雅黑" w:hint="eastAsia"/>
+              </w:rPr>
             </w:pPr>
             <w:r>
               <w:rPr>
                 <w:rFonts w:ascii="微软雅黑" w:eastAsia="微软雅黑" w:hAnsi="微软雅黑"/>
-                <w:sz w:val="18"/>
               </w:rPr>
               <w:t>http://123.60.220.148</w:t>
             </w:r>
@@ -593,7 +570,7 @@
       <w:tr>
         <w:tc>
           <w:tcPr>
-            <w:tcW w:w="2088" w:type="dxa"/>
+            <w:tcW w:w="2551" w:type="dxa"/>
             <w:tcMar>
               <w:top w:w="35" w:type="dxa"/>
               <w:left w:w="90" w:type="dxa"/>
@@ -604,20 +581,23 @@
           <w:p>
             <w:pPr>
               <w:spacing w:after="0" w:line="240" w:lineRule="auto"/>
+              <w:ind w:left="0"/>
+              <w:jc w:val="center"/>
+              <w:rPr>
+                <w:rFonts w:ascii="微软雅黑" w:eastAsia="微软雅黑" w:hAnsi="微软雅黑" w:hint="eastAsia"/>
+              </w:rPr>
             </w:pPr>
             <w:r>
               <w:rPr>
                 <w:rFonts w:ascii="微软雅黑" w:eastAsia="微软雅黑" w:hAnsi="微软雅黑"/>
-                <w:sz w:val="18"/>
               </w:rPr>
-              <w:lastRenderedPageBreak/>
               <w:t>代码仓库</w:t>
             </w:r>
           </w:p>
         </w:tc>
         <w:tc>
           <w:tcPr>
-            <w:tcW w:w="6840" w:type="dxa"/>
+            <w:tcW w:w="6665" w:type="dxa"/>
             <w:tcMar>
               <w:top w:w="35" w:type="dxa"/>
               <w:left w:w="90" w:type="dxa"/>
@@ -628,11 +608,15 @@
           <w:p>
             <w:pPr>
               <w:spacing w:after="0" w:line="240" w:lineRule="auto"/>
+              <w:ind w:left="0"/>
+              <w:jc w:val="center"/>
+              <w:rPr>
+                <w:rFonts w:ascii="微软雅黑" w:eastAsia="微软雅黑" w:hAnsi="微软雅黑" w:hint="eastAsia"/>
+              </w:rPr>
             </w:pPr>
             <w:r>
               <w:rPr>
                 <w:rFonts w:ascii="微软雅黑" w:eastAsia="微软雅黑" w:hAnsi="微软雅黑"/>
-                <w:sz w:val="18"/>
               </w:rPr>
               <w:t>https://atomgit.com/GeYugong/developer-retention-radar</w:t>
             </w:r>
@@ -643,6 +627,9 @@
     <w:p>
       <w:pPr>
         <w:spacing w:after="40"/>
+        <w:rPr>
+          <w:rFonts w:ascii="微软雅黑" w:eastAsia="微软雅黑" w:hAnsi="微软雅黑" w:hint="eastAsia"/>
+        </w:rPr>
       </w:pPr>
     </w:p>
     <w:p>
@@ -653,6 +640,7 @@
         </w:rPr>
       </w:pPr>
       <w:r>
+        <w:lastRenderedPageBreak/>
         <w:t>、</w:t>
       </w:r>
       <w:r>
@@ -676,11 +664,6 @@
     </w:p>
     <w:p>
       <w:pPr>
-        <w:pStyle w:val="aff8"/>
-      </w:pPr>
-    </w:p>
-    <w:p>
-      <w:pPr>
         <w:pStyle w:val="2"/>
         <w:rPr>
           <w:rFonts w:hint="eastAsia"/>
@@ -696,6 +679,7 @@
     <w:p>
       <w:pPr>
         <w:pStyle w:val="aff8"/>
+        <w:ind w:left="420"/>
       </w:pPr>
       <w:r>
         <w:rPr>
@@ -703,31 +687,28 @@
         </w:rPr>
         <w:t>项目目标是构建一套可部署、可演示、可审计的训练营留存管理应用，在统一身份识别的基础上打通参与者全流程，并用可视化数据帮助运营人员快速定位流失节点。</w:t>
       </w:r>
-    </w:p>
-    <w:p>
-      <w:pPr>
-        <w:pStyle w:val="aff8"/>
-      </w:pPr>
     </w:p>
     <w:tbl>
       <w:tblPr>
         <w:tblStyle w:val="affc"/>
-        <w:tblW w:w="0" w:type="auto"/>
+        <w:tblW w:w="8919" w:type="dxa"/>
+        <w:tblInd w:w="421" w:type="dxa"/>
         <w:tblLayout w:type="fixed"/>
         <w:tblLook w:val="04A0" w:firstRow="1" w:lastRow="0" w:firstColumn="1" w:lastColumn="0" w:noHBand="0" w:noVBand="1"/>
       </w:tblPr>
       <w:tblGrid>
-        <w:gridCol w:w="1224"/>
-        <w:gridCol w:w="5112"/>
-        <w:gridCol w:w="2592"/>
+        <w:gridCol w:w="2130"/>
+        <w:gridCol w:w="3860"/>
+        <w:gridCol w:w="2929"/>
       </w:tblGrid>
       <w:tr>
         <w:trPr>
+          <w:trHeight w:val="394"/>
           <w:tblHeader/>
         </w:trPr>
         <w:tc>
           <w:tcPr>
-            <w:tcW w:w="1224" w:type="dxa"/>
+            <w:tcW w:w="2130" w:type="dxa"/>
             <w:shd w:val="clear" w:color="auto" w:fill="D9EAF7"/>
             <w:tcMar>
               <w:top w:w="90" w:type="dxa"/>
@@ -739,6 +720,8 @@
           <w:p>
             <w:pPr>
               <w:spacing w:after="0" w:line="276" w:lineRule="auto"/>
+              <w:ind w:left="0"/>
+              <w:jc w:val="center"/>
             </w:pPr>
             <w:r>
               <w:rPr>
@@ -752,7 +735,7 @@
         </w:tc>
         <w:tc>
           <w:tcPr>
-            <w:tcW w:w="5112" w:type="dxa"/>
+            <w:tcW w:w="3860" w:type="dxa"/>
             <w:shd w:val="clear" w:color="auto" w:fill="D9EAF7"/>
             <w:tcMar>
               <w:top w:w="90" w:type="dxa"/>
@@ -764,6 +747,8 @@
           <w:p>
             <w:pPr>
               <w:spacing w:after="0" w:line="276" w:lineRule="auto"/>
+              <w:ind w:left="0"/>
+              <w:jc w:val="center"/>
             </w:pPr>
             <w:r>
               <w:rPr>
@@ -777,7 +762,7 @@
         </w:tc>
         <w:tc>
           <w:tcPr>
-            <w:tcW w:w="2592" w:type="dxa"/>
+            <w:tcW w:w="2929" w:type="dxa"/>
             <w:shd w:val="clear" w:color="auto" w:fill="D9EAF7"/>
             <w:tcMar>
               <w:top w:w="90" w:type="dxa"/>
@@ -789,6 +774,8 @@
           <w:p>
             <w:pPr>
               <w:spacing w:after="0" w:line="276" w:lineRule="auto"/>
+              <w:ind w:left="0"/>
+              <w:jc w:val="center"/>
             </w:pPr>
             <w:r>
               <w:rPr>
@@ -802,9 +789,12 @@
         </w:tc>
       </w:tr>
       <w:tr>
+        <w:trPr>
+          <w:trHeight w:val="639"/>
+        </w:trPr>
         <w:tc>
           <w:tcPr>
-            <w:tcW w:w="1224" w:type="dxa"/>
+            <w:tcW w:w="2130" w:type="dxa"/>
             <w:tcMar>
               <w:top w:w="90" w:type="dxa"/>
               <w:left w:w="110" w:type="dxa"/>
@@ -815,11 +805,15 @@
           <w:p>
             <w:pPr>
               <w:spacing w:after="0" w:line="276" w:lineRule="auto"/>
+              <w:ind w:left="0"/>
+              <w:jc w:val="center"/>
+              <w:rPr>
+                <w:rFonts w:ascii="微软雅黑" w:eastAsia="微软雅黑" w:hAnsi="微软雅黑" w:hint="eastAsia"/>
+              </w:rPr>
             </w:pPr>
             <w:r>
               <w:rPr>
                 <w:rFonts w:ascii="微软雅黑" w:eastAsia="微软雅黑" w:hAnsi="微软雅黑"/>
-                <w:sz w:val="19"/>
               </w:rPr>
               <w:t>需求与设计</w:t>
             </w:r>
@@ -827,7 +821,7 @@
         </w:tc>
         <w:tc>
           <w:tcPr>
-            <w:tcW w:w="5112" w:type="dxa"/>
+            <w:tcW w:w="3860" w:type="dxa"/>
             <w:tcMar>
               <w:top w:w="90" w:type="dxa"/>
               <w:left w:w="110" w:type="dxa"/>
@@ -838,11 +832,15 @@
           <w:p>
             <w:pPr>
               <w:spacing w:after="0" w:line="276" w:lineRule="auto"/>
+              <w:ind w:left="0"/>
+              <w:jc w:val="center"/>
+              <w:rPr>
+                <w:rFonts w:ascii="微软雅黑" w:eastAsia="微软雅黑" w:hAnsi="微软雅黑" w:hint="eastAsia"/>
+              </w:rPr>
             </w:pPr>
             <w:r>
               <w:rPr>
                 <w:rFonts w:ascii="微软雅黑" w:eastAsia="微软雅黑" w:hAnsi="微软雅黑"/>
-                <w:sz w:val="19"/>
               </w:rPr>
               <w:t>梳理报名、阶段签到、身份匹配、漏斗统计和导出流程；确定中文响应式界面。</w:t>
             </w:r>
@@ -850,7 +848,7 @@
         </w:tc>
         <w:tc>
           <w:tcPr>
-            <w:tcW w:w="2592" w:type="dxa"/>
+            <w:tcW w:w="2929" w:type="dxa"/>
             <w:tcMar>
               <w:top w:w="90" w:type="dxa"/>
               <w:left w:w="110" w:type="dxa"/>
@@ -861,11 +859,15 @@
           <w:p>
             <w:pPr>
               <w:spacing w:after="0" w:line="276" w:lineRule="auto"/>
+              <w:ind w:left="0"/>
+              <w:jc w:val="center"/>
+              <w:rPr>
+                <w:rFonts w:ascii="微软雅黑" w:eastAsia="微软雅黑" w:hAnsi="微软雅黑" w:hint="eastAsia"/>
+              </w:rPr>
             </w:pPr>
             <w:r>
               <w:rPr>
                 <w:rFonts w:ascii="微软雅黑" w:eastAsia="微软雅黑" w:hAnsi="微软雅黑"/>
-                <w:sz w:val="19"/>
               </w:rPr>
               <w:t>形成实体模型、接口清单和演示路径。</w:t>
             </w:r>
@@ -873,9 +875,12 @@
         </w:tc>
       </w:tr>
       <w:tr>
+        <w:trPr>
+          <w:trHeight w:val="1170"/>
+        </w:trPr>
         <w:tc>
           <w:tcPr>
-            <w:tcW w:w="1224" w:type="dxa"/>
+            <w:tcW w:w="2130" w:type="dxa"/>
             <w:tcMar>
               <w:top w:w="90" w:type="dxa"/>
               <w:left w:w="110" w:type="dxa"/>
@@ -886,11 +891,15 @@
           <w:p>
             <w:pPr>
               <w:spacing w:after="0" w:line="276" w:lineRule="auto"/>
+              <w:ind w:left="0"/>
+              <w:jc w:val="center"/>
+              <w:rPr>
+                <w:rFonts w:ascii="微软雅黑" w:eastAsia="微软雅黑" w:hAnsi="微软雅黑" w:hint="eastAsia"/>
+              </w:rPr>
             </w:pPr>
             <w:r>
               <w:rPr>
                 <w:rFonts w:ascii="微软雅黑" w:eastAsia="微软雅黑" w:hAnsi="微软雅黑"/>
-                <w:sz w:val="19"/>
               </w:rPr>
               <w:t>后端实现</w:t>
             </w:r>
@@ -898,7 +907,7 @@
         </w:tc>
         <w:tc>
           <w:tcPr>
-            <w:tcW w:w="5112" w:type="dxa"/>
+            <w:tcW w:w="3860" w:type="dxa"/>
             <w:tcMar>
               <w:top w:w="90" w:type="dxa"/>
               <w:left w:w="110" w:type="dxa"/>
@@ -909,33 +918,23 @@
           <w:p>
             <w:pPr>
               <w:spacing w:after="0" w:line="276" w:lineRule="auto"/>
+              <w:ind w:left="0"/>
+              <w:jc w:val="center"/>
+              <w:rPr>
+                <w:rFonts w:ascii="微软雅黑" w:eastAsia="微软雅黑" w:hAnsi="微软雅黑" w:hint="eastAsia"/>
+              </w:rPr>
             </w:pPr>
             <w:r>
               <w:rPr>
                 <w:rFonts w:ascii="微软雅黑" w:eastAsia="微软雅黑" w:hAnsi="微软雅黑"/>
-                <w:sz w:val="19"/>
               </w:rPr>
-              <w:t>实现管理员认证、活动与阶段管理、公开签到、重复保护、统计、</w:t>
-            </w:r>
-            <w:r>
-              <w:rPr>
-                <w:rFonts w:ascii="微软雅黑" w:eastAsia="微软雅黑" w:hAnsi="微软雅黑"/>
-                <w:sz w:val="19"/>
-              </w:rPr>
-              <w:t xml:space="preserve">CSV </w:t>
-            </w:r>
-            <w:r>
-              <w:rPr>
-                <w:rFonts w:ascii="微软雅黑" w:eastAsia="微软雅黑" w:hAnsi="微软雅黑"/>
-                <w:sz w:val="19"/>
-              </w:rPr>
-              <w:t>导出和迁移。</w:t>
+              <w:t>实现管理员认证、活动与阶段管理、公开签到、重复保护、统计、CSV 导出和迁移。</w:t>
             </w:r>
           </w:p>
         </w:tc>
         <w:tc>
           <w:tcPr>
-            <w:tcW w:w="2592" w:type="dxa"/>
+            <w:tcW w:w="2929" w:type="dxa"/>
             <w:tcMar>
               <w:top w:w="90" w:type="dxa"/>
               <w:left w:w="110" w:type="dxa"/>
@@ -946,35 +945,28 @@
           <w:p>
             <w:pPr>
               <w:spacing w:after="0" w:line="276" w:lineRule="auto"/>
+              <w:ind w:left="0"/>
+              <w:jc w:val="center"/>
+              <w:rPr>
+                <w:rFonts w:ascii="微软雅黑" w:eastAsia="微软雅黑" w:hAnsi="微软雅黑" w:hint="eastAsia"/>
+              </w:rPr>
             </w:pPr>
             <w:r>
               <w:rPr>
                 <w:rFonts w:ascii="微软雅黑" w:eastAsia="微软雅黑" w:hAnsi="微软雅黑"/>
-                <w:sz w:val="19"/>
               </w:rPr>
-              <w:t>关键</w:t>
-            </w:r>
-            <w:r>
-              <w:rPr>
-                <w:rFonts w:ascii="微软雅黑" w:eastAsia="微软雅黑" w:hAnsi="微软雅黑"/>
-                <w:sz w:val="19"/>
-              </w:rPr>
-              <w:t xml:space="preserve"> REST API </w:t>
-            </w:r>
-            <w:r>
-              <w:rPr>
-                <w:rFonts w:ascii="微软雅黑" w:eastAsia="微软雅黑" w:hAnsi="微软雅黑"/>
-                <w:sz w:val="19"/>
-              </w:rPr>
-              <w:t>可用，错误响应和输入校验完整。</w:t>
+              <w:t>关键 REST API 可用，错误响应和输入校验完整。</w:t>
             </w:r>
           </w:p>
         </w:tc>
       </w:tr>
       <w:tr>
+        <w:trPr>
+          <w:trHeight w:val="797"/>
+        </w:trPr>
         <w:tc>
           <w:tcPr>
-            <w:tcW w:w="1224" w:type="dxa"/>
+            <w:tcW w:w="2130" w:type="dxa"/>
             <w:tcMar>
               <w:top w:w="90" w:type="dxa"/>
               <w:left w:w="110" w:type="dxa"/>
@@ -985,11 +977,15 @@
           <w:p>
             <w:pPr>
               <w:spacing w:after="0" w:line="276" w:lineRule="auto"/>
+              <w:ind w:left="0"/>
+              <w:jc w:val="center"/>
+              <w:rPr>
+                <w:rFonts w:ascii="微软雅黑" w:eastAsia="微软雅黑" w:hAnsi="微软雅黑" w:hint="eastAsia"/>
+              </w:rPr>
             </w:pPr>
             <w:r>
               <w:rPr>
                 <w:rFonts w:ascii="微软雅黑" w:eastAsia="微软雅黑" w:hAnsi="微软雅黑"/>
-                <w:sz w:val="19"/>
               </w:rPr>
               <w:t>前端实现</w:t>
             </w:r>
@@ -997,7 +993,7 @@
         </w:tc>
         <w:tc>
           <w:tcPr>
-            <w:tcW w:w="5112" w:type="dxa"/>
+            <w:tcW w:w="3860" w:type="dxa"/>
             <w:tcMar>
               <w:top w:w="90" w:type="dxa"/>
               <w:left w:w="110" w:type="dxa"/>
@@ -1008,33 +1004,37 @@
           <w:p>
             <w:pPr>
               <w:spacing w:after="0" w:line="276" w:lineRule="auto"/>
+              <w:ind w:left="0"/>
+              <w:jc w:val="center"/>
+              <w:rPr>
+                <w:rFonts w:ascii="微软雅黑" w:eastAsia="微软雅黑" w:hAnsi="微软雅黑" w:hint="eastAsia"/>
+              </w:rPr>
             </w:pPr>
             <w:r>
               <w:rPr>
                 <w:rFonts w:ascii="微软雅黑" w:eastAsia="微软雅黑" w:hAnsi="微软雅黑"/>
-                <w:sz w:val="19"/>
               </w:rPr>
-              <w:t>实现学生端报名</w:t>
+              <w:t>实现学生端报名/签到页、管理员仪表盘、</w:t>
             </w:r>
+            <w:proofErr w:type="gramStart"/>
             <w:r>
               <w:rPr>
                 <w:rFonts w:ascii="微软雅黑" w:eastAsia="微软雅黑" w:hAnsi="微软雅黑"/>
-                <w:sz w:val="19"/>
               </w:rPr>
-              <w:t>/</w:t>
+              <w:t>二维码入口</w:t>
             </w:r>
+            <w:proofErr w:type="gramEnd"/>
             <w:r>
               <w:rPr>
                 <w:rFonts w:ascii="微软雅黑" w:eastAsia="微软雅黑" w:hAnsi="微软雅黑"/>
-                <w:sz w:val="19"/>
               </w:rPr>
-              <w:t>签到页、管理员仪表盘、二维码入口、参与者名单和活动设置。</w:t>
+              <w:t>、参与者名单和活动设置。</w:t>
             </w:r>
           </w:p>
         </w:tc>
         <w:tc>
           <w:tcPr>
-            <w:tcW w:w="2592" w:type="dxa"/>
+            <w:tcW w:w="2929" w:type="dxa"/>
             <w:tcMar>
               <w:top w:w="90" w:type="dxa"/>
               <w:left w:w="110" w:type="dxa"/>
@@ -1045,21 +1045,42 @@
           <w:p>
             <w:pPr>
               <w:spacing w:after="0" w:line="276" w:lineRule="auto"/>
+              <w:ind w:left="0"/>
+              <w:jc w:val="center"/>
+              <w:rPr>
+                <w:rFonts w:ascii="微软雅黑" w:eastAsia="微软雅黑" w:hAnsi="微软雅黑" w:hint="eastAsia"/>
+              </w:rPr>
             </w:pPr>
             <w:r>
               <w:rPr>
                 <w:rFonts w:ascii="微软雅黑" w:eastAsia="微软雅黑" w:hAnsi="微软雅黑"/>
-                <w:sz w:val="19"/>
               </w:rPr>
-              <w:t>桌面端和手机端均可完成核心流程。</w:t>
+              <w:t>桌面端和</w:t>
+            </w:r>
+            <w:proofErr w:type="gramStart"/>
+            <w:r>
+              <w:rPr>
+                <w:rFonts w:ascii="微软雅黑" w:eastAsia="微软雅黑" w:hAnsi="微软雅黑"/>
+              </w:rPr>
+              <w:t>手机端均可</w:t>
+            </w:r>
+            <w:proofErr w:type="gramEnd"/>
+            <w:r>
+              <w:rPr>
+                <w:rFonts w:ascii="微软雅黑" w:eastAsia="微软雅黑" w:hAnsi="微软雅黑"/>
+              </w:rPr>
+              <w:t>完成核心流程。</w:t>
             </w:r>
           </w:p>
         </w:tc>
       </w:tr>
       <w:tr>
+        <w:trPr>
+          <w:trHeight w:val="797"/>
+        </w:trPr>
         <w:tc>
           <w:tcPr>
-            <w:tcW w:w="1224" w:type="dxa"/>
+            <w:tcW w:w="2130" w:type="dxa"/>
             <w:tcMar>
               <w:top w:w="90" w:type="dxa"/>
               <w:left w:w="110" w:type="dxa"/>
@@ -1070,20 +1091,23 @@
           <w:p>
             <w:pPr>
               <w:spacing w:after="0" w:line="276" w:lineRule="auto"/>
+              <w:ind w:left="0"/>
+              <w:jc w:val="center"/>
+              <w:rPr>
+                <w:rFonts w:ascii="微软雅黑" w:eastAsia="微软雅黑" w:hAnsi="微软雅黑" w:hint="eastAsia"/>
+              </w:rPr>
             </w:pPr>
             <w:r>
               <w:rPr>
                 <w:rFonts w:ascii="微软雅黑" w:eastAsia="微软雅黑" w:hAnsi="微软雅黑"/>
-                <w:sz w:val="19"/>
               </w:rPr>
-              <w:lastRenderedPageBreak/>
               <w:t>测试与部署</w:t>
             </w:r>
           </w:p>
         </w:tc>
         <w:tc>
           <w:tcPr>
-            <w:tcW w:w="5112" w:type="dxa"/>
+            <w:tcW w:w="3860" w:type="dxa"/>
             <w:tcMar>
               <w:top w:w="90" w:type="dxa"/>
               <w:left w:w="110" w:type="dxa"/>
@@ -1094,61 +1118,23 @@
           <w:p>
             <w:pPr>
               <w:spacing w:after="0" w:line="276" w:lineRule="auto"/>
+              <w:ind w:left="0"/>
+              <w:jc w:val="center"/>
+              <w:rPr>
+                <w:rFonts w:ascii="微软雅黑" w:eastAsia="微软雅黑" w:hAnsi="微软雅黑" w:hint="eastAsia"/>
+              </w:rPr>
             </w:pPr>
             <w:r>
               <w:rPr>
                 <w:rFonts w:ascii="微软雅黑" w:eastAsia="微软雅黑" w:hAnsi="微软雅黑"/>
-                <w:sz w:val="19"/>
               </w:rPr>
-              <w:t>补充单元</w:t>
-            </w:r>
-            <w:r>
-              <w:rPr>
-                <w:rFonts w:ascii="微软雅黑" w:eastAsia="微软雅黑" w:hAnsi="微软雅黑"/>
-                <w:sz w:val="19"/>
-              </w:rPr>
-              <w:t>/</w:t>
-            </w:r>
-            <w:r>
-              <w:rPr>
-                <w:rFonts w:ascii="微软雅黑" w:eastAsia="微软雅黑" w:hAnsi="微软雅黑"/>
-                <w:sz w:val="19"/>
-              </w:rPr>
-              <w:t>集成</w:t>
-            </w:r>
-            <w:r>
-              <w:rPr>
-                <w:rFonts w:ascii="微软雅黑" w:eastAsia="微软雅黑" w:hAnsi="微软雅黑"/>
-                <w:sz w:val="19"/>
-              </w:rPr>
-              <w:t>/</w:t>
-            </w:r>
-            <w:r>
-              <w:rPr>
-                <w:rFonts w:ascii="微软雅黑" w:eastAsia="微软雅黑" w:hAnsi="微软雅黑"/>
-                <w:sz w:val="19"/>
-              </w:rPr>
-              <w:t>前端测试，生成固定演示数据，完成</w:t>
-            </w:r>
-            <w:r>
-              <w:rPr>
-                <w:rFonts w:ascii="微软雅黑" w:eastAsia="微软雅黑" w:hAnsi="微软雅黑"/>
-                <w:sz w:val="19"/>
-              </w:rPr>
-              <w:t xml:space="preserve"> Docker </w:t>
-            </w:r>
-            <w:r>
-              <w:rPr>
-                <w:rFonts w:ascii="微软雅黑" w:eastAsia="微软雅黑" w:hAnsi="微软雅黑"/>
-                <w:sz w:val="19"/>
-              </w:rPr>
-              <w:t>与华为云部署。</w:t>
+              <w:t>补充单元/集成/前端测试，生成固定演示数据，完成 Docker 与华为云部署。</w:t>
             </w:r>
           </w:p>
         </w:tc>
         <w:tc>
           <w:tcPr>
-            <w:tcW w:w="2592" w:type="dxa"/>
+            <w:tcW w:w="2929" w:type="dxa"/>
             <w:tcMar>
               <w:top w:w="90" w:type="dxa"/>
               <w:left w:w="110" w:type="dxa"/>
@@ -1159,28 +1145,28 @@
           <w:p>
             <w:pPr>
               <w:spacing w:after="0" w:line="276" w:lineRule="auto"/>
+              <w:ind w:left="0"/>
+              <w:jc w:val="center"/>
+              <w:rPr>
+                <w:rFonts w:ascii="微软雅黑" w:eastAsia="微软雅黑" w:hAnsi="微软雅黑" w:hint="eastAsia"/>
+              </w:rPr>
             </w:pPr>
             <w:r>
               <w:rPr>
                 <w:rFonts w:ascii="微软雅黑" w:eastAsia="微软雅黑" w:hAnsi="微软雅黑"/>
-                <w:sz w:val="19"/>
               </w:rPr>
-              <w:t xml:space="preserve">100→80→50→35 </w:t>
-            </w:r>
-            <w:r>
-              <w:rPr>
-                <w:rFonts w:ascii="微软雅黑" w:eastAsia="微软雅黑" w:hAnsi="微软雅黑"/>
-                <w:sz w:val="19"/>
-              </w:rPr>
-              <w:t>漏斗正确，公网可访问。</w:t>
+              <w:t>100→80→50→35 漏斗正确，公网可访问。</w:t>
             </w:r>
           </w:p>
         </w:tc>
       </w:tr>
       <w:tr>
+        <w:trPr>
+          <w:trHeight w:val="491"/>
+        </w:trPr>
         <w:tc>
           <w:tcPr>
-            <w:tcW w:w="1224" w:type="dxa"/>
+            <w:tcW w:w="2130" w:type="dxa"/>
             <w:tcMar>
               <w:top w:w="90" w:type="dxa"/>
               <w:left w:w="110" w:type="dxa"/>
@@ -1191,11 +1177,15 @@
           <w:p>
             <w:pPr>
               <w:spacing w:after="0" w:line="276" w:lineRule="auto"/>
+              <w:ind w:left="0"/>
+              <w:jc w:val="center"/>
+              <w:rPr>
+                <w:rFonts w:ascii="微软雅黑" w:eastAsia="微软雅黑" w:hAnsi="微软雅黑" w:hint="eastAsia"/>
+              </w:rPr>
             </w:pPr>
             <w:r>
               <w:rPr>
                 <w:rFonts w:ascii="微软雅黑" w:eastAsia="微软雅黑" w:hAnsi="微软雅黑"/>
-                <w:sz w:val="19"/>
               </w:rPr>
               <w:t>交付与演示</w:t>
             </w:r>
@@ -1203,7 +1193,7 @@
         </w:tc>
         <w:tc>
           <w:tcPr>
-            <w:tcW w:w="5112" w:type="dxa"/>
+            <w:tcW w:w="3860" w:type="dxa"/>
             <w:tcMar>
               <w:top w:w="90" w:type="dxa"/>
               <w:left w:w="110" w:type="dxa"/>
@@ -1214,33 +1204,23 @@
           <w:p>
             <w:pPr>
               <w:spacing w:after="0" w:line="276" w:lineRule="auto"/>
+              <w:ind w:left="0"/>
+              <w:jc w:val="center"/>
+              <w:rPr>
+                <w:rFonts w:ascii="微软雅黑" w:eastAsia="微软雅黑" w:hAnsi="微软雅黑" w:hint="eastAsia"/>
+              </w:rPr>
             </w:pPr>
             <w:r>
               <w:rPr>
                 <w:rFonts w:ascii="微软雅黑" w:eastAsia="微软雅黑" w:hAnsi="微软雅黑"/>
-                <w:sz w:val="19"/>
               </w:rPr>
-              <w:t>整理使用手册、演示文档、部署说明、</w:t>
-            </w:r>
-            <w:r>
-              <w:rPr>
-                <w:rFonts w:ascii="微软雅黑" w:eastAsia="微软雅黑" w:hAnsi="微软雅黑"/>
-                <w:sz w:val="19"/>
-              </w:rPr>
-              <w:t xml:space="preserve">VOD </w:t>
-            </w:r>
-            <w:r>
-              <w:rPr>
-                <w:rFonts w:ascii="微软雅黑" w:eastAsia="微软雅黑" w:hAnsi="微软雅黑"/>
-                <w:sz w:val="19"/>
-              </w:rPr>
-              <w:t>建议材料和课题交付件。</w:t>
+              <w:t>整理使用手册、演示文档、部署说明、VOD 建议材料和课题交付件。</w:t>
             </w:r>
           </w:p>
         </w:tc>
         <w:tc>
           <w:tcPr>
-            <w:tcW w:w="2592" w:type="dxa"/>
+            <w:tcW w:w="2929" w:type="dxa"/>
             <w:tcMar>
               <w:top w:w="90" w:type="dxa"/>
               <w:left w:w="110" w:type="dxa"/>
@@ -1251,27 +1231,17 @@
           <w:p>
             <w:pPr>
               <w:spacing w:after="0" w:line="276" w:lineRule="auto"/>
+              <w:ind w:left="0"/>
+              <w:jc w:val="center"/>
+              <w:rPr>
+                <w:rFonts w:ascii="微软雅黑" w:eastAsia="微软雅黑" w:hAnsi="微软雅黑" w:hint="eastAsia"/>
+              </w:rPr>
             </w:pPr>
             <w:r>
               <w:rPr>
                 <w:rFonts w:ascii="微软雅黑" w:eastAsia="微软雅黑" w:hAnsi="微软雅黑"/>
-                <w:sz w:val="19"/>
               </w:rPr>
-              <w:t>代码、</w:t>
-            </w:r>
-            <w:r>
-              <w:rPr>
-                <w:rFonts w:ascii="微软雅黑" w:eastAsia="微软雅黑" w:hAnsi="微软雅黑"/>
-                <w:sz w:val="19"/>
-              </w:rPr>
-              <w:t xml:space="preserve">URL </w:t>
-            </w:r>
-            <w:r>
-              <w:rPr>
-                <w:rFonts w:ascii="微软雅黑" w:eastAsia="微软雅黑" w:hAnsi="微软雅黑"/>
-                <w:sz w:val="19"/>
-              </w:rPr>
-              <w:t>和中文材料齐备。</w:t>
+              <w:t>代码、URL 和中文材料齐备。</w:t>
             </w:r>
           </w:p>
         </w:tc>
@@ -1279,18 +1249,14 @@
     </w:tbl>
     <w:p>
       <w:pPr>
-        <w:spacing w:after="40"/>
-      </w:pPr>
-    </w:p>
-    <w:p>
-      <w:pPr>
-        <w:pStyle w:val="aff8"/>
-        <w:spacing w:after="100" w:line="324" w:lineRule="auto"/>
+        <w:pStyle w:val="2"/>
+        <w:rPr>
+          <w:rFonts w:hint="eastAsia"/>
+        </w:rPr>
       </w:pPr>
       <w:r>
         <w:rPr>
-          <w:rFonts w:ascii="微软雅黑" w:eastAsia="微软雅黑" w:hAnsi="微软雅黑"/>
-          <w:b/>
+          <w:rFonts w:hint="eastAsia"/>
         </w:rPr>
         <w:t>风险规避</w:t>
       </w:r>
@@ -1298,7 +1264,8 @@
     <w:p>
       <w:pPr>
         <w:pStyle w:val="ac"/>
-        <w:spacing w:after="100" w:line="324" w:lineRule="auto"/>
+        <w:spacing w:before="0" w:after="0" w:line="324" w:lineRule="auto"/>
+        <w:ind w:leftChars="200" w:left="852"/>
       </w:pPr>
       <w:r>
         <w:rPr>
@@ -1310,115 +1277,62 @@
     <w:p>
       <w:pPr>
         <w:pStyle w:val="ac"/>
-        <w:spacing w:after="100" w:line="324" w:lineRule="auto"/>
+        <w:spacing w:before="0" w:after="0" w:line="324" w:lineRule="auto"/>
+        <w:ind w:leftChars="200" w:left="852"/>
       </w:pPr>
       <w:r>
         <w:rPr>
           <w:rFonts w:ascii="微软雅黑" w:eastAsia="微软雅黑" w:hAnsi="微软雅黑"/>
         </w:rPr>
-        <w:t>重复统计风险：数据库唯一约束与幂等接口共同保证重复签到不增加人数。</w:t>
+        <w:lastRenderedPageBreak/>
+        <w:t>重复统计风险：数据库唯一约束与</w:t>
+      </w:r>
+      <w:proofErr w:type="gramStart"/>
+      <w:r>
+        <w:rPr>
+          <w:rFonts w:ascii="微软雅黑" w:eastAsia="微软雅黑" w:hAnsi="微软雅黑"/>
+        </w:rPr>
+        <w:t>幂</w:t>
+      </w:r>
+      <w:proofErr w:type="gramEnd"/>
+      <w:r>
+        <w:rPr>
+          <w:rFonts w:ascii="微软雅黑" w:eastAsia="微软雅黑" w:hAnsi="微软雅黑"/>
+        </w:rPr>
+        <w:t>等接口共同保证重复签到不增加人数。</w:t>
       </w:r>
     </w:p>
     <w:p>
       <w:pPr>
         <w:pStyle w:val="ac"/>
-        <w:spacing w:after="100" w:line="324" w:lineRule="auto"/>
+        <w:spacing w:before="0" w:after="0" w:line="324" w:lineRule="auto"/>
+        <w:ind w:leftChars="205" w:left="862"/>
       </w:pPr>
       <w:r>
         <w:rPr>
           <w:rFonts w:ascii="微软雅黑" w:eastAsia="微软雅黑" w:hAnsi="微软雅黑"/>
         </w:rPr>
-        <w:t>部署风险：使用</w:t>
-      </w:r>
-      <w:r>
-        <w:rPr>
-          <w:rFonts w:ascii="微软雅黑" w:eastAsia="微软雅黑" w:hAnsi="微软雅黑"/>
-        </w:rPr>
-        <w:t xml:space="preserve"> Docker Compose </w:t>
-      </w:r>
-      <w:r>
-        <w:rPr>
-          <w:rFonts w:ascii="微软雅黑" w:eastAsia="微软雅黑" w:hAnsi="微软雅黑"/>
-        </w:rPr>
-        <w:t>固化</w:t>
-      </w:r>
-      <w:r>
-        <w:rPr>
-          <w:rFonts w:ascii="微软雅黑" w:eastAsia="微软雅黑" w:hAnsi="微软雅黑"/>
-        </w:rPr>
-        <w:t xml:space="preserve"> Node.js</w:t>
-      </w:r>
-      <w:r>
-        <w:rPr>
-          <w:rFonts w:ascii="微软雅黑" w:eastAsia="微软雅黑" w:hAnsi="微软雅黑"/>
-        </w:rPr>
-        <w:t>、</w:t>
-      </w:r>
-      <w:r>
-        <w:rPr>
-          <w:rFonts w:ascii="微软雅黑" w:eastAsia="微软雅黑" w:hAnsi="微软雅黑"/>
-        </w:rPr>
-        <w:t xml:space="preserve">PostgreSQL </w:t>
-      </w:r>
-      <w:r>
-        <w:rPr>
-          <w:rFonts w:ascii="微软雅黑" w:eastAsia="微软雅黑" w:hAnsi="微软雅黑"/>
-        </w:rPr>
-        <w:t>和</w:t>
-      </w:r>
-      <w:r>
-        <w:rPr>
-          <w:rFonts w:ascii="微软雅黑" w:eastAsia="微软雅黑" w:hAnsi="微软雅黑"/>
-        </w:rPr>
-        <w:t xml:space="preserve"> Nginx </w:t>
-      </w:r>
-      <w:r>
-        <w:rPr>
-          <w:rFonts w:ascii="微软雅黑" w:eastAsia="微软雅黑" w:hAnsi="微软雅黑"/>
-        </w:rPr>
-        <w:t>环境，并提供健康检查。</w:t>
+        <w:t>部署风险：Docker Compose 固化 Node.js、PostgreSQL 和 Nginx 环境，提供健康检查。</w:t>
       </w:r>
     </w:p>
     <w:p>
       <w:pPr>
         <w:pStyle w:val="ac"/>
-        <w:spacing w:after="100" w:line="324" w:lineRule="auto"/>
+        <w:spacing w:before="0" w:after="0" w:line="324" w:lineRule="auto"/>
+        <w:ind w:leftChars="200" w:left="852"/>
       </w:pPr>
       <w:r>
         <w:rPr>
           <w:rFonts w:ascii="微软雅黑" w:eastAsia="微软雅黑" w:hAnsi="微软雅黑"/>
         </w:rPr>
-        <w:t>演示风险：固定随机种子生成</w:t>
-      </w:r>
-      <w:r>
-        <w:rPr>
-          <w:rFonts w:ascii="微软雅黑" w:eastAsia="微软雅黑" w:hAnsi="微软雅黑"/>
-        </w:rPr>
-        <w:t xml:space="preserve"> 38 </w:t>
-      </w:r>
-      <w:r>
-        <w:rPr>
-          <w:rFonts w:ascii="微软雅黑" w:eastAsia="微软雅黑" w:hAnsi="微软雅黑"/>
-        </w:rPr>
-        <w:t>所</w:t>
-      </w:r>
-      <w:r>
-        <w:rPr>
-          <w:rFonts w:ascii="微软雅黑" w:eastAsia="微软雅黑" w:hAnsi="微软雅黑"/>
-        </w:rPr>
-        <w:t xml:space="preserve"> 985 </w:t>
-      </w:r>
-      <w:r>
-        <w:rPr>
-          <w:rFonts w:ascii="微软雅黑" w:eastAsia="微软雅黑" w:hAnsi="微软雅黑"/>
-        </w:rPr>
-        <w:t>高校的确定性演示数据，支持一键重置。</w:t>
+        <w:t>演示风险：固定随机种子生成 38 所 985 高校的确定性演示数据，支持一键重置。</w:t>
       </w:r>
     </w:p>
     <w:p>
       <w:pPr>
         <w:pStyle w:val="ac"/>
-        <w:spacing w:after="100" w:line="324" w:lineRule="auto"/>
+        <w:spacing w:before="0" w:after="0" w:line="324" w:lineRule="auto"/>
+        <w:ind w:leftChars="186" w:left="823"/>
       </w:pPr>
       <w:r>
         <w:rPr>
@@ -1448,24 +1362,69 @@
     </w:p>
     <w:p>
       <w:pPr>
-        <w:pStyle w:val="aff8"/>
+        <w:pStyle w:val="2"/>
+        <w:rPr>
+          <w:rFonts w:hint="eastAsia"/>
+        </w:rPr>
       </w:pPr>
       <w:r>
         <w:rPr>
-          <w:rFonts w:ascii="微软雅黑" w:eastAsia="微软雅黑" w:hAnsi="微软雅黑"/>
-        </w:rPr>
-        <w:t>高校开发者训练营通常使用多个表单、群消息和平台分别收集报名、账号开通、任务完成和最终作品，运营人员难以判断同一参与者在不同阶段的真实进度，也无法及时定位流失最严重的节点。</w:t>
+          <w:rFonts w:hint="eastAsia"/>
+        </w:rPr>
+        <w:t>痛点</w:t>
       </w:r>
     </w:p>
     <w:p>
       <w:pPr>
-        <w:ind w:left="0"/>
-      </w:pPr>
+        <w:pStyle w:val="aff8"/>
+        <w:ind w:left="420"/>
+      </w:pPr>
+      <w:r>
+        <w:rPr>
+          <w:rFonts w:ascii="微软雅黑" w:eastAsia="微软雅黑" w:hAnsi="微软雅黑"/>
+        </w:rPr>
+        <w:t>高校开发</w:t>
+      </w:r>
+      <w:proofErr w:type="gramStart"/>
+      <w:r>
+        <w:rPr>
+          <w:rFonts w:ascii="微软雅黑" w:eastAsia="微软雅黑" w:hAnsi="微软雅黑"/>
+        </w:rPr>
+        <w:t>者训练</w:t>
+      </w:r>
+      <w:proofErr w:type="gramEnd"/>
+      <w:r>
+        <w:rPr>
+          <w:rFonts w:ascii="微软雅黑" w:eastAsia="微软雅黑" w:hAnsi="微软雅黑"/>
+        </w:rPr>
+        <w:t>营通常使用多个表单、</w:t>
+      </w:r>
+      <w:proofErr w:type="gramStart"/>
+      <w:r>
+        <w:rPr>
+          <w:rFonts w:ascii="微软雅黑" w:eastAsia="微软雅黑" w:hAnsi="微软雅黑"/>
+        </w:rPr>
+        <w:t>群消息</w:t>
+      </w:r>
+      <w:proofErr w:type="gramEnd"/>
+      <w:r>
+        <w:rPr>
+          <w:rFonts w:ascii="微软雅黑" w:eastAsia="微软雅黑" w:hAnsi="微软雅黑"/>
+        </w:rPr>
+        <w:t>和平台分别收集报名、账号开通、任务完成和最终作品，运营人员难以判断同一参与者在不同阶段的真实进度，也无法及时定位流失最严重的节点。</w:t>
+      </w:r>
     </w:p>
     <w:p>
       <w:pPr>
-        <w:pStyle w:val="aff8"/>
-        <w:spacing w:after="100" w:line="324" w:lineRule="auto"/>
+        <w:ind w:left="0"/>
+      </w:pPr>
+    </w:p>
+    <w:p>
+      <w:pPr>
+        <w:pStyle w:val="2"/>
+        <w:rPr>
+          <w:rFonts w:hint="eastAsia"/>
+        </w:rPr>
       </w:pPr>
       <w:r>
         <w:rPr>
@@ -1479,18 +1438,34 @@
       <w:pPr>
         <w:pStyle w:val="ac"/>
         <w:spacing w:after="100" w:line="324" w:lineRule="auto"/>
+        <w:ind w:leftChars="200" w:left="852"/>
       </w:pPr>
       <w:r>
         <w:rPr>
           <w:rFonts w:ascii="微软雅黑" w:eastAsia="微软雅黑" w:hAnsi="微软雅黑"/>
         </w:rPr>
-        <w:t>统一入口：每个阶段自动生成专属签到链接和二维码，兼顾现场扫码与远程分发。</w:t>
+        <w:t>统一入口：每个阶段自动生成专属签到链接和二维码，兼顾</w:t>
+      </w:r>
+      <w:proofErr w:type="gramStart"/>
+      <w:r>
+        <w:rPr>
+          <w:rFonts w:ascii="微软雅黑" w:eastAsia="微软雅黑" w:hAnsi="微软雅黑"/>
+        </w:rPr>
+        <w:t>现场扫码与</w:t>
+      </w:r>
+      <w:proofErr w:type="gramEnd"/>
+      <w:r>
+        <w:rPr>
+          <w:rFonts w:ascii="微软雅黑" w:eastAsia="微软雅黑" w:hAnsi="微软雅黑"/>
+        </w:rPr>
+        <w:t>远程分发。</w:t>
       </w:r>
     </w:p>
     <w:p>
       <w:pPr>
         <w:pStyle w:val="ac"/>
         <w:spacing w:after="100" w:line="324" w:lineRule="auto"/>
+        <w:ind w:leftChars="200" w:left="852"/>
       </w:pPr>
       <w:r>
         <w:rPr>
@@ -1503,6 +1478,7 @@
       <w:pPr>
         <w:pStyle w:val="ac"/>
         <w:spacing w:after="100" w:line="324" w:lineRule="auto"/>
+        <w:ind w:leftChars="200" w:left="852"/>
       </w:pPr>
       <w:r>
         <w:rPr>
@@ -1515,30 +1491,20 @@
       <w:pPr>
         <w:pStyle w:val="ac"/>
         <w:spacing w:after="100" w:line="324" w:lineRule="auto"/>
+        <w:ind w:leftChars="200" w:left="852"/>
       </w:pPr>
       <w:r>
         <w:rPr>
           <w:rFonts w:ascii="微软雅黑" w:eastAsia="微软雅黑" w:hAnsi="微软雅黑"/>
         </w:rPr>
-        <w:t>运营闭环：支持活动创建、动态阶段、时间筛选、参与者检索、</w:t>
-      </w:r>
-      <w:r>
-        <w:rPr>
-          <w:rFonts w:ascii="微软雅黑" w:eastAsia="微软雅黑" w:hAnsi="微软雅黑"/>
-        </w:rPr>
-        <w:t xml:space="preserve">CSV </w:t>
-      </w:r>
-      <w:r>
-        <w:rPr>
-          <w:rFonts w:ascii="微软雅黑" w:eastAsia="微软雅黑" w:hAnsi="微软雅黑"/>
-        </w:rPr>
-        <w:t>导出、关闭与历史查询。</w:t>
+        <w:t>运营闭环：支持活动创建、动态阶段、时间筛选、参与者检索、CSV 导出、关闭与历史查询。</w:t>
       </w:r>
     </w:p>
     <w:p>
       <w:pPr>
         <w:pStyle w:val="ac"/>
         <w:spacing w:after="100" w:line="324" w:lineRule="auto"/>
+        <w:ind w:leftChars="200" w:left="852"/>
       </w:pPr>
       <w:r>
         <w:rPr>
@@ -1549,8 +1515,10 @@
     </w:p>
     <w:p>
       <w:pPr>
-        <w:pStyle w:val="aff8"/>
-        <w:spacing w:after="100" w:line="324" w:lineRule="auto"/>
+        <w:pStyle w:val="2"/>
+        <w:rPr>
+          <w:rFonts w:hint="eastAsia"/>
+        </w:rPr>
       </w:pPr>
       <w:r>
         <w:rPr>
@@ -1564,78 +1532,38 @@
       <w:pPr>
         <w:pStyle w:val="aff8"/>
         <w:spacing w:after="100" w:line="324" w:lineRule="auto"/>
+        <w:ind w:left="420"/>
+        <w:rPr>
+          <w:rFonts w:ascii="微软雅黑" w:eastAsia="微软雅黑" w:hAnsi="微软雅黑" w:hint="eastAsia"/>
+        </w:rPr>
       </w:pPr>
       <w:r>
         <w:rPr>
           <w:rFonts w:ascii="微软雅黑" w:eastAsia="微软雅黑" w:hAnsi="微软雅黑"/>
         </w:rPr>
-        <w:t>管理员创建活动并配置阶段</w:t>
+        <w:t>管理员创建活动并配置阶段 → 系统生成</w:t>
       </w:r>
+      <w:proofErr w:type="gramStart"/>
       <w:r>
         <w:rPr>
           <w:rFonts w:ascii="微软雅黑" w:eastAsia="微软雅黑" w:hAnsi="微软雅黑"/>
         </w:rPr>
-        <w:t xml:space="preserve"> → </w:t>
+        <w:t>二维码和</w:t>
       </w:r>
+      <w:proofErr w:type="gramEnd"/>
       <w:r>
         <w:rPr>
           <w:rFonts w:ascii="微软雅黑" w:eastAsia="微软雅黑" w:hAnsi="微软雅黑"/>
         </w:rPr>
-        <w:t>系统生成二维码和链接</w:t>
-      </w:r>
-      <w:r>
-        <w:rPr>
-          <w:rFonts w:ascii="微软雅黑" w:eastAsia="微软雅黑" w:hAnsi="微软雅黑"/>
-        </w:rPr>
-        <w:t xml:space="preserve"> → </w:t>
-      </w:r>
-      <w:r>
-        <w:rPr>
-          <w:rFonts w:ascii="微软雅黑" w:eastAsia="微软雅黑" w:hAnsi="微软雅黑"/>
-        </w:rPr>
-        <w:t>参与者在报名阶段创建身份</w:t>
-      </w:r>
-      <w:r>
-        <w:rPr>
-          <w:rFonts w:ascii="微软雅黑" w:eastAsia="微软雅黑" w:hAnsi="微软雅黑"/>
-        </w:rPr>
-        <w:t xml:space="preserve"> → </w:t>
-      </w:r>
-      <w:r>
-        <w:rPr>
-          <w:rFonts w:ascii="微软雅黑" w:eastAsia="微软雅黑" w:hAnsi="微软雅黑"/>
-        </w:rPr>
-        <w:t>后续阶段按学号或手机号匹配</w:t>
-      </w:r>
-      <w:r>
-        <w:rPr>
-          <w:rFonts w:ascii="微软雅黑" w:eastAsia="微软雅黑" w:hAnsi="微软雅黑"/>
-        </w:rPr>
-        <w:t xml:space="preserve"> → </w:t>
-      </w:r>
-      <w:r>
-        <w:rPr>
-          <w:rFonts w:ascii="微软雅黑" w:eastAsia="微软雅黑" w:hAnsi="微软雅黑"/>
-        </w:rPr>
-        <w:t>签到记录实时写入并更新漏斗</w:t>
-      </w:r>
-      <w:r>
-        <w:rPr>
-          <w:rFonts w:ascii="微软雅黑" w:eastAsia="微软雅黑" w:hAnsi="微软雅黑"/>
-        </w:rPr>
-        <w:t xml:space="preserve"> → </w:t>
-      </w:r>
-      <w:r>
-        <w:rPr>
-          <w:rFonts w:ascii="微软雅黑" w:eastAsia="微软雅黑" w:hAnsi="微软雅黑"/>
-        </w:rPr>
-        <w:t>管理员定位流失人员并导出跟进名单。</w:t>
+        <w:t>链接 → 参与者在报名阶段创建身份 → 后续阶段按学号或手机号匹配 → 签到记录实时写入并更新漏斗 → 管理员定位流失人员并导出跟进名单。</w:t>
       </w:r>
     </w:p>
     <w:p>
       <w:pPr>
-        <w:pStyle w:val="aff8"/>
-        <w:spacing w:after="100" w:line="324" w:lineRule="auto"/>
+        <w:pStyle w:val="2"/>
+        <w:rPr>
+          <w:rFonts w:hint="eastAsia"/>
+        </w:rPr>
       </w:pPr>
       <w:r>
         <w:rPr>
@@ -1649,6 +1577,7 @@
       <w:pPr>
         <w:pStyle w:val="ac"/>
         <w:spacing w:after="100" w:line="324" w:lineRule="auto"/>
+        <w:ind w:leftChars="200" w:left="852"/>
       </w:pPr>
       <w:r>
         <w:rPr>
@@ -1661,6 +1590,7 @@
       <w:pPr>
         <w:pStyle w:val="ac"/>
         <w:spacing w:after="100" w:line="324" w:lineRule="auto"/>
+        <w:ind w:leftChars="200" w:left="852"/>
       </w:pPr>
       <w:r>
         <w:rPr>
@@ -1673,11 +1603,13 @@
       <w:pPr>
         <w:pStyle w:val="ac"/>
         <w:spacing w:after="100" w:line="324" w:lineRule="auto"/>
+        <w:ind w:leftChars="200" w:left="852"/>
       </w:pPr>
       <w:r>
         <w:rPr>
           <w:rFonts w:ascii="微软雅黑" w:eastAsia="微软雅黑" w:hAnsi="微软雅黑"/>
         </w:rPr>
+        <w:lastRenderedPageBreak/>
         <w:t>活动关闭后禁止公开签到，管理员仍可查询和导出历史数据。</w:t>
       </w:r>
     </w:p>
@@ -1685,60 +1617,13 @@
       <w:pPr>
         <w:pStyle w:val="ac"/>
         <w:spacing w:after="100" w:line="324" w:lineRule="auto"/>
+        <w:ind w:leftChars="200" w:left="852"/>
       </w:pPr>
       <w:r>
         <w:rPr>
           <w:rFonts w:ascii="微软雅黑" w:eastAsia="微软雅黑" w:hAnsi="微软雅黑"/>
         </w:rPr>
-        <w:t>阶段转化率</w:t>
-      </w:r>
-      <w:r>
-        <w:rPr>
-          <w:rFonts w:ascii="微软雅黑" w:eastAsia="微软雅黑" w:hAnsi="微软雅黑"/>
-        </w:rPr>
-        <w:t xml:space="preserve"> = </w:t>
-      </w:r>
-      <w:r>
-        <w:rPr>
-          <w:rFonts w:ascii="微软雅黑" w:eastAsia="微软雅黑" w:hAnsi="微软雅黑"/>
-        </w:rPr>
-        <w:t>当前阶段人数</w:t>
-      </w:r>
-      <w:r>
-        <w:rPr>
-          <w:rFonts w:ascii="微软雅黑" w:eastAsia="微软雅黑" w:hAnsi="微软雅黑"/>
-        </w:rPr>
-        <w:t xml:space="preserve"> ÷ </w:t>
-      </w:r>
-      <w:r>
-        <w:rPr>
-          <w:rFonts w:ascii="微软雅黑" w:eastAsia="微软雅黑" w:hAnsi="微软雅黑"/>
-        </w:rPr>
-        <w:t>前一阶段人数；整体完成率</w:t>
-      </w:r>
-      <w:r>
-        <w:rPr>
-          <w:rFonts w:ascii="微软雅黑" w:eastAsia="微软雅黑" w:hAnsi="微软雅黑"/>
-        </w:rPr>
-        <w:t xml:space="preserve"> = </w:t>
-      </w:r>
-      <w:r>
-        <w:rPr>
-          <w:rFonts w:ascii="微软雅黑" w:eastAsia="微软雅黑" w:hAnsi="微软雅黑"/>
-        </w:rPr>
-        <w:t>最终阶段人数</w:t>
-      </w:r>
-      <w:r>
-        <w:rPr>
-          <w:rFonts w:ascii="微软雅黑" w:eastAsia="微软雅黑" w:hAnsi="微软雅黑"/>
-        </w:rPr>
-        <w:t xml:space="preserve"> ÷ </w:t>
-      </w:r>
-      <w:r>
-        <w:rPr>
-          <w:rFonts w:ascii="微软雅黑" w:eastAsia="微软雅黑" w:hAnsi="微软雅黑"/>
-        </w:rPr>
-        <w:t>报名人数。</w:t>
+        <w:t>阶段转化率 = 当前阶段人数 ÷ 前一阶段人数；整体完成率 = 最终阶段人数 ÷ 报名人数。</w:t>
       </w:r>
     </w:p>
     <w:p>
@@ -1769,43 +1654,50 @@
     <w:p>
       <w:pPr>
         <w:pStyle w:val="aff8"/>
+        <w:ind w:leftChars="200" w:left="420"/>
       </w:pPr>
       <w:r>
         <w:rPr>
           <w:rFonts w:ascii="微软雅黑" w:eastAsia="微软雅黑" w:hAnsi="微软雅黑"/>
         </w:rPr>
-        <w:t>系统采用前后端分离的 Web 架构，通过单仓库管理 React 前端和 Node.js API，生产环境由 Nginx 统一提供静态资源并反向代理接口，PostgreSQL 持久化业务与审计数据。</w:t>
+        <w:t>系统采用前后端分离的 Web 架构，通过单仓库管理 React 前端和 Node.js API，生产环境由 Nginx 统一提供静态资源并反向代理接口，PostgreSQL 持久</w:t>
       </w:r>
-    </w:p>
-    <w:p>
-      <w:pPr>
-        <w:pStyle w:val="aff8"/>
-      </w:pPr>
-    </w:p>
-    <w:p>
-      <w:pPr>
-        <w:pStyle w:val="aff8"/>
-      </w:pPr>
+      <w:proofErr w:type="gramStart"/>
+      <w:r>
+        <w:rPr>
+          <w:rFonts w:ascii="微软雅黑" w:eastAsia="微软雅黑" w:hAnsi="微软雅黑"/>
+        </w:rPr>
+        <w:t>化业务</w:t>
+      </w:r>
+      <w:proofErr w:type="gramEnd"/>
+      <w:r>
+        <w:rPr>
+          <w:rFonts w:ascii="微软雅黑" w:eastAsia="微软雅黑" w:hAnsi="微软雅黑"/>
+        </w:rPr>
+        <w:t>与审计数据。</w:t>
+      </w:r>
     </w:p>
     <w:tbl>
       <w:tblPr>
         <w:tblStyle w:val="affc"/>
         <w:tblW w:w="0" w:type="auto"/>
+        <w:tblInd w:w="420" w:type="dxa"/>
         <w:tblLayout w:type="fixed"/>
         <w:tblLook w:val="04A0" w:firstRow="1" w:lastRow="0" w:firstColumn="1" w:lastColumn="0" w:noHBand="0" w:noVBand="1"/>
       </w:tblPr>
       <w:tblGrid>
-        <w:gridCol w:w="1152"/>
-        <w:gridCol w:w="3312"/>
-        <w:gridCol w:w="4464"/>
+        <w:gridCol w:w="2048"/>
+        <w:gridCol w:w="2737"/>
+        <w:gridCol w:w="3833"/>
       </w:tblGrid>
       <w:tr>
         <w:trPr>
+          <w:trHeight w:val="401"/>
           <w:tblHeader/>
         </w:trPr>
         <w:tc>
           <w:tcPr>
-            <w:tcW w:w="1152" w:type="dxa"/>
+            <w:tcW w:w="2048" w:type="dxa"/>
             <w:shd w:val="clear" w:color="auto" w:fill="D9EAF7"/>
             <w:tcMar>
               <w:top w:w="90" w:type="dxa"/>
@@ -1817,6 +1709,7 @@
           <w:p>
             <w:pPr>
               <w:spacing w:after="0" w:line="276" w:lineRule="auto"/>
+              <w:ind w:left="0"/>
             </w:pPr>
             <w:r>
               <w:rPr>
@@ -1830,7 +1723,7 @@
         </w:tc>
         <w:tc>
           <w:tcPr>
-            <w:tcW w:w="3312" w:type="dxa"/>
+            <w:tcW w:w="2737" w:type="dxa"/>
             <w:shd w:val="clear" w:color="auto" w:fill="D9EAF7"/>
             <w:tcMar>
               <w:top w:w="90" w:type="dxa"/>
@@ -1842,6 +1735,7 @@
           <w:p>
             <w:pPr>
               <w:spacing w:after="0" w:line="276" w:lineRule="auto"/>
+              <w:ind w:left="0"/>
             </w:pPr>
             <w:r>
               <w:rPr>
@@ -1855,7 +1749,7 @@
         </w:tc>
         <w:tc>
           <w:tcPr>
-            <w:tcW w:w="4464" w:type="dxa"/>
+            <w:tcW w:w="3833" w:type="dxa"/>
             <w:shd w:val="clear" w:color="auto" w:fill="D9EAF7"/>
             <w:tcMar>
               <w:top w:w="90" w:type="dxa"/>
@@ -1867,6 +1761,7 @@
           <w:p>
             <w:pPr>
               <w:spacing w:after="0" w:line="276" w:lineRule="auto"/>
+              <w:ind w:left="0"/>
             </w:pPr>
             <w:r>
               <w:rPr>
@@ -1880,9 +1775,12 @@
         </w:tc>
       </w:tr>
       <w:tr>
+        <w:trPr>
+          <w:trHeight w:val="810"/>
+        </w:trPr>
         <w:tc>
           <w:tcPr>
-            <w:tcW w:w="1152" w:type="dxa"/>
+            <w:tcW w:w="2048" w:type="dxa"/>
             <w:tcMar>
               <w:top w:w="90" w:type="dxa"/>
               <w:left w:w="110" w:type="dxa"/>
@@ -1893,11 +1791,14 @@
           <w:p>
             <w:pPr>
               <w:spacing w:after="0" w:line="276" w:lineRule="auto"/>
+              <w:ind w:left="0"/>
+              <w:rPr>
+                <w:rFonts w:ascii="微软雅黑" w:eastAsia="微软雅黑" w:hAnsi="微软雅黑" w:hint="eastAsia"/>
+              </w:rPr>
             </w:pPr>
             <w:r>
               <w:rPr>
                 <w:rFonts w:ascii="微软雅黑" w:eastAsia="微软雅黑" w:hAnsi="微软雅黑"/>
-                <w:sz w:val="19"/>
               </w:rPr>
               <w:t>表现层</w:t>
             </w:r>
@@ -1905,7 +1806,7 @@
         </w:tc>
         <w:tc>
           <w:tcPr>
-            <w:tcW w:w="3312" w:type="dxa"/>
+            <w:tcW w:w="2737" w:type="dxa"/>
             <w:tcMar>
               <w:top w:w="90" w:type="dxa"/>
               <w:left w:w="110" w:type="dxa"/>
@@ -1916,61 +1817,22 @@
           <w:p>
             <w:pPr>
               <w:spacing w:after="0" w:line="276" w:lineRule="auto"/>
+              <w:ind w:left="0"/>
+              <w:rPr>
+                <w:rFonts w:ascii="微软雅黑" w:eastAsia="微软雅黑" w:hAnsi="微软雅黑" w:hint="eastAsia"/>
+              </w:rPr>
             </w:pPr>
             <w:r>
               <w:rPr>
                 <w:rFonts w:ascii="微软雅黑" w:eastAsia="微软雅黑" w:hAnsi="微软雅黑"/>
-                <w:sz w:val="19"/>
               </w:rPr>
-              <w:t>React</w:t>
-            </w:r>
-            <w:r>
-              <w:rPr>
-                <w:rFonts w:ascii="微软雅黑" w:eastAsia="微软雅黑" w:hAnsi="微软雅黑"/>
-                <w:sz w:val="19"/>
-              </w:rPr>
-              <w:t>、</w:t>
-            </w:r>
-            <w:r>
-              <w:rPr>
-                <w:rFonts w:ascii="微软雅黑" w:eastAsia="微软雅黑" w:hAnsi="微软雅黑"/>
-                <w:sz w:val="19"/>
-              </w:rPr>
-              <w:t>TypeScript</w:t>
-            </w:r>
-            <w:r>
-              <w:rPr>
-                <w:rFonts w:ascii="微软雅黑" w:eastAsia="微软雅黑" w:hAnsi="微软雅黑"/>
-                <w:sz w:val="19"/>
-              </w:rPr>
-              <w:t>、</w:t>
-            </w:r>
-            <w:r>
-              <w:rPr>
-                <w:rFonts w:ascii="微软雅黑" w:eastAsia="微软雅黑" w:hAnsi="微软雅黑"/>
-                <w:sz w:val="19"/>
-              </w:rPr>
-              <w:t>Vite</w:t>
-            </w:r>
-            <w:r>
-              <w:rPr>
-                <w:rFonts w:ascii="微软雅黑" w:eastAsia="微软雅黑" w:hAnsi="微软雅黑"/>
-                <w:sz w:val="19"/>
-              </w:rPr>
-              <w:t>、</w:t>
-            </w:r>
-            <w:r>
-              <w:rPr>
-                <w:rFonts w:ascii="微软雅黑" w:eastAsia="微软雅黑" w:hAnsi="微软雅黑"/>
-                <w:sz w:val="19"/>
-              </w:rPr>
-              <w:t>ECharts</w:t>
+              <w:t>React、TypeScript、Vite、ECharts</w:t>
             </w:r>
           </w:p>
         </w:tc>
         <w:tc>
           <w:tcPr>
-            <w:tcW w:w="4464" w:type="dxa"/>
+            <w:tcW w:w="3833" w:type="dxa"/>
             <w:tcMar>
               <w:top w:w="90" w:type="dxa"/>
               <w:left w:w="110" w:type="dxa"/>
@@ -1981,11 +1843,14 @@
           <w:p>
             <w:pPr>
               <w:spacing w:after="0" w:line="276" w:lineRule="auto"/>
+              <w:ind w:left="0"/>
+              <w:rPr>
+                <w:rFonts w:ascii="微软雅黑" w:eastAsia="微软雅黑" w:hAnsi="微软雅黑" w:hint="eastAsia"/>
+              </w:rPr>
             </w:pPr>
             <w:r>
               <w:rPr>
                 <w:rFonts w:ascii="微软雅黑" w:eastAsia="微软雅黑" w:hAnsi="微软雅黑"/>
-                <w:sz w:val="19"/>
               </w:rPr>
               <w:t>学生签到、管理员后台、响应式布局、夜间模式和漏斗图表。</w:t>
             </w:r>
@@ -1993,9 +1858,12 @@
         </w:tc>
       </w:tr>
       <w:tr>
+        <w:trPr>
+          <w:trHeight w:val="818"/>
+        </w:trPr>
         <w:tc>
           <w:tcPr>
-            <w:tcW w:w="1152" w:type="dxa"/>
+            <w:tcW w:w="2048" w:type="dxa"/>
             <w:tcMar>
               <w:top w:w="90" w:type="dxa"/>
               <w:left w:w="110" w:type="dxa"/>
@@ -2006,11 +1874,14 @@
           <w:p>
             <w:pPr>
               <w:spacing w:after="0" w:line="276" w:lineRule="auto"/>
+              <w:ind w:left="0"/>
+              <w:rPr>
+                <w:rFonts w:ascii="微软雅黑" w:eastAsia="微软雅黑" w:hAnsi="微软雅黑" w:hint="eastAsia"/>
+              </w:rPr>
             </w:pPr>
             <w:r>
               <w:rPr>
                 <w:rFonts w:ascii="微软雅黑" w:eastAsia="微软雅黑" w:hAnsi="微软雅黑"/>
-                <w:sz w:val="19"/>
               </w:rPr>
               <w:t>接口层</w:t>
             </w:r>
@@ -2018,7 +1889,7 @@
         </w:tc>
         <w:tc>
           <w:tcPr>
-            <w:tcW w:w="3312" w:type="dxa"/>
+            <w:tcW w:w="2737" w:type="dxa"/>
             <w:tcMar>
               <w:top w:w="90" w:type="dxa"/>
               <w:left w:w="110" w:type="dxa"/>
@@ -2029,47 +1900,22 @@
           <w:p>
             <w:pPr>
               <w:spacing w:after="0" w:line="276" w:lineRule="auto"/>
+              <w:ind w:left="0"/>
+              <w:rPr>
+                <w:rFonts w:ascii="微软雅黑" w:eastAsia="微软雅黑" w:hAnsi="微软雅黑" w:hint="eastAsia"/>
+              </w:rPr>
             </w:pPr>
             <w:r>
               <w:rPr>
                 <w:rFonts w:ascii="微软雅黑" w:eastAsia="微软雅黑" w:hAnsi="微软雅黑"/>
-                <w:sz w:val="19"/>
               </w:rPr>
-              <w:t>Node.js</w:t>
-            </w:r>
-            <w:r>
-              <w:rPr>
-                <w:rFonts w:ascii="微软雅黑" w:eastAsia="微软雅黑" w:hAnsi="微软雅黑"/>
-                <w:sz w:val="19"/>
-              </w:rPr>
-              <w:t>、</w:t>
-            </w:r>
-            <w:r>
-              <w:rPr>
-                <w:rFonts w:ascii="微软雅黑" w:eastAsia="微软雅黑" w:hAnsi="微软雅黑"/>
-                <w:sz w:val="19"/>
-              </w:rPr>
-              <w:t>Express</w:t>
-            </w:r>
-            <w:r>
-              <w:rPr>
-                <w:rFonts w:ascii="微软雅黑" w:eastAsia="微软雅黑" w:hAnsi="微软雅黑"/>
-                <w:sz w:val="19"/>
-              </w:rPr>
-              <w:t>、</w:t>
-            </w:r>
-            <w:r>
-              <w:rPr>
-                <w:rFonts w:ascii="微软雅黑" w:eastAsia="微软雅黑" w:hAnsi="微软雅黑"/>
-                <w:sz w:val="19"/>
-              </w:rPr>
-              <w:t>REST API</w:t>
+              <w:t>Node.js、Express、REST API</w:t>
             </w:r>
           </w:p>
         </w:tc>
         <w:tc>
           <w:tcPr>
-            <w:tcW w:w="4464" w:type="dxa"/>
+            <w:tcW w:w="3833" w:type="dxa"/>
             <w:tcMar>
               <w:top w:w="90" w:type="dxa"/>
               <w:left w:w="110" w:type="dxa"/>
@@ -2080,35 +1926,27 @@
           <w:p>
             <w:pPr>
               <w:spacing w:after="0" w:line="276" w:lineRule="auto"/>
+              <w:ind w:left="0"/>
+              <w:rPr>
+                <w:rFonts w:ascii="微软雅黑" w:eastAsia="微软雅黑" w:hAnsi="微软雅黑" w:hint="eastAsia"/>
+              </w:rPr>
             </w:pPr>
             <w:r>
               <w:rPr>
                 <w:rFonts w:ascii="微软雅黑" w:eastAsia="微软雅黑" w:hAnsi="微软雅黑"/>
-                <w:sz w:val="19"/>
               </w:rPr>
-              <w:t>认证、活动</w:t>
-            </w:r>
-            <w:r>
-              <w:rPr>
-                <w:rFonts w:ascii="微软雅黑" w:eastAsia="微软雅黑" w:hAnsi="微软雅黑"/>
-                <w:sz w:val="19"/>
-              </w:rPr>
-              <w:t>/</w:t>
-            </w:r>
-            <w:r>
-              <w:rPr>
-                <w:rFonts w:ascii="微软雅黑" w:eastAsia="微软雅黑" w:hAnsi="微软雅黑"/>
-                <w:sz w:val="19"/>
-              </w:rPr>
-              <w:t>阶段管理、签到、统计、筛选、导出和统一错误处理。</w:t>
+              <w:t>认证、活动/阶段管理、签到、统计、筛选、导出和统一错误处理。</w:t>
             </w:r>
           </w:p>
         </w:tc>
       </w:tr>
       <w:tr>
+        <w:trPr>
+          <w:trHeight w:val="810"/>
+        </w:trPr>
         <w:tc>
           <w:tcPr>
-            <w:tcW w:w="1152" w:type="dxa"/>
+            <w:tcW w:w="2048" w:type="dxa"/>
             <w:tcMar>
               <w:top w:w="90" w:type="dxa"/>
               <w:left w:w="110" w:type="dxa"/>
@@ -2119,11 +1957,14 @@
           <w:p>
             <w:pPr>
               <w:spacing w:after="0" w:line="276" w:lineRule="auto"/>
+              <w:ind w:left="0"/>
+              <w:rPr>
+                <w:rFonts w:ascii="微软雅黑" w:eastAsia="微软雅黑" w:hAnsi="微软雅黑" w:hint="eastAsia"/>
+              </w:rPr>
             </w:pPr>
             <w:r>
               <w:rPr>
                 <w:rFonts w:ascii="微软雅黑" w:eastAsia="微软雅黑" w:hAnsi="微软雅黑"/>
-                <w:sz w:val="19"/>
               </w:rPr>
               <w:t>数据层</w:t>
             </w:r>
@@ -2131,7 +1972,7 @@
         </w:tc>
         <w:tc>
           <w:tcPr>
-            <w:tcW w:w="3312" w:type="dxa"/>
+            <w:tcW w:w="2737" w:type="dxa"/>
             <w:tcMar>
               <w:top w:w="90" w:type="dxa"/>
               <w:left w:w="110" w:type="dxa"/>
@@ -2142,40 +1983,22 @@
           <w:p>
             <w:pPr>
               <w:spacing w:after="0" w:line="276" w:lineRule="auto"/>
+              <w:ind w:left="0"/>
+              <w:rPr>
+                <w:rFonts w:ascii="微软雅黑" w:eastAsia="微软雅黑" w:hAnsi="微软雅黑" w:hint="eastAsia"/>
+              </w:rPr>
             </w:pPr>
             <w:r>
               <w:rPr>
                 <w:rFonts w:ascii="微软雅黑" w:eastAsia="微软雅黑" w:hAnsi="微软雅黑"/>
-                <w:sz w:val="19"/>
               </w:rPr>
-              <w:t>PostgreSQL</w:t>
-            </w:r>
-            <w:r>
-              <w:rPr>
-                <w:rFonts w:ascii="微软雅黑" w:eastAsia="微软雅黑" w:hAnsi="微软雅黑"/>
-                <w:sz w:val="19"/>
-              </w:rPr>
-              <w:t>、</w:t>
-            </w:r>
-            <w:r>
-              <w:rPr>
-                <w:rFonts w:ascii="微软雅黑" w:eastAsia="微软雅黑" w:hAnsi="微软雅黑"/>
-                <w:sz w:val="19"/>
-              </w:rPr>
-              <w:t xml:space="preserve">SQL </w:t>
-            </w:r>
-            <w:r>
-              <w:rPr>
-                <w:rFonts w:ascii="微软雅黑" w:eastAsia="微软雅黑" w:hAnsi="微软雅黑"/>
-                <w:sz w:val="19"/>
-              </w:rPr>
-              <w:t>迁移</w:t>
+              <w:t>PostgreSQL、SQL 迁移</w:t>
             </w:r>
           </w:p>
         </w:tc>
         <w:tc>
           <w:tcPr>
-            <w:tcW w:w="4464" w:type="dxa"/>
+            <w:tcW w:w="3833" w:type="dxa"/>
             <w:tcMar>
               <w:top w:w="90" w:type="dxa"/>
               <w:left w:w="110" w:type="dxa"/>
@@ -2186,21 +2009,41 @@
           <w:p>
             <w:pPr>
               <w:spacing w:after="0" w:line="276" w:lineRule="auto"/>
+              <w:ind w:left="0"/>
+              <w:rPr>
+                <w:rFonts w:ascii="微软雅黑" w:eastAsia="微软雅黑" w:hAnsi="微软雅黑" w:hint="eastAsia"/>
+              </w:rPr>
             </w:pPr>
             <w:r>
               <w:rPr>
                 <w:rFonts w:ascii="微软雅黑" w:eastAsia="微软雅黑" w:hAnsi="微软雅黑"/>
-                <w:sz w:val="19"/>
               </w:rPr>
-              <w:t>管理员、活动、阶段、参与者和签到记录的持久化与唯一约束。</w:t>
+              <w:t>管理员、活动、阶段、参与者和签到记录的持久化</w:t>
+            </w:r>
+            <w:proofErr w:type="gramStart"/>
+            <w:r>
+              <w:rPr>
+                <w:rFonts w:ascii="微软雅黑" w:eastAsia="微软雅黑" w:hAnsi="微软雅黑"/>
+              </w:rPr>
+              <w:t>与唯一</w:t>
+            </w:r>
+            <w:proofErr w:type="gramEnd"/>
+            <w:r>
+              <w:rPr>
+                <w:rFonts w:ascii="微软雅黑" w:eastAsia="微软雅黑" w:hAnsi="微软雅黑"/>
+              </w:rPr>
+              <w:t>约束。</w:t>
             </w:r>
           </w:p>
         </w:tc>
       </w:tr>
       <w:tr>
+        <w:trPr>
+          <w:trHeight w:val="814"/>
+        </w:trPr>
         <w:tc>
           <w:tcPr>
-            <w:tcW w:w="1152" w:type="dxa"/>
+            <w:tcW w:w="2048" w:type="dxa"/>
             <w:tcMar>
               <w:top w:w="90" w:type="dxa"/>
               <w:left w:w="110" w:type="dxa"/>
@@ -2211,11 +2054,14 @@
           <w:p>
             <w:pPr>
               <w:spacing w:after="0" w:line="276" w:lineRule="auto"/>
+              <w:ind w:left="0"/>
+              <w:rPr>
+                <w:rFonts w:ascii="微软雅黑" w:eastAsia="微软雅黑" w:hAnsi="微软雅黑" w:hint="eastAsia"/>
+              </w:rPr>
             </w:pPr>
             <w:r>
               <w:rPr>
                 <w:rFonts w:ascii="微软雅黑" w:eastAsia="微软雅黑" w:hAnsi="微软雅黑"/>
-                <w:sz w:val="19"/>
               </w:rPr>
               <w:t>部署层</w:t>
             </w:r>
@@ -2223,7 +2069,7 @@
         </w:tc>
         <w:tc>
           <w:tcPr>
-            <w:tcW w:w="3312" w:type="dxa"/>
+            <w:tcW w:w="2737" w:type="dxa"/>
             <w:tcMar>
               <w:top w:w="90" w:type="dxa"/>
               <w:left w:w="110" w:type="dxa"/>
@@ -2234,47 +2080,22 @@
           <w:p>
             <w:pPr>
               <w:spacing w:after="0" w:line="276" w:lineRule="auto"/>
+              <w:ind w:left="0"/>
+              <w:rPr>
+                <w:rFonts w:ascii="微软雅黑" w:eastAsia="微软雅黑" w:hAnsi="微软雅黑" w:hint="eastAsia"/>
+              </w:rPr>
             </w:pPr>
             <w:r>
               <w:rPr>
                 <w:rFonts w:ascii="微软雅黑" w:eastAsia="微软雅黑" w:hAnsi="微软雅黑"/>
-                <w:sz w:val="19"/>
               </w:rPr>
-              <w:t>Docker</w:t>
-            </w:r>
-            <w:r>
-              <w:rPr>
-                <w:rFonts w:ascii="微软雅黑" w:eastAsia="微软雅黑" w:hAnsi="微软雅黑"/>
-                <w:sz w:val="19"/>
-              </w:rPr>
-              <w:t>、</w:t>
-            </w:r>
-            <w:r>
-              <w:rPr>
-                <w:rFonts w:ascii="微软雅黑" w:eastAsia="微软雅黑" w:hAnsi="微软雅黑"/>
-                <w:sz w:val="19"/>
-              </w:rPr>
-              <w:t>Docker Compose</w:t>
-            </w:r>
-            <w:r>
-              <w:rPr>
-                <w:rFonts w:ascii="微软雅黑" w:eastAsia="微软雅黑" w:hAnsi="微软雅黑"/>
-                <w:sz w:val="19"/>
-              </w:rPr>
-              <w:t>、</w:t>
-            </w:r>
-            <w:r>
-              <w:rPr>
-                <w:rFonts w:ascii="微软雅黑" w:eastAsia="微软雅黑" w:hAnsi="微软雅黑"/>
-                <w:sz w:val="19"/>
-              </w:rPr>
-              <w:t>Nginx</w:t>
+              <w:t>Docker Compose、Nginx</w:t>
             </w:r>
           </w:p>
         </w:tc>
         <w:tc>
           <w:tcPr>
-            <w:tcW w:w="4464" w:type="dxa"/>
+            <w:tcW w:w="3833" w:type="dxa"/>
             <w:tcMar>
               <w:top w:w="90" w:type="dxa"/>
               <w:left w:w="110" w:type="dxa"/>
@@ -2285,11 +2106,14 @@
           <w:p>
             <w:pPr>
               <w:spacing w:after="0" w:line="276" w:lineRule="auto"/>
+              <w:ind w:left="0"/>
+              <w:rPr>
+                <w:rFonts w:ascii="微软雅黑" w:eastAsia="微软雅黑" w:hAnsi="微软雅黑" w:hint="eastAsia"/>
+              </w:rPr>
             </w:pPr>
             <w:r>
               <w:rPr>
                 <w:rFonts w:ascii="微软雅黑" w:eastAsia="微软雅黑" w:hAnsi="微软雅黑"/>
-                <w:sz w:val="19"/>
               </w:rPr>
               <w:t>容器编排、反向代理、健康检查、环境变量注入和公网访问。</w:t>
             </w:r>
@@ -2297,9 +2121,12 @@
         </w:tc>
       </w:tr>
       <w:tr>
+        <w:trPr>
+          <w:trHeight w:val="810"/>
+        </w:trPr>
         <w:tc>
           <w:tcPr>
-            <w:tcW w:w="1152" w:type="dxa"/>
+            <w:tcW w:w="2048" w:type="dxa"/>
             <w:tcMar>
               <w:top w:w="90" w:type="dxa"/>
               <w:left w:w="110" w:type="dxa"/>
@@ -2310,11 +2137,14 @@
           <w:p>
             <w:pPr>
               <w:spacing w:after="0" w:line="276" w:lineRule="auto"/>
+              <w:ind w:left="0"/>
+              <w:rPr>
+                <w:rFonts w:ascii="微软雅黑" w:eastAsia="微软雅黑" w:hAnsi="微软雅黑" w:hint="eastAsia"/>
+              </w:rPr>
             </w:pPr>
             <w:r>
               <w:rPr>
                 <w:rFonts w:ascii="微软雅黑" w:eastAsia="微软雅黑" w:hAnsi="微软雅黑"/>
-                <w:sz w:val="19"/>
               </w:rPr>
               <w:t>质量层</w:t>
             </w:r>
@@ -2322,7 +2152,7 @@
         </w:tc>
         <w:tc>
           <w:tcPr>
-            <w:tcW w:w="3312" w:type="dxa"/>
+            <w:tcW w:w="2737" w:type="dxa"/>
             <w:tcMar>
               <w:top w:w="90" w:type="dxa"/>
               <w:left w:w="110" w:type="dxa"/>
@@ -2333,47 +2163,22 @@
           <w:p>
             <w:pPr>
               <w:spacing w:after="0" w:line="276" w:lineRule="auto"/>
+              <w:ind w:left="0"/>
+              <w:rPr>
+                <w:rFonts w:ascii="微软雅黑" w:eastAsia="微软雅黑" w:hAnsi="微软雅黑" w:hint="eastAsia"/>
+              </w:rPr>
             </w:pPr>
             <w:r>
               <w:rPr>
                 <w:rFonts w:ascii="微软雅黑" w:eastAsia="微软雅黑" w:hAnsi="微软雅黑"/>
-                <w:sz w:val="19"/>
               </w:rPr>
-              <w:t>Vitest</w:t>
-            </w:r>
-            <w:r>
-              <w:rPr>
-                <w:rFonts w:ascii="微软雅黑" w:eastAsia="微软雅黑" w:hAnsi="微软雅黑"/>
-                <w:sz w:val="19"/>
-              </w:rPr>
-              <w:t>、</w:t>
-            </w:r>
-            <w:r>
-              <w:rPr>
-                <w:rFonts w:ascii="微软雅黑" w:eastAsia="微软雅黑" w:hAnsi="微软雅黑"/>
-                <w:sz w:val="19"/>
-              </w:rPr>
-              <w:t>Supertest</w:t>
-            </w:r>
-            <w:r>
-              <w:rPr>
-                <w:rFonts w:ascii="微软雅黑" w:eastAsia="微软雅黑" w:hAnsi="微软雅黑"/>
-                <w:sz w:val="19"/>
-              </w:rPr>
-              <w:t>、</w:t>
-            </w:r>
-            <w:r>
-              <w:rPr>
-                <w:rFonts w:ascii="微软雅黑" w:eastAsia="微软雅黑" w:hAnsi="微软雅黑"/>
-                <w:sz w:val="19"/>
-              </w:rPr>
-              <w:t>Testing Library</w:t>
+              <w:t>Vitest、Supertest、Testing Library</w:t>
             </w:r>
           </w:p>
         </w:tc>
         <w:tc>
           <w:tcPr>
-            <w:tcW w:w="4464" w:type="dxa"/>
+            <w:tcW w:w="3833" w:type="dxa"/>
             <w:tcMar>
               <w:top w:w="90" w:type="dxa"/>
               <w:left w:w="110" w:type="dxa"/>
@@ -2384,11 +2189,14 @@
           <w:p>
             <w:pPr>
               <w:spacing w:after="0" w:line="276" w:lineRule="auto"/>
+              <w:ind w:left="0"/>
+              <w:rPr>
+                <w:rFonts w:ascii="微软雅黑" w:eastAsia="微软雅黑" w:hAnsi="微软雅黑" w:hint="eastAsia"/>
+              </w:rPr>
             </w:pPr>
             <w:r>
               <w:rPr>
                 <w:rFonts w:ascii="微软雅黑" w:eastAsia="微软雅黑" w:hAnsi="微软雅黑"/>
-                <w:sz w:val="19"/>
               </w:rPr>
               <w:t>覆盖身份匹配、重复签到、转化计算、认证和前端关键交互。</w:t>
             </w:r>
@@ -2398,13 +2206,10 @@
     </w:tbl>
     <w:p>
       <w:pPr>
-        <w:spacing w:after="40"/>
-      </w:pPr>
-    </w:p>
-    <w:p>
-      <w:pPr>
-        <w:pStyle w:val="aff8"/>
-        <w:spacing w:after="100" w:line="324" w:lineRule="auto"/>
+        <w:pStyle w:val="2"/>
+        <w:rPr>
+          <w:rFonts w:hint="eastAsia"/>
+        </w:rPr>
       </w:pPr>
       <w:r>
         <w:rPr>
@@ -2418,37 +2223,42 @@
       <w:pPr>
         <w:pStyle w:val="aff8"/>
         <w:spacing w:after="100" w:line="324" w:lineRule="auto"/>
+        <w:ind w:left="420"/>
       </w:pPr>
       <w:r>
         <w:rPr>
           <w:rFonts w:ascii="微软雅黑" w:eastAsia="微软雅黑" w:hAnsi="微软雅黑"/>
         </w:rPr>
-        <w:lastRenderedPageBreak/>
-        <w:t>浏览器访问公开阶段链接后，前端根据阶段类型渲染对应字段并提交</w:t>
+        <w:t>浏览器访问公开阶段链接后，前端根据阶段类型渲染对应字段并提交 API；服务端完成输入校验、活动状态检查、身份匹配和</w:t>
       </w:r>
+      <w:proofErr w:type="gramStart"/>
       <w:r>
         <w:rPr>
           <w:rFonts w:ascii="微软雅黑" w:eastAsia="微软雅黑" w:hAnsi="微软雅黑"/>
         </w:rPr>
-        <w:t xml:space="preserve"> API</w:t>
+        <w:t>幂</w:t>
       </w:r>
+      <w:proofErr w:type="gramEnd"/>
       <w:r>
         <w:rPr>
           <w:rFonts w:ascii="微软雅黑" w:eastAsia="微软雅黑" w:hAnsi="微软雅黑"/>
         </w:rPr>
-        <w:t>；服务端完成输入校验、活动状态检查、身份匹配和幂等写入。管理员登录后获得安全会话，通过受保护接口查询聚合统计和人员明细。每次签到完成后，后台刷新即可看到最新漏斗。</w:t>
+        <w:t>等写入。管理员登录后获得安全会话，通过受保护接口查询聚合统计和人员明细。每次签到完成后，后台刷新即可看到最新漏斗。</w:t>
       </w:r>
     </w:p>
     <w:p>
       <w:pPr>
-        <w:pStyle w:val="aff8"/>
-        <w:spacing w:after="100" w:line="324" w:lineRule="auto"/>
+        <w:pStyle w:val="2"/>
+        <w:rPr>
+          <w:rFonts w:hint="eastAsia"/>
+        </w:rPr>
       </w:pPr>
       <w:r>
         <w:rPr>
           <w:rFonts w:ascii="微软雅黑" w:eastAsia="微软雅黑" w:hAnsi="微软雅黑"/>
           <w:b/>
         </w:rPr>
+        <w:lastRenderedPageBreak/>
         <w:t>安全与可靠性</w:t>
       </w:r>
     </w:p>
@@ -2456,30 +2266,20 @@
       <w:pPr>
         <w:pStyle w:val="ac"/>
         <w:spacing w:after="100" w:line="324" w:lineRule="auto"/>
+        <w:ind w:leftChars="200" w:left="852"/>
       </w:pPr>
       <w:r>
         <w:rPr>
           <w:rFonts w:ascii="微软雅黑" w:eastAsia="微软雅黑" w:hAnsi="微软雅黑"/>
         </w:rPr>
-        <w:t>管理员密码使用哈希校验，会话采用</w:t>
-      </w:r>
-      <w:r>
-        <w:rPr>
-          <w:rFonts w:ascii="微软雅黑" w:eastAsia="微软雅黑" w:hAnsi="微软雅黑"/>
-        </w:rPr>
-        <w:t xml:space="preserve"> HttpOnly Cookie</w:t>
-      </w:r>
-      <w:r>
-        <w:rPr>
-          <w:rFonts w:ascii="微软雅黑" w:eastAsia="微软雅黑" w:hAnsi="微软雅黑"/>
-        </w:rPr>
-        <w:t>；公开接口实施限流。</w:t>
+        <w:t>管理员密码使用哈希校验，会话采用 HttpOnly Cookie；公开接口实施限流。</w:t>
       </w:r>
     </w:p>
     <w:p>
       <w:pPr>
         <w:pStyle w:val="ac"/>
         <w:spacing w:after="100" w:line="324" w:lineRule="auto"/>
+        <w:ind w:leftChars="200" w:left="852"/>
       </w:pPr>
       <w:r>
         <w:rPr>
@@ -2492,6 +2292,7 @@
       <w:pPr>
         <w:pStyle w:val="ac"/>
         <w:spacing w:after="100" w:line="324" w:lineRule="auto"/>
+        <w:ind w:leftChars="200" w:left="852"/>
       </w:pPr>
       <w:r>
         <w:rPr>
@@ -2504,6 +2305,10 @@
       <w:pPr>
         <w:pStyle w:val="ac"/>
         <w:spacing w:after="100" w:line="324" w:lineRule="auto"/>
+        <w:ind w:leftChars="200" w:left="852"/>
+        <w:rPr>
+          <w:rFonts w:ascii="微软雅黑" w:eastAsia="微软雅黑" w:hAnsi="微软雅黑" w:hint="eastAsia"/>
+        </w:rPr>
       </w:pPr>
       <w:r>
         <w:rPr>
@@ -2514,6 +2319,132 @@
     </w:p>
     <w:p>
       <w:pPr>
+        <w:pStyle w:val="ac"/>
+        <w:spacing w:after="100" w:line="324" w:lineRule="auto"/>
+        <w:rPr>
+          <w:rFonts w:ascii="微软雅黑" w:eastAsia="微软雅黑" w:hAnsi="微软雅黑" w:hint="eastAsia"/>
+        </w:rPr>
+      </w:pPr>
+    </w:p>
+    <w:p>
+      <w:pPr>
+        <w:pStyle w:val="ac"/>
+        <w:spacing w:after="100" w:line="324" w:lineRule="auto"/>
+        <w:rPr>
+          <w:rFonts w:ascii="微软雅黑" w:eastAsia="微软雅黑" w:hAnsi="微软雅黑" w:hint="eastAsia"/>
+        </w:rPr>
+      </w:pPr>
+    </w:p>
+    <w:p>
+      <w:pPr>
+        <w:pStyle w:val="ac"/>
+        <w:spacing w:after="100" w:line="324" w:lineRule="auto"/>
+        <w:rPr>
+          <w:rFonts w:ascii="微软雅黑" w:eastAsia="微软雅黑" w:hAnsi="微软雅黑" w:hint="eastAsia"/>
+        </w:rPr>
+      </w:pPr>
+    </w:p>
+    <w:p>
+      <w:pPr>
+        <w:pStyle w:val="ac"/>
+        <w:spacing w:after="100" w:line="324" w:lineRule="auto"/>
+        <w:rPr>
+          <w:rFonts w:ascii="微软雅黑" w:eastAsia="微软雅黑" w:hAnsi="微软雅黑" w:hint="eastAsia"/>
+        </w:rPr>
+      </w:pPr>
+    </w:p>
+    <w:p>
+      <w:pPr>
+        <w:pStyle w:val="ac"/>
+        <w:spacing w:after="100" w:line="324" w:lineRule="auto"/>
+        <w:rPr>
+          <w:rFonts w:ascii="微软雅黑" w:eastAsia="微软雅黑" w:hAnsi="微软雅黑" w:hint="eastAsia"/>
+        </w:rPr>
+      </w:pPr>
+    </w:p>
+    <w:p>
+      <w:pPr>
+        <w:pStyle w:val="ac"/>
+        <w:spacing w:after="100" w:line="324" w:lineRule="auto"/>
+        <w:rPr>
+          <w:rFonts w:ascii="微软雅黑" w:eastAsia="微软雅黑" w:hAnsi="微软雅黑" w:hint="eastAsia"/>
+        </w:rPr>
+      </w:pPr>
+    </w:p>
+    <w:p>
+      <w:pPr>
+        <w:pStyle w:val="ac"/>
+        <w:spacing w:after="100" w:line="324" w:lineRule="auto"/>
+        <w:rPr>
+          <w:rFonts w:ascii="微软雅黑" w:eastAsia="微软雅黑" w:hAnsi="微软雅黑" w:hint="eastAsia"/>
+        </w:rPr>
+      </w:pPr>
+    </w:p>
+    <w:p>
+      <w:pPr>
+        <w:pStyle w:val="ac"/>
+        <w:spacing w:after="100" w:line="324" w:lineRule="auto"/>
+        <w:rPr>
+          <w:rFonts w:ascii="微软雅黑" w:eastAsia="微软雅黑" w:hAnsi="微软雅黑" w:hint="eastAsia"/>
+        </w:rPr>
+      </w:pPr>
+    </w:p>
+    <w:p>
+      <w:pPr>
+        <w:pStyle w:val="ac"/>
+        <w:spacing w:after="100" w:line="324" w:lineRule="auto"/>
+        <w:rPr>
+          <w:rFonts w:ascii="微软雅黑" w:eastAsia="微软雅黑" w:hAnsi="微软雅黑" w:hint="eastAsia"/>
+        </w:rPr>
+      </w:pPr>
+    </w:p>
+    <w:p>
+      <w:pPr>
+        <w:pStyle w:val="ac"/>
+        <w:spacing w:after="100" w:line="324" w:lineRule="auto"/>
+        <w:rPr>
+          <w:rFonts w:ascii="微软雅黑" w:eastAsia="微软雅黑" w:hAnsi="微软雅黑" w:hint="eastAsia"/>
+        </w:rPr>
+      </w:pPr>
+    </w:p>
+    <w:p>
+      <w:pPr>
+        <w:pStyle w:val="ac"/>
+        <w:spacing w:after="100" w:line="324" w:lineRule="auto"/>
+        <w:rPr>
+          <w:rFonts w:ascii="微软雅黑" w:eastAsia="微软雅黑" w:hAnsi="微软雅黑" w:hint="eastAsia"/>
+        </w:rPr>
+      </w:pPr>
+    </w:p>
+    <w:p>
+      <w:pPr>
+        <w:pStyle w:val="ac"/>
+        <w:spacing w:after="100" w:line="324" w:lineRule="auto"/>
+        <w:rPr>
+          <w:rFonts w:ascii="微软雅黑" w:eastAsia="微软雅黑" w:hAnsi="微软雅黑" w:hint="eastAsia"/>
+        </w:rPr>
+      </w:pPr>
+    </w:p>
+    <w:p>
+      <w:pPr>
+        <w:pStyle w:val="ac"/>
+        <w:spacing w:after="100" w:line="324" w:lineRule="auto"/>
+        <w:rPr>
+          <w:rFonts w:ascii="微软雅黑" w:eastAsia="微软雅黑" w:hAnsi="微软雅黑" w:hint="eastAsia"/>
+        </w:rPr>
+      </w:pPr>
+    </w:p>
+    <w:p>
+      <w:pPr>
+        <w:pStyle w:val="ac"/>
+        <w:spacing w:after="100" w:line="324" w:lineRule="auto"/>
+        <w:rPr>
+          <w:rFonts w:ascii="微软雅黑" w:eastAsia="微软雅黑" w:hAnsi="微软雅黑" w:hint="eastAsia"/>
+        </w:rPr>
+      </w:pPr>
+    </w:p>
+    <w:p>
+      <w:pPr>
         <w:pStyle w:val="1"/>
         <w:rPr>
           <w:rFonts w:hint="eastAsia"/>
@@ -2523,6 +2454,7 @@
         <w:rPr>
           <w:rFonts w:hint="eastAsia"/>
         </w:rPr>
+        <w:lastRenderedPageBreak/>
         <w:t>、</w:t>
       </w:r>
       <w:r>
@@ -2533,26 +2465,30 @@
       </w:r>
     </w:p>
     <w:p>
+      <w:pPr>
+        <w:ind w:left="420"/>
+        <w:rPr>
+          <w:rFonts w:ascii="微软雅黑" w:eastAsia="微软雅黑" w:hAnsi="微软雅黑" w:hint="eastAsia"/>
+          <w:sz w:val="22"/>
+          <w:szCs w:val="22"/>
+        </w:rPr>
+      </w:pPr>
       <w:r>
         <w:rPr>
           <w:rFonts w:ascii="微软雅黑" w:eastAsia="微软雅黑" w:hAnsi="微软雅黑"/>
+          <w:sz w:val="22"/>
+          <w:szCs w:val="22"/>
         </w:rPr>
         <w:t>系统围绕“活动配置—参与者触达—阶段签到—实时分析—名单跟进”形成完整运营闭环，核心功能如下。</w:t>
       </w:r>
     </w:p>
-    <w:p/>
     <w:p>
       <w:pPr>
-        <w:pStyle w:val="aff8"/>
-        <w:spacing w:after="100" w:line="324" w:lineRule="auto"/>
-      </w:pPr>
-      <w:r>
-        <w:rPr>
-          <w:rFonts w:ascii="微软雅黑" w:eastAsia="微软雅黑" w:hAnsi="微软雅黑"/>
-          <w:b/>
-        </w:rPr>
-        <w:t xml:space="preserve">1. </w:t>
-      </w:r>
+        <w:pStyle w:val="2"/>
+        <w:rPr>
+          <w:rFonts w:hint="eastAsia"/>
+        </w:rPr>
+      </w:pPr>
       <w:r>
         <w:rPr>
           <w:rFonts w:ascii="微软雅黑" w:eastAsia="微软雅黑" w:hAnsi="微软雅黑"/>
@@ -2565,6 +2501,7 @@
       <w:pPr>
         <w:pStyle w:val="ac"/>
         <w:spacing w:after="100" w:line="324" w:lineRule="auto"/>
+        <w:ind w:leftChars="200" w:left="852"/>
       </w:pPr>
       <w:r>
         <w:rPr>
@@ -2577,6 +2514,10 @@
       <w:pPr>
         <w:pStyle w:val="ac"/>
         <w:spacing w:after="100" w:line="324" w:lineRule="auto"/>
+        <w:ind w:leftChars="200" w:left="852"/>
+        <w:rPr>
+          <w:rFonts w:ascii="微软雅黑" w:eastAsia="微软雅黑" w:hAnsi="微软雅黑" w:hint="eastAsia"/>
+        </w:rPr>
       </w:pPr>
       <w:r>
         <w:rPr>
@@ -2587,52 +2528,70 @@
     </w:p>
     <w:p>
       <w:pPr>
-        <w:pStyle w:val="aff8"/>
-        <w:spacing w:after="100" w:line="324" w:lineRule="auto"/>
+        <w:pStyle w:val="2"/>
+        <w:rPr>
+          <w:rFonts w:hint="eastAsia"/>
+        </w:rPr>
       </w:pPr>
       <w:r>
         <w:rPr>
           <w:rFonts w:ascii="微软雅黑" w:eastAsia="微软雅黑" w:hAnsi="微软雅黑"/>
           <w:b/>
         </w:rPr>
-        <w:t xml:space="preserve">2. </w:t>
+        <w:t>专属链接、</w:t>
       </w:r>
+      <w:proofErr w:type="gramStart"/>
       <w:r>
         <w:rPr>
           <w:rFonts w:ascii="微软雅黑" w:eastAsia="微软雅黑" w:hAnsi="微软雅黑"/>
           <w:b/>
         </w:rPr>
-        <w:t>专属链接、二维码与复制入口</w:t>
+        <w:t>二维码与</w:t>
+      </w:r>
+      <w:proofErr w:type="gramEnd"/>
+      <w:r>
+        <w:rPr>
+          <w:rFonts w:ascii="微软雅黑" w:eastAsia="微软雅黑" w:hAnsi="微软雅黑"/>
+          <w:b/>
+        </w:rPr>
+        <w:t>复制入口</w:t>
       </w:r>
     </w:p>
     <w:p>
       <w:pPr>
         <w:pStyle w:val="ac"/>
         <w:spacing w:after="100" w:line="324" w:lineRule="auto"/>
+        <w:ind w:leftChars="200" w:left="852"/>
       </w:pPr>
       <w:r>
         <w:rPr>
           <w:rFonts w:ascii="微软雅黑" w:eastAsia="微软雅黑" w:hAnsi="微软雅黑"/>
         </w:rPr>
-        <w:t>每个阶段提供可扫码二维码和完整公网链接；复制失败时提供选中文本回退，兼容</w:t>
+        <w:t>每个阶段提供可扫</w:t>
       </w:r>
+      <w:proofErr w:type="gramStart"/>
       <w:r>
         <w:rPr>
           <w:rFonts w:ascii="微软雅黑" w:eastAsia="微软雅黑" w:hAnsi="微软雅黑"/>
         </w:rPr>
-        <w:t xml:space="preserve"> HTTP </w:t>
+        <w:t>码二维码</w:t>
       </w:r>
+      <w:proofErr w:type="gramEnd"/>
       <w:r>
         <w:rPr>
           <w:rFonts w:ascii="微软雅黑" w:eastAsia="微软雅黑" w:hAnsi="微软雅黑"/>
         </w:rPr>
-        <w:t>环境。</w:t>
+        <w:t>和完整公网链接；复制失败时提供选中文本回退，兼容 HTTP 环境。</w:t>
       </w:r>
     </w:p>
     <w:p>
       <w:pPr>
         <w:pStyle w:val="ac"/>
         <w:spacing w:after="100" w:line="324" w:lineRule="auto"/>
+        <w:ind w:leftChars="200" w:left="852"/>
+        <w:rPr>
+          <w:rFonts w:ascii="微软雅黑" w:eastAsia="微软雅黑" w:hAnsi="微软雅黑" w:hint="eastAsia"/>
+        </w:rPr>
       </w:pPr>
       <w:r>
         <w:rPr>
@@ -2643,28 +2602,40 @@
     </w:p>
     <w:p>
       <w:pPr>
-        <w:pStyle w:val="aff8"/>
-        <w:spacing w:after="100" w:line="324" w:lineRule="auto"/>
+        <w:pStyle w:val="2"/>
+        <w:rPr>
+          <w:rFonts w:hint="eastAsia"/>
+        </w:rPr>
       </w:pPr>
       <w:r>
         <w:rPr>
           <w:rFonts w:ascii="微软雅黑" w:eastAsia="微软雅黑" w:hAnsi="微软雅黑"/>
           <w:b/>
         </w:rPr>
-        <w:t xml:space="preserve">3. </w:t>
+        <w:t>身份匹配与</w:t>
       </w:r>
+      <w:proofErr w:type="gramStart"/>
       <w:r>
         <w:rPr>
           <w:rFonts w:ascii="微软雅黑" w:eastAsia="微软雅黑" w:hAnsi="微软雅黑"/>
           <w:b/>
         </w:rPr>
-        <w:t>身份匹配与幂等签到</w:t>
+        <w:t>幂</w:t>
+      </w:r>
+      <w:proofErr w:type="gramEnd"/>
+      <w:r>
+        <w:rPr>
+          <w:rFonts w:ascii="微软雅黑" w:eastAsia="微软雅黑" w:hAnsi="微软雅黑"/>
+          <w:b/>
+        </w:rPr>
+        <w:t>等签到</w:t>
       </w:r>
     </w:p>
     <w:p>
       <w:pPr>
         <w:pStyle w:val="ac"/>
         <w:spacing w:after="100" w:line="324" w:lineRule="auto"/>
+        <w:ind w:leftChars="200" w:left="852"/>
       </w:pPr>
       <w:r>
         <w:rPr>
@@ -2677,6 +2648,7 @@
       <w:pPr>
         <w:pStyle w:val="ac"/>
         <w:spacing w:after="100" w:line="324" w:lineRule="auto"/>
+        <w:ind w:leftChars="200" w:left="852"/>
       </w:pPr>
       <w:r>
         <w:rPr>
@@ -2687,17 +2659,11 @@
     </w:p>
     <w:p>
       <w:pPr>
-        <w:pStyle w:val="aff8"/>
-        <w:spacing w:after="100" w:line="324" w:lineRule="auto"/>
-      </w:pPr>
-      <w:r>
-        <w:rPr>
-          <w:rFonts w:ascii="微软雅黑" w:eastAsia="微软雅黑" w:hAnsi="微软雅黑"/>
-          <w:b/>
-        </w:rPr>
-        <w:lastRenderedPageBreak/>
-        <w:t xml:space="preserve">4. </w:t>
-      </w:r>
+        <w:pStyle w:val="2"/>
+        <w:rPr>
+          <w:rFonts w:hint="eastAsia"/>
+        </w:rPr>
+      </w:pPr>
       <w:r>
         <w:rPr>
           <w:rFonts w:ascii="微软雅黑" w:eastAsia="微软雅黑" w:hAnsi="微软雅黑"/>
@@ -2710,6 +2676,7 @@
       <w:pPr>
         <w:pStyle w:val="ac"/>
         <w:spacing w:after="100" w:line="324" w:lineRule="auto"/>
+        <w:ind w:leftChars="200" w:left="852"/>
       </w:pPr>
       <w:r>
         <w:rPr>
@@ -2722,6 +2689,7 @@
       <w:pPr>
         <w:pStyle w:val="ac"/>
         <w:spacing w:after="100" w:line="324" w:lineRule="auto"/>
+        <w:ind w:leftChars="200" w:left="852"/>
       </w:pPr>
       <w:r>
         <w:rPr>
@@ -2732,21 +2700,17 @@
     </w:p>
     <w:p>
       <w:pPr>
-        <w:pStyle w:val="aff8"/>
-        <w:spacing w:after="100" w:line="324" w:lineRule="auto"/>
+        <w:pStyle w:val="2"/>
+        <w:rPr>
+          <w:rFonts w:hint="eastAsia"/>
+        </w:rPr>
       </w:pPr>
       <w:r>
         <w:rPr>
           <w:rFonts w:ascii="微软雅黑" w:eastAsia="微软雅黑" w:hAnsi="微软雅黑"/>
           <w:b/>
         </w:rPr>
-        <w:t xml:space="preserve">5. </w:t>
-      </w:r>
-      <w:r>
-        <w:rPr>
-          <w:rFonts w:ascii="微软雅黑" w:eastAsia="微软雅黑" w:hAnsi="微软雅黑"/>
-          <w:b/>
-        </w:rPr>
+        <w:lastRenderedPageBreak/>
         <w:t>参与者名单与运营跟进</w:t>
       </w:r>
     </w:p>
@@ -2754,6 +2718,7 @@
       <w:pPr>
         <w:pStyle w:val="ac"/>
         <w:spacing w:after="100" w:line="324" w:lineRule="auto"/>
+        <w:ind w:leftChars="200" w:left="852"/>
       </w:pPr>
       <w:r>
         <w:rPr>
@@ -2766,51 +2731,45 @@
       <w:pPr>
         <w:pStyle w:val="ac"/>
         <w:spacing w:after="100" w:line="324" w:lineRule="auto"/>
+        <w:ind w:leftChars="200" w:left="852"/>
+        <w:rPr>
+          <w:rFonts w:ascii="微软雅黑" w:eastAsia="微软雅黑" w:hAnsi="微软雅黑" w:hint="eastAsia"/>
+        </w:rPr>
       </w:pPr>
       <w:r>
         <w:rPr>
           <w:rFonts w:ascii="微软雅黑" w:eastAsia="微软雅黑" w:hAnsi="微软雅黑"/>
         </w:rPr>
-        <w:t>导出</w:t>
-      </w:r>
-      <w:r>
-        <w:rPr>
-          <w:rFonts w:ascii="微软雅黑" w:eastAsia="微软雅黑" w:hAnsi="微软雅黑"/>
-        </w:rPr>
-        <w:t xml:space="preserve"> CSV </w:t>
-      </w:r>
-      <w:r>
-        <w:rPr>
-          <w:rFonts w:ascii="微软雅黑" w:eastAsia="微软雅黑" w:hAnsi="微软雅黑"/>
-        </w:rPr>
-        <w:t>名单，保留报名时间、作品链接、签到时间和来源等审计信息。</w:t>
+        <w:t>导出 CSV 名单，保留报名时间、作品链接、签到时间和来源等审计信息。</w:t>
       </w:r>
     </w:p>
     <w:p>
       <w:pPr>
-        <w:pStyle w:val="aff8"/>
-        <w:spacing w:after="100" w:line="324" w:lineRule="auto"/>
+        <w:pStyle w:val="2"/>
+        <w:rPr>
+          <w:rFonts w:hint="eastAsia"/>
+        </w:rPr>
       </w:pPr>
       <w:r>
         <w:rPr>
-          <w:rFonts w:ascii="微软雅黑" w:eastAsia="微软雅黑" w:hAnsi="微软雅黑"/>
+          <w:rFonts w:ascii="微软雅黑" w:eastAsia="微软雅黑" w:hAnsi="微软雅黑" w:hint="eastAsia"/>
           <w:b/>
         </w:rPr>
-        <w:t xml:space="preserve">6. </w:t>
-      </w:r>
-      <w:r>
-        <w:rPr>
-          <w:rFonts w:ascii="微软雅黑" w:eastAsia="微软雅黑" w:hAnsi="微软雅黑"/>
-          <w:b/>
-        </w:rPr>
-        <w:t>活动状态与演示数据</w:t>
+        <w:t>活动状态和交付逻辑</w:t>
       </w:r>
     </w:p>
     <w:p>
       <w:pPr>
         <w:pStyle w:val="ac"/>
         <w:spacing w:after="100" w:line="324" w:lineRule="auto"/>
-      </w:pPr>
+        <w:ind w:leftChars="9" w:left="451"/>
+      </w:pPr>
+      <w:r>
+        <w:rPr>
+          <w:rFonts w:ascii="微软雅黑" w:eastAsia="微软雅黑" w:hAnsi="微软雅黑"/>
+        </w:rPr>
+        <w:tab/>
+      </w:r>
       <w:r>
         <w:rPr>
           <w:rFonts w:ascii="微软雅黑" w:eastAsia="微软雅黑" w:hAnsi="微软雅黑"/>
@@ -2822,62 +2781,39 @@
       <w:pPr>
         <w:pStyle w:val="ac"/>
         <w:spacing w:after="100" w:line="324" w:lineRule="auto"/>
+        <w:ind w:leftChars="200" w:left="852"/>
+        <w:rPr>
+          <w:rFonts w:ascii="微软雅黑" w:eastAsia="微软雅黑" w:hAnsi="微软雅黑" w:hint="eastAsia"/>
+        </w:rPr>
       </w:pPr>
       <w:r>
         <w:rPr>
           <w:rFonts w:ascii="微软雅黑" w:eastAsia="微软雅黑" w:hAnsi="微软雅黑"/>
         </w:rPr>
-        <w:t>一键重置确定性演示数据，固定呈现</w:t>
+        <w:t xml:space="preserve">一键重置确定性演示数据，固定呈现 100→80→50→35 漏斗及 38 </w:t>
       </w:r>
-      <w:r>
-        <w:rPr>
-          <w:rFonts w:ascii="微软雅黑" w:eastAsia="微软雅黑" w:hAnsi="微软雅黑"/>
-        </w:rPr>
-        <w:t xml:space="preserve"> 100→80→50→35 </w:t>
-      </w:r>
-      <w:r>
-        <w:rPr>
-          <w:rFonts w:ascii="微软雅黑" w:eastAsia="微软雅黑" w:hAnsi="微软雅黑"/>
-        </w:rPr>
-        <w:t>漏斗及</w:t>
-      </w:r>
-      <w:r>
-        <w:rPr>
-          <w:rFonts w:ascii="微软雅黑" w:eastAsia="微软雅黑" w:hAnsi="微软雅黑"/>
-        </w:rPr>
-        <w:t xml:space="preserve"> 38 </w:t>
-      </w:r>
+      <w:proofErr w:type="gramStart"/>
       <w:r>
         <w:rPr>
           <w:rFonts w:ascii="微软雅黑" w:eastAsia="微软雅黑" w:hAnsi="微软雅黑"/>
         </w:rPr>
         <w:t>所其他</w:t>
       </w:r>
+      <w:proofErr w:type="gramEnd"/>
       <w:r>
         <w:rPr>
           <w:rFonts w:ascii="微软雅黑" w:eastAsia="微软雅黑" w:hAnsi="微软雅黑"/>
         </w:rPr>
-        <w:t xml:space="preserve"> 985 </w:t>
-      </w:r>
-      <w:r>
-        <w:rPr>
-          <w:rFonts w:ascii="微软雅黑" w:eastAsia="微软雅黑" w:hAnsi="微软雅黑"/>
-        </w:rPr>
-        <w:t>高校分布。</w:t>
+        <w:t xml:space="preserve"> 985 高校分布。</w:t>
       </w:r>
     </w:p>
     <w:p>
       <w:pPr>
-        <w:pStyle w:val="aff8"/>
-        <w:spacing w:after="100" w:line="324" w:lineRule="auto"/>
-      </w:pPr>
-      <w:r>
-        <w:rPr>
-          <w:rFonts w:ascii="微软雅黑" w:eastAsia="微软雅黑" w:hAnsi="微软雅黑"/>
-          <w:b/>
-        </w:rPr>
-        <w:t xml:space="preserve">7. </w:t>
-      </w:r>
+        <w:pStyle w:val="2"/>
+        <w:rPr>
+          <w:rFonts w:hint="eastAsia"/>
+        </w:rPr>
+      </w:pPr>
       <w:r>
         <w:rPr>
           <w:rFonts w:ascii="微软雅黑" w:eastAsia="微软雅黑" w:hAnsi="微软雅黑"/>
@@ -2890,6 +2826,7 @@
       <w:pPr>
         <w:pStyle w:val="ac"/>
         <w:spacing w:after="100" w:line="324" w:lineRule="auto"/>
+        <w:ind w:leftChars="200" w:left="852"/>
       </w:pPr>
       <w:r>
         <w:rPr>
@@ -2902,28 +2839,91 @@
       <w:pPr>
         <w:pStyle w:val="ac"/>
         <w:spacing w:after="100" w:line="324" w:lineRule="auto"/>
+        <w:ind w:leftChars="200" w:left="852"/>
+        <w:rPr>
+          <w:rFonts w:ascii="微软雅黑" w:eastAsia="微软雅黑" w:hAnsi="微软雅黑" w:hint="eastAsia"/>
+        </w:rPr>
       </w:pPr>
       <w:r>
         <w:rPr>
           <w:rFonts w:ascii="微软雅黑" w:eastAsia="微软雅黑" w:hAnsi="微软雅黑"/>
         </w:rPr>
-        <w:t>学生端和管理端均适配桌面</w:t>
+        <w:t>学生端和</w:t>
       </w:r>
+      <w:proofErr w:type="gramStart"/>
       <w:r>
         <w:rPr>
           <w:rFonts w:ascii="微软雅黑" w:eastAsia="微软雅黑" w:hAnsi="微软雅黑"/>
         </w:rPr>
-        <w:t>/</w:t>
+        <w:t>管理端均适配</w:t>
       </w:r>
+      <w:proofErr w:type="gramEnd"/>
       <w:r>
         <w:rPr>
           <w:rFonts w:ascii="微软雅黑" w:eastAsia="微软雅黑" w:hAnsi="微软雅黑"/>
         </w:rPr>
-        <w:t>移动屏幕，并支持亮色与夜间模式。</w:t>
+        <w:t>桌面/移动屏幕，并支持亮色与夜间模式。</w:t>
       </w:r>
     </w:p>
     <w:p>
       <w:pPr>
+        <w:pStyle w:val="ac"/>
+        <w:spacing w:after="100" w:line="324" w:lineRule="auto"/>
+        <w:ind w:leftChars="200" w:left="852"/>
+        <w:rPr>
+          <w:rFonts w:ascii="微软雅黑" w:eastAsia="微软雅黑" w:hAnsi="微软雅黑" w:hint="eastAsia"/>
+        </w:rPr>
+      </w:pPr>
+    </w:p>
+    <w:p>
+      <w:pPr>
+        <w:pStyle w:val="ac"/>
+        <w:spacing w:after="100" w:line="324" w:lineRule="auto"/>
+        <w:ind w:leftChars="200" w:left="852"/>
+        <w:rPr>
+          <w:rFonts w:ascii="微软雅黑" w:eastAsia="微软雅黑" w:hAnsi="微软雅黑" w:hint="eastAsia"/>
+        </w:rPr>
+      </w:pPr>
+    </w:p>
+    <w:p>
+      <w:pPr>
+        <w:pStyle w:val="ac"/>
+        <w:spacing w:after="100" w:line="324" w:lineRule="auto"/>
+        <w:ind w:leftChars="200" w:left="852"/>
+        <w:rPr>
+          <w:rFonts w:ascii="微软雅黑" w:eastAsia="微软雅黑" w:hAnsi="微软雅黑" w:hint="eastAsia"/>
+        </w:rPr>
+      </w:pPr>
+    </w:p>
+    <w:p>
+      <w:pPr>
+        <w:pStyle w:val="ac"/>
+        <w:spacing w:after="100" w:line="324" w:lineRule="auto"/>
+        <w:ind w:leftChars="200" w:left="852"/>
+        <w:rPr>
+          <w:rFonts w:ascii="微软雅黑" w:eastAsia="微软雅黑" w:hAnsi="微软雅黑" w:hint="eastAsia"/>
+        </w:rPr>
+      </w:pPr>
+    </w:p>
+    <w:p>
+      <w:pPr>
+        <w:pStyle w:val="ac"/>
+        <w:spacing w:after="100" w:line="324" w:lineRule="auto"/>
+        <w:ind w:leftChars="200" w:left="852"/>
+        <w:rPr>
+          <w:rFonts w:ascii="微软雅黑" w:eastAsia="微软雅黑" w:hAnsi="微软雅黑" w:hint="eastAsia"/>
+        </w:rPr>
+      </w:pPr>
+    </w:p>
+    <w:p>
+      <w:pPr>
+        <w:pStyle w:val="ac"/>
+        <w:spacing w:after="100" w:line="324" w:lineRule="auto"/>
+        <w:ind w:leftChars="200" w:left="852"/>
+      </w:pPr>
+    </w:p>
+    <w:p>
+      <w:pPr>
         <w:pStyle w:val="1"/>
         <w:rPr>
           <w:rFonts w:hint="eastAsia"/>
@@ -2933,6 +2933,7 @@
         <w:rPr>
           <w:rFonts w:hint="eastAsia"/>
         </w:rPr>
+        <w:lastRenderedPageBreak/>
         <w:t>、</w:t>
       </w:r>
       <w:r>
@@ -2971,6 +2972,7 @@
           <w:p>
             <w:pPr>
               <w:spacing w:after="0" w:line="276" w:lineRule="auto"/>
+              <w:ind w:left="0"/>
             </w:pPr>
             <w:r>
               <w:rPr>
@@ -2996,6 +2998,7 @@
           <w:p>
             <w:pPr>
               <w:spacing w:after="0" w:line="276" w:lineRule="auto"/>
+              <w:ind w:left="0"/>
             </w:pPr>
             <w:r>
               <w:rPr>
@@ -3022,11 +3025,14 @@
           <w:p>
             <w:pPr>
               <w:spacing w:after="0" w:line="276" w:lineRule="auto"/>
+              <w:ind w:left="0"/>
+              <w:rPr>
+                <w:rFonts w:ascii="微软雅黑" w:eastAsia="微软雅黑" w:hAnsi="微软雅黑" w:hint="eastAsia"/>
+              </w:rPr>
             </w:pPr>
             <w:r>
               <w:rPr>
                 <w:rFonts w:ascii="微软雅黑" w:eastAsia="微软雅黑" w:hAnsi="微软雅黑"/>
-                <w:sz w:val="19"/>
               </w:rPr>
               <w:t>公网部署</w:t>
             </w:r>
@@ -3045,48 +3051,16 @@
           <w:p>
             <w:pPr>
               <w:spacing w:after="0" w:line="276" w:lineRule="auto"/>
+              <w:ind w:left="0"/>
+              <w:rPr>
+                <w:rFonts w:ascii="微软雅黑" w:eastAsia="微软雅黑" w:hAnsi="微软雅黑" w:hint="eastAsia"/>
+              </w:rPr>
             </w:pPr>
             <w:r>
               <w:rPr>
                 <w:rFonts w:ascii="微软雅黑" w:eastAsia="微软雅黑" w:hAnsi="微软雅黑"/>
-                <w:sz w:val="19"/>
               </w:rPr>
-              <w:t>已部署至华为云</w:t>
-            </w:r>
-            <w:r>
-              <w:rPr>
-                <w:rFonts w:ascii="微软雅黑" w:eastAsia="微软雅黑" w:hAnsi="微软雅黑"/>
-                <w:sz w:val="19"/>
-              </w:rPr>
-              <w:t xml:space="preserve"> Flexus </w:t>
-            </w:r>
-            <w:r>
-              <w:rPr>
-                <w:rFonts w:ascii="微软雅黑" w:eastAsia="微软雅黑" w:hAnsi="微软雅黑"/>
-                <w:sz w:val="19"/>
-              </w:rPr>
-              <w:t>应用服务器</w:t>
-            </w:r>
-            <w:r>
-              <w:rPr>
-                <w:rFonts w:ascii="微软雅黑" w:eastAsia="微软雅黑" w:hAnsi="微软雅黑"/>
-                <w:sz w:val="19"/>
-              </w:rPr>
-              <w:t xml:space="preserve"> L </w:t>
-            </w:r>
-            <w:r>
-              <w:rPr>
-                <w:rFonts w:ascii="微软雅黑" w:eastAsia="微软雅黑" w:hAnsi="微软雅黑"/>
-                <w:sz w:val="19"/>
-              </w:rPr>
-              <w:t>实例：</w:t>
-            </w:r>
-            <w:r>
-              <w:rPr>
-                <w:rFonts w:ascii="微软雅黑" w:eastAsia="微软雅黑" w:hAnsi="微软雅黑"/>
-                <w:sz w:val="19"/>
-              </w:rPr>
-              <w:t>http://123.60.220.148</w:t>
+              <w:t>已部署至华为云 Flexus 应用服务器 L 实例：http://123.60.220.148</w:t>
             </w:r>
           </w:p>
         </w:tc>
@@ -3105,11 +3079,14 @@
           <w:p>
             <w:pPr>
               <w:spacing w:after="0" w:line="276" w:lineRule="auto"/>
+              <w:ind w:left="0"/>
+              <w:rPr>
+                <w:rFonts w:ascii="微软雅黑" w:eastAsia="微软雅黑" w:hAnsi="微软雅黑" w:hint="eastAsia"/>
+              </w:rPr>
             </w:pPr>
             <w:r>
               <w:rPr>
                 <w:rFonts w:ascii="微软雅黑" w:eastAsia="微软雅黑" w:hAnsi="微软雅黑"/>
-                <w:sz w:val="19"/>
               </w:rPr>
               <w:t>管理员后台</w:t>
             </w:r>
@@ -3128,20 +3105,30 @@
           <w:p>
             <w:pPr>
               <w:spacing w:after="0" w:line="276" w:lineRule="auto"/>
+              <w:ind w:left="0"/>
+              <w:rPr>
+                <w:rFonts w:ascii="微软雅黑" w:eastAsia="微软雅黑" w:hAnsi="微软雅黑" w:hint="eastAsia"/>
+              </w:rPr>
             </w:pPr>
             <w:r>
               <w:rPr>
                 <w:rFonts w:ascii="微软雅黑" w:eastAsia="微软雅黑" w:hAnsi="微软雅黑"/>
-                <w:sz w:val="19"/>
               </w:rPr>
-              <w:t>http://123.60.220.148/admin</w:t>
+              <w:t>http://123.60.220.148/admin（登录</w:t>
             </w:r>
+            <w:proofErr w:type="gramStart"/>
             <w:r>
               <w:rPr>
                 <w:rFonts w:ascii="微软雅黑" w:eastAsia="微软雅黑" w:hAnsi="微软雅黑"/>
-                <w:sz w:val="19"/>
               </w:rPr>
-              <w:t>（登录页展示评委演示账号）</w:t>
+              <w:t>页展示</w:t>
+            </w:r>
+            <w:proofErr w:type="gramEnd"/>
+            <w:r>
+              <w:rPr>
+                <w:rFonts w:ascii="微软雅黑" w:eastAsia="微软雅黑" w:hAnsi="微软雅黑"/>
+              </w:rPr>
+              <w:t>评委演示账号）</w:t>
             </w:r>
           </w:p>
         </w:tc>
@@ -3160,13 +3147,15 @@
           <w:p>
             <w:pPr>
               <w:spacing w:after="0" w:line="276" w:lineRule="auto"/>
+              <w:ind w:left="0"/>
+              <w:rPr>
+                <w:rFonts w:ascii="微软雅黑" w:eastAsia="微软雅黑" w:hAnsi="微软雅黑" w:hint="eastAsia"/>
+              </w:rPr>
             </w:pPr>
             <w:r>
               <w:rPr>
                 <w:rFonts w:ascii="微软雅黑" w:eastAsia="微软雅黑" w:hAnsi="微软雅黑"/>
-                <w:sz w:val="19"/>
               </w:rPr>
-              <w:lastRenderedPageBreak/>
               <w:t>演示数据</w:t>
             </w:r>
           </w:p>
@@ -3184,62 +3173,16 @@
           <w:p>
             <w:pPr>
               <w:spacing w:after="0" w:line="276" w:lineRule="auto"/>
+              <w:ind w:left="0"/>
+              <w:rPr>
+                <w:rFonts w:ascii="微软雅黑" w:eastAsia="微软雅黑" w:hAnsi="微软雅黑" w:hint="eastAsia"/>
+              </w:rPr>
             </w:pPr>
             <w:r>
               <w:rPr>
                 <w:rFonts w:ascii="微软雅黑" w:eastAsia="微软雅黑" w:hAnsi="微软雅黑"/>
-                <w:sz w:val="19"/>
               </w:rPr>
-              <w:t xml:space="preserve">100 </w:t>
-            </w:r>
-            <w:r>
-              <w:rPr>
-                <w:rFonts w:ascii="微软雅黑" w:eastAsia="微软雅黑" w:hAnsi="微软雅黑"/>
-                <w:sz w:val="19"/>
-              </w:rPr>
-              <w:t>人报名、</w:t>
-            </w:r>
-            <w:r>
-              <w:rPr>
-                <w:rFonts w:ascii="微软雅黑" w:eastAsia="微软雅黑" w:hAnsi="微软雅黑"/>
-                <w:sz w:val="19"/>
-              </w:rPr>
-              <w:t xml:space="preserve">80 </w:t>
-            </w:r>
-            <w:r>
-              <w:rPr>
-                <w:rFonts w:ascii="微软雅黑" w:eastAsia="微软雅黑" w:hAnsi="微软雅黑"/>
-                <w:sz w:val="19"/>
-              </w:rPr>
-              <w:t>人账号开通、</w:t>
-            </w:r>
-            <w:r>
-              <w:rPr>
-                <w:rFonts w:ascii="微软雅黑" w:eastAsia="微软雅黑" w:hAnsi="微软雅黑"/>
-                <w:sz w:val="19"/>
-              </w:rPr>
-              <w:t xml:space="preserve">50 </w:t>
-            </w:r>
-            <w:r>
-              <w:rPr>
-                <w:rFonts w:ascii="微软雅黑" w:eastAsia="微软雅黑" w:hAnsi="微软雅黑"/>
-                <w:sz w:val="19"/>
-              </w:rPr>
-              <w:t>人完成首个任务、</w:t>
-            </w:r>
-            <w:r>
-              <w:rPr>
-                <w:rFonts w:ascii="微软雅黑" w:eastAsia="微软雅黑" w:hAnsi="微软雅黑"/>
-                <w:sz w:val="19"/>
-              </w:rPr>
-              <w:t xml:space="preserve">35 </w:t>
-            </w:r>
-            <w:r>
-              <w:rPr>
-                <w:rFonts w:ascii="微软雅黑" w:eastAsia="微软雅黑" w:hAnsi="微软雅黑"/>
-                <w:sz w:val="19"/>
-              </w:rPr>
-              <w:t>人最终提交。</w:t>
+              <w:t>100 人报名、80 人账号开通、50 人完成首个任务、35 人最终提交。</w:t>
             </w:r>
           </w:p>
         </w:tc>
@@ -3258,11 +3201,14 @@
           <w:p>
             <w:pPr>
               <w:spacing w:after="0" w:line="276" w:lineRule="auto"/>
+              <w:ind w:left="0"/>
+              <w:rPr>
+                <w:rFonts w:ascii="微软雅黑" w:eastAsia="微软雅黑" w:hAnsi="微软雅黑" w:hint="eastAsia"/>
+              </w:rPr>
             </w:pPr>
             <w:r>
               <w:rPr>
                 <w:rFonts w:ascii="微软雅黑" w:eastAsia="微软雅黑" w:hAnsi="微软雅黑"/>
-                <w:sz w:val="19"/>
               </w:rPr>
               <w:t>数据分布</w:t>
             </w:r>
@@ -3281,41 +3227,16 @@
           <w:p>
             <w:pPr>
               <w:spacing w:after="0" w:line="276" w:lineRule="auto"/>
+              <w:ind w:left="0"/>
+              <w:rPr>
+                <w:rFonts w:ascii="微软雅黑" w:eastAsia="微软雅黑" w:hAnsi="微软雅黑" w:hint="eastAsia"/>
+              </w:rPr>
             </w:pPr>
             <w:r>
               <w:rPr>
                 <w:rFonts w:ascii="微软雅黑" w:eastAsia="微软雅黑" w:hAnsi="微软雅黑"/>
-                <w:sz w:val="19"/>
               </w:rPr>
-              <w:t>固定随机种子生成</w:t>
-            </w:r>
-            <w:r>
-              <w:rPr>
-                <w:rFonts w:ascii="微软雅黑" w:eastAsia="微软雅黑" w:hAnsi="微软雅黑"/>
-                <w:sz w:val="19"/>
-              </w:rPr>
-              <w:t xml:space="preserve"> 38 </w:t>
-            </w:r>
-            <w:r>
-              <w:rPr>
-                <w:rFonts w:ascii="微软雅黑" w:eastAsia="微软雅黑" w:hAnsi="微软雅黑"/>
-                <w:sz w:val="19"/>
-              </w:rPr>
-              <w:t>所</w:t>
-            </w:r>
-            <w:r>
-              <w:rPr>
-                <w:rFonts w:ascii="微软雅黑" w:eastAsia="微软雅黑" w:hAnsi="微软雅黑"/>
-                <w:sz w:val="19"/>
-              </w:rPr>
-              <w:t xml:space="preserve"> 985 </w:t>
-            </w:r>
-            <w:r>
-              <w:rPr>
-                <w:rFonts w:ascii="微软雅黑" w:eastAsia="微软雅黑" w:hAnsi="微软雅黑"/>
-                <w:sz w:val="19"/>
-              </w:rPr>
-              <w:t>高校的姓名、学号、手机号与时间分布；不含大连理工大学。</w:t>
+              <w:t>固定随机种子生成 38 所 985 高校的姓名、学号、手机号与时间分布；不含大连理工大学。</w:t>
             </w:r>
           </w:p>
         </w:tc>
@@ -3334,11 +3255,14 @@
           <w:p>
             <w:pPr>
               <w:spacing w:after="0" w:line="276" w:lineRule="auto"/>
+              <w:ind w:left="0"/>
+              <w:rPr>
+                <w:rFonts w:ascii="微软雅黑" w:eastAsia="微软雅黑" w:hAnsi="微软雅黑" w:hint="eastAsia"/>
+              </w:rPr>
             </w:pPr>
             <w:r>
               <w:rPr>
                 <w:rFonts w:ascii="微软雅黑" w:eastAsia="微软雅黑" w:hAnsi="微软雅黑"/>
-                <w:sz w:val="19"/>
               </w:rPr>
               <w:t>代码与文档</w:t>
             </w:r>
@@ -3357,48 +3281,16 @@
           <w:p>
             <w:pPr>
               <w:spacing w:after="0" w:line="276" w:lineRule="auto"/>
+              <w:ind w:left="0"/>
+              <w:rPr>
+                <w:rFonts w:ascii="微软雅黑" w:eastAsia="微软雅黑" w:hAnsi="微软雅黑" w:hint="eastAsia"/>
+              </w:rPr>
             </w:pPr>
             <w:r>
               <w:rPr>
                 <w:rFonts w:ascii="微软雅黑" w:eastAsia="微软雅黑" w:hAnsi="微软雅黑"/>
-                <w:sz w:val="19"/>
               </w:rPr>
-              <w:t xml:space="preserve">AtomGit </w:t>
-            </w:r>
-            <w:r>
-              <w:rPr>
-                <w:rFonts w:ascii="微软雅黑" w:eastAsia="微软雅黑" w:hAnsi="微软雅黑"/>
-                <w:sz w:val="19"/>
-              </w:rPr>
-              <w:t>仓库、</w:t>
-            </w:r>
-            <w:r>
-              <w:rPr>
-                <w:rFonts w:ascii="微软雅黑" w:eastAsia="微软雅黑" w:hAnsi="微软雅黑"/>
-                <w:sz w:val="19"/>
-              </w:rPr>
-              <w:t>README</w:t>
-            </w:r>
-            <w:r>
-              <w:rPr>
-                <w:rFonts w:ascii="微软雅黑" w:eastAsia="微软雅黑" w:hAnsi="微软雅黑"/>
-                <w:sz w:val="19"/>
-              </w:rPr>
-              <w:t>、完整使用手册、完整演示文档、部署说明和</w:t>
-            </w:r>
-            <w:r>
-              <w:rPr>
-                <w:rFonts w:ascii="微软雅黑" w:eastAsia="微软雅黑" w:hAnsi="微软雅黑"/>
-                <w:sz w:val="19"/>
-              </w:rPr>
-              <w:t xml:space="preserve"> VOD </w:t>
-            </w:r>
-            <w:r>
-              <w:rPr>
-                <w:rFonts w:ascii="微软雅黑" w:eastAsia="微软雅黑" w:hAnsi="微软雅黑"/>
-                <w:sz w:val="19"/>
-              </w:rPr>
-              <w:t>建议材料齐备。</w:t>
+              <w:t>AtomGit 仓库、README、完整使用手册、完整演示文档、部署说明和 VOD 建议材料齐备。</w:t>
             </w:r>
           </w:p>
         </w:tc>
@@ -3417,11 +3309,14 @@
           <w:p>
             <w:pPr>
               <w:spacing w:after="0" w:line="276" w:lineRule="auto"/>
+              <w:ind w:left="0"/>
+              <w:rPr>
+                <w:rFonts w:ascii="微软雅黑" w:eastAsia="微软雅黑" w:hAnsi="微软雅黑" w:hint="eastAsia"/>
+              </w:rPr>
             </w:pPr>
             <w:r>
               <w:rPr>
                 <w:rFonts w:ascii="微软雅黑" w:eastAsia="微软雅黑" w:hAnsi="微软雅黑"/>
-                <w:sz w:val="19"/>
               </w:rPr>
               <w:t>测试覆盖</w:t>
             </w:r>
@@ -3440,11 +3335,14 @@
           <w:p>
             <w:pPr>
               <w:spacing w:after="0" w:line="276" w:lineRule="auto"/>
+              <w:ind w:left="0"/>
+              <w:rPr>
+                <w:rFonts w:ascii="微软雅黑" w:eastAsia="微软雅黑" w:hAnsi="微软雅黑" w:hint="eastAsia"/>
+              </w:rPr>
             </w:pPr>
             <w:r>
               <w:rPr>
                 <w:rFonts w:ascii="微软雅黑" w:eastAsia="微软雅黑" w:hAnsi="微软雅黑"/>
-                <w:sz w:val="19"/>
               </w:rPr>
               <w:t>覆盖身份匹配、重复签到、阶段排序、转化率、认证、公开签到、关闭活动和前端交互。</w:t>
             </w:r>
@@ -3459,43 +3357,19 @@
     </w:p>
     <w:p>
       <w:pPr>
-        <w:pStyle w:val="aff8"/>
-        <w:spacing w:after="100" w:line="324" w:lineRule="auto"/>
-        <w:jc w:val="center"/>
-      </w:pPr>
-      <w:r>
-        <w:rPr>
-          <w:rFonts w:ascii="微软雅黑" w:eastAsia="微软雅黑" w:hAnsi="微软雅黑"/>
-        </w:rPr>
-        <w:t>图</w:t>
-      </w:r>
-      <w:r>
-        <w:rPr>
-          <w:rFonts w:ascii="微软雅黑" w:eastAsia="微软雅黑" w:hAnsi="微软雅黑"/>
-        </w:rPr>
-        <w:t xml:space="preserve"> 1  </w:t>
-      </w:r>
-      <w:r>
-        <w:rPr>
-          <w:rFonts w:ascii="微软雅黑" w:eastAsia="微软雅黑" w:hAnsi="微软雅黑"/>
-        </w:rPr>
-        <w:t>管理后台实时转化漏斗（固定演示数据）</w:t>
-      </w:r>
-    </w:p>
-    <w:p>
-      <w:pPr>
-        <w:jc w:val="center"/>
+        <w:ind w:left="0"/>
       </w:pPr>
       <w:r>
         <w:rPr>
           <w:rFonts w:ascii="微软雅黑" w:eastAsia="微软雅黑" w:hAnsi="微软雅黑"/>
           <w:noProof/>
         </w:rPr>
+        <w:lastRenderedPageBreak/>
         <w:drawing>
-          <wp:inline distT="0" distB="0" distL="0" distR="0" wp14:anchorId="15B6E08B" wp14:editId="23D0F264">
-            <wp:extent cx="4754880" cy="2909481"/>
-            <wp:effectExtent l="0" t="0" r="0" b="0"/>
-            <wp:docPr id="1" name="Picture 1"/>
+          <wp:inline distT="0" distB="0" distL="0" distR="0" wp14:anchorId="6658228B" wp14:editId="79A184AC">
+            <wp:extent cx="6120130" cy="3362960"/>
+            <wp:effectExtent l="0" t="0" r="0" b="8890"/>
+            <wp:docPr id="2" name="图片 2"/>
             <wp:cNvGraphicFramePr>
               <a:graphicFrameLocks xmlns:a="http://schemas.openxmlformats.org/drawingml/2006/main" noChangeAspect="1"/>
             </wp:cNvGraphicFramePr>
@@ -3503,23 +3377,36 @@
               <a:graphicData uri="http://schemas.openxmlformats.org/drawingml/2006/picture">
                 <pic:pic xmlns:pic="http://schemas.openxmlformats.org/drawingml/2006/picture">
                   <pic:nvPicPr>
-                    <pic:cNvPr id="0" name="674e6c53c7ba5a577bb3ebeff307a435.png"/>
-                    <pic:cNvPicPr/>
+                    <pic:cNvPr id="0" name="Picture 1"/>
+                    <pic:cNvPicPr>
+                      <a:picLocks noChangeAspect="1" noChangeArrowheads="1"/>
+                    </pic:cNvPicPr>
                   </pic:nvPicPr>
                   <pic:blipFill>
-                    <a:blip r:embed="rId12"/>
+                    <a:blip r:embed="rId12">
+                      <a:extLst>
+                        <a:ext uri="{28A0092B-C50C-407E-A947-70E740481C1C}">
+                          <a14:useLocalDpi xmlns:a14="http://schemas.microsoft.com/office/drawing/2010/main" val="0"/>
+                        </a:ext>
+                      </a:extLst>
+                    </a:blip>
+                    <a:srcRect/>
                     <a:stretch>
                       <a:fillRect/>
                     </a:stretch>
                   </pic:blipFill>
-                  <pic:spPr>
+                  <pic:spPr bwMode="auto">
                     <a:xfrm>
                       <a:off x="0" y="0"/>
-                      <a:ext cx="4754880" cy="2909481"/>
+                      <a:ext cx="6120130" cy="3362960"/>
                     </a:xfrm>
                     <a:prstGeom prst="rect">
                       <a:avLst/>
                     </a:prstGeom>
+                    <a:noFill/>
+                    <a:ln>
+                      <a:noFill/>
+                    </a:ln>
                   </pic:spPr>
                 </pic:pic>
               </a:graphicData>
@@ -3532,6 +3419,22 @@
       <w:pPr>
         <w:pStyle w:val="aff8"/>
         <w:spacing w:after="100" w:line="324" w:lineRule="auto"/>
+        <w:ind w:left="0"/>
+        <w:jc w:val="center"/>
+      </w:pPr>
+      <w:r>
+        <w:rPr>
+          <w:rFonts w:ascii="微软雅黑" w:eastAsia="微软雅黑" w:hAnsi="微软雅黑"/>
+        </w:rPr>
+        <w:t>图 1  管理后台实时转化漏斗（固定演示数据）</w:t>
+      </w:r>
+    </w:p>
+    <w:p>
+      <w:pPr>
+        <w:pStyle w:val="2"/>
+        <w:rPr>
+          <w:rFonts w:hint="eastAsia"/>
+        </w:rPr>
       </w:pPr>
       <w:r>
         <w:rPr>
@@ -3567,7 +3470,7 @@
 </file>
 
 <file path=word/endnotes.xml><?xml version="1.0" encoding="utf-8"?>
-<w:endnotes xmlns:wpc="http://schemas.microsoft.com/office/word/2010/wordprocessingCanvas" xmlns:cx="http://schemas.microsoft.com/office/drawing/2014/chartex" xmlns:cx1="http://schemas.microsoft.com/office/drawing/2015/9/8/chartex" xmlns:cx2="http://schemas.microsoft.com/office/drawing/2015/10/21/chartex" xmlns:cx3="http://schemas.microsoft.com/office/drawing/2016/5/9/chartex" xmlns:cx4="http://schemas.microsoft.com/office/drawing/2016/5/10/chartex" xmlns:cx5="http://schemas.microsoft.com/office/drawing/2016/5/11/chartex" xmlns:cx6="http://schemas.microsoft.com/office/drawing/2016/5/12/chartex" xmlns:cx7="http://schemas.microsoft.com/office/drawing/2016/5/13/chartex" xmlns:cx8="http://schemas.microsoft.com/office/drawing/2016/5/14/chartex" xmlns:mc="http://schemas.openxmlformats.org/markup-compatibility/2006" xmlns:aink="http://schemas.microsoft.com/office/drawing/2016/ink" xmlns:am3d="http://schemas.microsoft.com/office/drawing/2017/model3d" xmlns:o="urn:schemas-microsoft-com:office:office" xmlns:oel="http://schemas.microsoft.com/office/2019/extlst" xmlns:r="http://schemas.openxmlformats.org/officeDocument/2006/relationships" xmlns:m="http://schemas.openxmlformats.org/officeDocument/2006/math" xmlns:v="urn:schemas-microsoft-com:vml" xmlns:wp14="http://schemas.microsoft.com/office/word/2010/wordprocessingDrawing" xmlns:wp="http://schemas.openxmlformats.org/drawingml/2006/wordprocessingDrawing" xmlns:w10="urn:schemas-microsoft-com:office:word" xmlns:w="http://schemas.openxmlformats.org/wordprocessingml/2006/main" xmlns:w14="http://schemas.microsoft.com/office/word/2010/wordml" xmlns:w15="http://schemas.microsoft.com/office/word/2012/wordml" xmlns:w16cex="http://schemas.microsoft.com/office/word/2018/wordml/cex" xmlns:w16cid="http://schemas.microsoft.com/office/word/2016/wordml/cid" xmlns:w16="http://schemas.microsoft.com/office/word/2018/wordml" xmlns:w16du="http://schemas.microsoft.com/office/word/2023/wordml/word16du" xmlns:w16sdtdh="http://schemas.microsoft.com/office/word/2020/wordml/sdtdatahash" xmlns:w16sdtfl="http://schemas.microsoft.com/office/word/2024/wordml/sdtformatlock" xmlns:w16se="http://schemas.microsoft.com/office/word/2015/wordml/symex" xmlns:wpg="http://schemas.microsoft.com/office/word/2010/wordprocessingGroup" xmlns:wpi="http://schemas.microsoft.com/office/word/2010/wordprocessingInk" xmlns:wne="http://schemas.microsoft.com/office/word/2006/wordml" xmlns:wps="http://schemas.microsoft.com/office/word/2010/wordprocessingShape" mc:Ignorable="w14 w15 w16se w16cid w16 w16cex w16sdtdh w16sdtfl w16du wp14">
+<w:endnotes xmlns:wpc="http://schemas.microsoft.com/office/word/2010/wordprocessingCanvas" xmlns:cx="http://schemas.microsoft.com/office/drawing/2014/chartex" xmlns:cx1="http://schemas.microsoft.com/office/drawing/2015/9/8/chartex" xmlns:cx2="http://schemas.microsoft.com/office/drawing/2015/10/21/chartex" xmlns:cx3="http://schemas.microsoft.com/office/drawing/2016/5/9/chartex" xmlns:cx4="http://schemas.microsoft.com/office/drawing/2016/5/10/chartex" xmlns:cx5="http://schemas.microsoft.com/office/drawing/2016/5/11/chartex" xmlns:cx6="http://schemas.microsoft.com/office/drawing/2016/5/12/chartex" xmlns:cx7="http://schemas.microsoft.com/office/drawing/2016/5/13/chartex" xmlns:cx8="http://schemas.microsoft.com/office/drawing/2016/5/14/chartex" xmlns:mc="http://schemas.openxmlformats.org/markup-compatibility/2006" xmlns:aink="http://schemas.microsoft.com/office/drawing/2016/ink" xmlns:am3d="http://schemas.microsoft.com/office/drawing/2017/model3d" xmlns:o="urn:schemas-microsoft-com:office:office" xmlns:oel="http://schemas.microsoft.com/office/2019/extlst" xmlns:r="http://schemas.openxmlformats.org/officeDocument/2006/relationships" xmlns:m="http://schemas.openxmlformats.org/officeDocument/2006/math" xmlns:v="urn:schemas-microsoft-com:vml" xmlns:wp14="http://schemas.microsoft.com/office/word/2010/wordprocessingDrawing" xmlns:wp="http://schemas.openxmlformats.org/drawingml/2006/wordprocessingDrawing" xmlns:w10="urn:schemas-microsoft-com:office:word" xmlns:w="http://schemas.openxmlformats.org/wordprocessingml/2006/main" xmlns:w14="http://schemas.microsoft.com/office/word/2010/wordml" xmlns:w15="http://schemas.microsoft.com/office/word/2012/wordml" xmlns:w16cex="http://schemas.microsoft.com/office/word/2018/wordml/cex" xmlns:w16cid="http://schemas.microsoft.com/office/word/2016/wordml/cid" xmlns:w16="http://schemas.microsoft.com/office/word/2018/wordml" xmlns:w16sdtdh="http://schemas.microsoft.com/office/word/2020/wordml/sdtdatahash" xmlns:w16se="http://schemas.microsoft.com/office/word/2015/wordml/symex" xmlns:wpg="http://schemas.microsoft.com/office/word/2010/wordprocessingGroup" xmlns:wpi="http://schemas.microsoft.com/office/word/2010/wordprocessingInk" xmlns:wne="http://schemas.microsoft.com/office/word/2006/wordml" xmlns:wps="http://schemas.microsoft.com/office/word/2010/wordprocessingShape" mc:Ignorable="w14 w15 w16se w16cid w16 w16cex w16sdtdh wp14">
   <w:endnote w:type="separator" w:id="-1">
     <w:p>
       <w:pPr>
@@ -3592,7 +3495,7 @@
 </file>
 
 <file path=word/footnotes.xml><?xml version="1.0" encoding="utf-8"?>
-<w:footnotes xmlns:wpc="http://schemas.microsoft.com/office/word/2010/wordprocessingCanvas" xmlns:cx="http://schemas.microsoft.com/office/drawing/2014/chartex" xmlns:cx1="http://schemas.microsoft.com/office/drawing/2015/9/8/chartex" xmlns:cx2="http://schemas.microsoft.com/office/drawing/2015/10/21/chartex" xmlns:cx3="http://schemas.microsoft.com/office/drawing/2016/5/9/chartex" xmlns:cx4="http://schemas.microsoft.com/office/drawing/2016/5/10/chartex" xmlns:cx5="http://schemas.microsoft.com/office/drawing/2016/5/11/chartex" xmlns:cx6="http://schemas.microsoft.com/office/drawing/2016/5/12/chartex" xmlns:cx7="http://schemas.microsoft.com/office/drawing/2016/5/13/chartex" xmlns:cx8="http://schemas.microsoft.com/office/drawing/2016/5/14/chartex" xmlns:mc="http://schemas.openxmlformats.org/markup-compatibility/2006" xmlns:aink="http://schemas.microsoft.com/office/drawing/2016/ink" xmlns:am3d="http://schemas.microsoft.com/office/drawing/2017/model3d" xmlns:o="urn:schemas-microsoft-com:office:office" xmlns:oel="http://schemas.microsoft.com/office/2019/extlst" xmlns:r="http://schemas.openxmlformats.org/officeDocument/2006/relationships" xmlns:m="http://schemas.openxmlformats.org/officeDocument/2006/math" xmlns:v="urn:schemas-microsoft-com:vml" xmlns:wp14="http://schemas.microsoft.com/office/word/2010/wordprocessingDrawing" xmlns:wp="http://schemas.openxmlformats.org/drawingml/2006/wordprocessingDrawing" xmlns:w10="urn:schemas-microsoft-com:office:word" xmlns:w="http://schemas.openxmlformats.org/wordprocessingml/2006/main" xmlns:w14="http://schemas.microsoft.com/office/word/2010/wordml" xmlns:w15="http://schemas.microsoft.com/office/word/2012/wordml" xmlns:w16cex="http://schemas.microsoft.com/office/word/2018/wordml/cex" xmlns:w16cid="http://schemas.microsoft.com/office/word/2016/wordml/cid" xmlns:w16="http://schemas.microsoft.com/office/word/2018/wordml" xmlns:w16du="http://schemas.microsoft.com/office/word/2023/wordml/word16du" xmlns:w16sdtdh="http://schemas.microsoft.com/office/word/2020/wordml/sdtdatahash" xmlns:w16sdtfl="http://schemas.microsoft.com/office/word/2024/wordml/sdtformatlock" xmlns:w16se="http://schemas.microsoft.com/office/word/2015/wordml/symex" xmlns:wpg="http://schemas.microsoft.com/office/word/2010/wordprocessingGroup" xmlns:wpi="http://schemas.microsoft.com/office/word/2010/wordprocessingInk" xmlns:wne="http://schemas.microsoft.com/office/word/2006/wordml" xmlns:wps="http://schemas.microsoft.com/office/word/2010/wordprocessingShape" mc:Ignorable="w14 w15 w16se w16cid w16 w16cex w16sdtdh w16sdtfl w16du wp14">
+<w:footnotes xmlns:wpc="http://schemas.microsoft.com/office/word/2010/wordprocessingCanvas" xmlns:cx="http://schemas.microsoft.com/office/drawing/2014/chartex" xmlns:cx1="http://schemas.microsoft.com/office/drawing/2015/9/8/chartex" xmlns:cx2="http://schemas.microsoft.com/office/drawing/2015/10/21/chartex" xmlns:cx3="http://schemas.microsoft.com/office/drawing/2016/5/9/chartex" xmlns:cx4="http://schemas.microsoft.com/office/drawing/2016/5/10/chartex" xmlns:cx5="http://schemas.microsoft.com/office/drawing/2016/5/11/chartex" xmlns:cx6="http://schemas.microsoft.com/office/drawing/2016/5/12/chartex" xmlns:cx7="http://schemas.microsoft.com/office/drawing/2016/5/13/chartex" xmlns:cx8="http://schemas.microsoft.com/office/drawing/2016/5/14/chartex" xmlns:mc="http://schemas.openxmlformats.org/markup-compatibility/2006" xmlns:aink="http://schemas.microsoft.com/office/drawing/2016/ink" xmlns:am3d="http://schemas.microsoft.com/office/drawing/2017/model3d" xmlns:o="urn:schemas-microsoft-com:office:office" xmlns:oel="http://schemas.microsoft.com/office/2019/extlst" xmlns:r="http://schemas.openxmlformats.org/officeDocument/2006/relationships" xmlns:m="http://schemas.openxmlformats.org/officeDocument/2006/math" xmlns:v="urn:schemas-microsoft-com:vml" xmlns:wp14="http://schemas.microsoft.com/office/word/2010/wordprocessingDrawing" xmlns:wp="http://schemas.openxmlformats.org/drawingml/2006/wordprocessingDrawing" xmlns:w10="urn:schemas-microsoft-com:office:word" xmlns:w="http://schemas.openxmlformats.org/wordprocessingml/2006/main" xmlns:w14="http://schemas.microsoft.com/office/word/2010/wordml" xmlns:w15="http://schemas.microsoft.com/office/word/2012/wordml" xmlns:w16cex="http://schemas.microsoft.com/office/word/2018/wordml/cex" xmlns:w16cid="http://schemas.microsoft.com/office/word/2016/wordml/cid" xmlns:w16="http://schemas.microsoft.com/office/word/2018/wordml" xmlns:w16sdtdh="http://schemas.microsoft.com/office/word/2020/wordml/sdtdatahash" xmlns:w16se="http://schemas.microsoft.com/office/word/2015/wordml/symex" xmlns:wpg="http://schemas.microsoft.com/office/word/2010/wordprocessingGroup" xmlns:wpi="http://schemas.microsoft.com/office/word/2010/wordprocessingInk" xmlns:wne="http://schemas.microsoft.com/office/word/2006/wordml" xmlns:wps="http://schemas.microsoft.com/office/word/2010/wordprocessingShape" mc:Ignorable="w14 w15 w16se w16cid w16 w16cex w16sdtdh wp14">
   <w:footnote w:type="separator" w:id="-1">
     <w:p>
       <w:pPr>
@@ -3617,7 +3520,7 @@
 </file>
 
 <file path=word/header1.xml><?xml version="1.0" encoding="utf-8"?>
-<w:hdr xmlns:wpc="http://schemas.microsoft.com/office/word/2010/wordprocessingCanvas" xmlns:cx="http://schemas.microsoft.com/office/drawing/2014/chartex" xmlns:cx1="http://schemas.microsoft.com/office/drawing/2015/9/8/chartex" xmlns:cx2="http://schemas.microsoft.com/office/drawing/2015/10/21/chartex" xmlns:cx3="http://schemas.microsoft.com/office/drawing/2016/5/9/chartex" xmlns:cx4="http://schemas.microsoft.com/office/drawing/2016/5/10/chartex" xmlns:cx5="http://schemas.microsoft.com/office/drawing/2016/5/11/chartex" xmlns:cx6="http://schemas.microsoft.com/office/drawing/2016/5/12/chartex" xmlns:cx7="http://schemas.microsoft.com/office/drawing/2016/5/13/chartex" xmlns:cx8="http://schemas.microsoft.com/office/drawing/2016/5/14/chartex" xmlns:mc="http://schemas.openxmlformats.org/markup-compatibility/2006" xmlns:aink="http://schemas.microsoft.com/office/drawing/2016/ink" xmlns:am3d="http://schemas.microsoft.com/office/drawing/2017/model3d" xmlns:o="urn:schemas-microsoft-com:office:office" xmlns:oel="http://schemas.microsoft.com/office/2019/extlst" xmlns:r="http://schemas.openxmlformats.org/officeDocument/2006/relationships" xmlns:m="http://schemas.openxmlformats.org/officeDocument/2006/math" xmlns:v="urn:schemas-microsoft-com:vml" xmlns:wp14="http://schemas.microsoft.com/office/word/2010/wordprocessingDrawing" xmlns:wp="http://schemas.openxmlformats.org/drawingml/2006/wordprocessingDrawing" xmlns:w10="urn:schemas-microsoft-com:office:word" xmlns:w="http://schemas.openxmlformats.org/wordprocessingml/2006/main" xmlns:w14="http://schemas.microsoft.com/office/word/2010/wordml" xmlns:w15="http://schemas.microsoft.com/office/word/2012/wordml" xmlns:w16cex="http://schemas.microsoft.com/office/word/2018/wordml/cex" xmlns:w16cid="http://schemas.microsoft.com/office/word/2016/wordml/cid" xmlns:w16="http://schemas.microsoft.com/office/word/2018/wordml" xmlns:w16du="http://schemas.microsoft.com/office/word/2023/wordml/word16du" xmlns:w16sdtdh="http://schemas.microsoft.com/office/word/2020/wordml/sdtdatahash" xmlns:w16sdtfl="http://schemas.microsoft.com/office/word/2024/wordml/sdtformatlock" xmlns:w16se="http://schemas.microsoft.com/office/word/2015/wordml/symex" xmlns:wpg="http://schemas.microsoft.com/office/word/2010/wordprocessingGroup" xmlns:wpi="http://schemas.microsoft.com/office/word/2010/wordprocessingInk" xmlns:wne="http://schemas.microsoft.com/office/word/2006/wordml" xmlns:wps="http://schemas.microsoft.com/office/word/2010/wordprocessingShape" mc:Ignorable="w14 w15 w16se w16cid w16 w16cex w16sdtdh w16sdtfl w16du wp14">
+<w:hdr xmlns:wpc="http://schemas.microsoft.com/office/word/2010/wordprocessingCanvas" xmlns:cx="http://schemas.microsoft.com/office/drawing/2014/chartex" xmlns:cx1="http://schemas.microsoft.com/office/drawing/2015/9/8/chartex" xmlns:cx2="http://schemas.microsoft.com/office/drawing/2015/10/21/chartex" xmlns:cx3="http://schemas.microsoft.com/office/drawing/2016/5/9/chartex" xmlns:cx4="http://schemas.microsoft.com/office/drawing/2016/5/10/chartex" xmlns:cx5="http://schemas.microsoft.com/office/drawing/2016/5/11/chartex" xmlns:cx6="http://schemas.microsoft.com/office/drawing/2016/5/12/chartex" xmlns:cx7="http://schemas.microsoft.com/office/drawing/2016/5/13/chartex" xmlns:cx8="http://schemas.microsoft.com/office/drawing/2016/5/14/chartex" xmlns:mc="http://schemas.openxmlformats.org/markup-compatibility/2006" xmlns:aink="http://schemas.microsoft.com/office/drawing/2016/ink" xmlns:am3d="http://schemas.microsoft.com/office/drawing/2017/model3d" xmlns:o="urn:schemas-microsoft-com:office:office" xmlns:oel="http://schemas.microsoft.com/office/2019/extlst" xmlns:r="http://schemas.openxmlformats.org/officeDocument/2006/relationships" xmlns:m="http://schemas.openxmlformats.org/officeDocument/2006/math" xmlns:v="urn:schemas-microsoft-com:vml" xmlns:wp14="http://schemas.microsoft.com/office/word/2010/wordprocessingDrawing" xmlns:wp="http://schemas.openxmlformats.org/drawingml/2006/wordprocessingDrawing" xmlns:w10="urn:schemas-microsoft-com:office:word" xmlns:w="http://schemas.openxmlformats.org/wordprocessingml/2006/main" xmlns:w14="http://schemas.microsoft.com/office/word/2010/wordml" xmlns:w15="http://schemas.microsoft.com/office/word/2012/wordml" xmlns:w16cex="http://schemas.microsoft.com/office/word/2018/wordml/cex" xmlns:w16cid="http://schemas.microsoft.com/office/word/2016/wordml/cid" xmlns:w16="http://schemas.microsoft.com/office/word/2018/wordml" xmlns:w16sdtdh="http://schemas.microsoft.com/office/word/2020/wordml/sdtdatahash" xmlns:w16se="http://schemas.microsoft.com/office/word/2015/wordml/symex" xmlns:wpg="http://schemas.microsoft.com/office/word/2010/wordprocessingGroup" xmlns:wpi="http://schemas.microsoft.com/office/word/2010/wordprocessingInk" xmlns:wne="http://schemas.microsoft.com/office/word/2006/wordml" xmlns:wps="http://schemas.microsoft.com/office/word/2010/wordprocessingShape" mc:Ignorable="w14 w15 w16se w16cid w16 w16cex w16sdtdh wp14">
   <w:p>
     <w:pPr>
       <w:pStyle w:val="afe"/>
@@ -3893,7 +3796,7 @@
             </wp:anchor>
           </w:drawing>
         </mc:Choice>
-        <mc:Fallback xmlns:wpsCustomData="http://www.wps.cn/officeDocument/2013/wpsCustomData">
+        <mc:Fallback xmlns:wpsCustomData="http://www.wps.cn/officeDocument/2013/wpsCustomData" xmlns:w16sdtfl="http://schemas.microsoft.com/office/word/2024/wordml/sdtformatlock" xmlns:w16du="http://schemas.microsoft.com/office/word/2023/wordml/word16du">
           <w:pict>
             <v:line id="_x0000_s1026" o:spid="_x0000_s1026" o:spt="20" style="position:absolute;left:0pt;margin-left:-0.35pt;margin-top:2.35pt;height:0pt;width:482.05pt;z-index:251659264;mso-width-relative:page;mso-height-relative:page;" filled="f" stroked="t" coordsize="21600,21600" o:gfxdata="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">
               <v:fill on="f" focussize="0,0"/>
@@ -3910,8 +3813,28 @@
 </file>
 
 <file path=word/numbering.xml><?xml version="1.0" encoding="utf-8"?>
-<w:numbering xmlns:wpc="http://schemas.microsoft.com/office/word/2010/wordprocessingCanvas" xmlns:cx="http://schemas.microsoft.com/office/drawing/2014/chartex" xmlns:cx1="http://schemas.microsoft.com/office/drawing/2015/9/8/chartex" xmlns:cx2="http://schemas.microsoft.com/office/drawing/2015/10/21/chartex" xmlns:cx3="http://schemas.microsoft.com/office/drawing/2016/5/9/chartex" xmlns:cx4="http://schemas.microsoft.com/office/drawing/2016/5/10/chartex" xmlns:cx5="http://schemas.microsoft.com/office/drawing/2016/5/11/chartex" xmlns:cx6="http://schemas.microsoft.com/office/drawing/2016/5/12/chartex" xmlns:cx7="http://schemas.microsoft.com/office/drawing/2016/5/13/chartex" xmlns:cx8="http://schemas.microsoft.com/office/drawing/2016/5/14/chartex" xmlns:mc="http://schemas.openxmlformats.org/markup-compatibility/2006" xmlns:aink="http://schemas.microsoft.com/office/drawing/2016/ink" xmlns:am3d="http://schemas.microsoft.com/office/drawing/2017/model3d" xmlns:o="urn:schemas-microsoft-com:office:office" xmlns:oel="http://schemas.microsoft.com/office/2019/extlst" xmlns:r="http://schemas.openxmlformats.org/officeDocument/2006/relationships" xmlns:m="http://schemas.openxmlformats.org/officeDocument/2006/math" xmlns:v="urn:schemas-microsoft-com:vml" xmlns:wp14="http://schemas.microsoft.com/office/word/2010/wordprocessingDrawing" xmlns:wp="http://schemas.openxmlformats.org/drawingml/2006/wordprocessingDrawing" xmlns:w10="urn:schemas-microsoft-com:office:word" xmlns:w="http://schemas.openxmlformats.org/wordprocessingml/2006/main" xmlns:w14="http://schemas.microsoft.com/office/word/2010/wordml" xmlns:w15="http://schemas.microsoft.com/office/word/2012/wordml" xmlns:w16cex="http://schemas.microsoft.com/office/word/2018/wordml/cex" xmlns:w16cid="http://schemas.microsoft.com/office/word/2016/wordml/cid" xmlns:w16="http://schemas.microsoft.com/office/word/2018/wordml" xmlns:w16du="http://schemas.microsoft.com/office/word/2023/wordml/word16du" xmlns:w16sdtdh="http://schemas.microsoft.com/office/word/2020/wordml/sdtdatahash" xmlns:w16sdtfl="http://schemas.microsoft.com/office/word/2024/wordml/sdtformatlock" xmlns:w16se="http://schemas.microsoft.com/office/word/2015/wordml/symex" xmlns:wpg="http://schemas.microsoft.com/office/word/2010/wordprocessingGroup" xmlns:wpi="http://schemas.microsoft.com/office/word/2010/wordprocessingInk" xmlns:wne="http://schemas.microsoft.com/office/word/2006/wordml" xmlns:wps="http://schemas.microsoft.com/office/word/2010/wordprocessingShape" mc:Ignorable="w14 w15 w16se w16cid w16 w16cex w16sdtdh w16sdtfl w16du wp14">
+<w:numbering xmlns:wpc="http://schemas.microsoft.com/office/word/2010/wordprocessingCanvas" xmlns:cx="http://schemas.microsoft.com/office/drawing/2014/chartex" xmlns:cx1="http://schemas.microsoft.com/office/drawing/2015/9/8/chartex" xmlns:cx2="http://schemas.microsoft.com/office/drawing/2015/10/21/chartex" xmlns:cx3="http://schemas.microsoft.com/office/drawing/2016/5/9/chartex" xmlns:cx4="http://schemas.microsoft.com/office/drawing/2016/5/10/chartex" xmlns:cx5="http://schemas.microsoft.com/office/drawing/2016/5/11/chartex" xmlns:cx6="http://schemas.microsoft.com/office/drawing/2016/5/12/chartex" xmlns:cx7="http://schemas.microsoft.com/office/drawing/2016/5/13/chartex" xmlns:cx8="http://schemas.microsoft.com/office/drawing/2016/5/14/chartex" xmlns:mc="http://schemas.openxmlformats.org/markup-compatibility/2006" xmlns:aink="http://schemas.microsoft.com/office/drawing/2016/ink" xmlns:am3d="http://schemas.microsoft.com/office/drawing/2017/model3d" xmlns:o="urn:schemas-microsoft-com:office:office" xmlns:oel="http://schemas.microsoft.com/office/2019/extlst" xmlns:r="http://schemas.openxmlformats.org/officeDocument/2006/relationships" xmlns:m="http://schemas.openxmlformats.org/officeDocument/2006/math" xmlns:v="urn:schemas-microsoft-com:vml" xmlns:wp14="http://schemas.microsoft.com/office/word/2010/wordprocessingDrawing" xmlns:wp="http://schemas.openxmlformats.org/drawingml/2006/wordprocessingDrawing" xmlns:w10="urn:schemas-microsoft-com:office:word" xmlns:w="http://schemas.openxmlformats.org/wordprocessingml/2006/main" xmlns:w14="http://schemas.microsoft.com/office/word/2010/wordml" xmlns:w15="http://schemas.microsoft.com/office/word/2012/wordml" xmlns:w16cex="http://schemas.microsoft.com/office/word/2018/wordml/cex" xmlns:w16cid="http://schemas.microsoft.com/office/word/2016/wordml/cid" xmlns:w16="http://schemas.microsoft.com/office/word/2018/wordml" xmlns:w16sdtdh="http://schemas.microsoft.com/office/word/2020/wordml/sdtdatahash" xmlns:w16se="http://schemas.microsoft.com/office/word/2015/wordml/symex" xmlns:wpg="http://schemas.microsoft.com/office/word/2010/wordprocessingGroup" xmlns:wpi="http://schemas.microsoft.com/office/word/2010/wordprocessingInk" xmlns:wne="http://schemas.microsoft.com/office/word/2006/wordml" xmlns:wps="http://schemas.microsoft.com/office/word/2010/wordprocessingShape" mc:Ignorable="w14 w15 w16se w16cid w16 w16cex w16sdtdh wp14">
   <w:abstractNum w:abstractNumId="0" w15:restartNumberingAfterBreak="0">
+    <w:nsid w:val="FFFFFF89"/>
+    <w:multiLevelType w:val="singleLevel"/>
+    <w:tmpl w:val="DE40C3FA"/>
+    <w:lvl w:ilvl="0">
+      <w:start w:val="1"/>
+      <w:numFmt w:val="bullet"/>
+      <w:lvlText w:val=""/>
+      <w:lvlJc w:val="left"/>
+      <w:pPr>
+        <w:tabs>
+          <w:tab w:val="num" w:pos="360"/>
+        </w:tabs>
+        <w:ind w:left="360" w:hangingChars="200" w:hanging="360"/>
+      </w:pPr>
+      <w:rPr>
+        <w:rFonts w:ascii="Wingdings" w:hAnsi="Wingdings" w:hint="default"/>
+      </w:rPr>
+    </w:lvl>
+  </w:abstractNum>
+  <w:abstractNum w:abstractNumId="1" w15:restartNumberingAfterBreak="0">
     <w:nsid w:val="011C4320"/>
     <w:multiLevelType w:val="multilevel"/>
     <w:tmpl w:val="011C4320"/>
@@ -3997,7 +3920,7 @@
       </w:pPr>
     </w:lvl>
   </w:abstractNum>
-  <w:abstractNum w:abstractNumId="1" w15:restartNumberingAfterBreak="0">
+  <w:abstractNum w:abstractNumId="2" w15:restartNumberingAfterBreak="0">
     <w:nsid w:val="0AB73E66"/>
     <w:multiLevelType w:val="multilevel"/>
     <w:tmpl w:val="3F1EB03C"/>
@@ -4110,7 +4033,7 @@
       </w:pPr>
     </w:lvl>
   </w:abstractNum>
-  <w:abstractNum w:abstractNumId="2" w15:restartNumberingAfterBreak="0">
+  <w:abstractNum w:abstractNumId="3" w15:restartNumberingAfterBreak="0">
     <w:nsid w:val="0C316454"/>
     <w:multiLevelType w:val="multilevel"/>
     <w:tmpl w:val="0C316454"/>
@@ -4414,7 +4337,7 @@
       </w:rPr>
     </w:lvl>
   </w:abstractNum>
-  <w:abstractNum w:abstractNumId="3" w15:restartNumberingAfterBreak="0">
+  <w:abstractNum w:abstractNumId="4" w15:restartNumberingAfterBreak="0">
     <w:nsid w:val="0E8701E2"/>
     <w:multiLevelType w:val="multilevel"/>
     <w:tmpl w:val="0E8701E2"/>
@@ -4561,7 +4484,7 @@
       </w:rPr>
     </w:lvl>
   </w:abstractNum>
-  <w:abstractNum w:abstractNumId="4" w15:restartNumberingAfterBreak="0">
+  <w:abstractNum w:abstractNumId="5" w15:restartNumberingAfterBreak="0">
     <w:nsid w:val="0EDB2900"/>
     <w:multiLevelType w:val="multilevel"/>
     <w:tmpl w:val="0EDB2900"/>
@@ -4704,7 +4627,7 @@
       </w:rPr>
     </w:lvl>
   </w:abstractNum>
-  <w:abstractNum w:abstractNumId="5" w15:restartNumberingAfterBreak="0">
+  <w:abstractNum w:abstractNumId="6" w15:restartNumberingAfterBreak="0">
     <w:nsid w:val="1A89310D"/>
     <w:multiLevelType w:val="multilevel"/>
     <w:tmpl w:val="1A89310D"/>
@@ -4821,7 +4744,7 @@
       </w:rPr>
     </w:lvl>
   </w:abstractNum>
-  <w:abstractNum w:abstractNumId="6" w15:restartNumberingAfterBreak="0">
+  <w:abstractNum w:abstractNumId="7" w15:restartNumberingAfterBreak="0">
     <w:nsid w:val="20453EF0"/>
     <w:multiLevelType w:val="multilevel"/>
     <w:tmpl w:val="20453EF0"/>
@@ -4962,7 +4885,7 @@
       </w:rPr>
     </w:lvl>
   </w:abstractNum>
-  <w:abstractNum w:abstractNumId="7" w15:restartNumberingAfterBreak="0">
+  <w:abstractNum w:abstractNumId="8" w15:restartNumberingAfterBreak="0">
     <w:nsid w:val="217C4E11"/>
     <w:multiLevelType w:val="hybridMultilevel"/>
     <w:tmpl w:val="BE14ACE2"/>
@@ -5051,7 +4974,7 @@
       </w:pPr>
     </w:lvl>
   </w:abstractNum>
-  <w:abstractNum w:abstractNumId="8" w15:restartNumberingAfterBreak="0">
+  <w:abstractNum w:abstractNumId="9" w15:restartNumberingAfterBreak="0">
     <w:nsid w:val="27470AA3"/>
     <w:multiLevelType w:val="multilevel"/>
     <w:tmpl w:val="A63CF85A"/>
@@ -5200,7 +5123,7 @@
       </w:rPr>
     </w:lvl>
   </w:abstractNum>
-  <w:abstractNum w:abstractNumId="9" w15:restartNumberingAfterBreak="0">
+  <w:abstractNum w:abstractNumId="10" w15:restartNumberingAfterBreak="0">
     <w:nsid w:val="2DF849C8"/>
     <w:multiLevelType w:val="multilevel"/>
     <w:tmpl w:val="A87ADA18"/>
@@ -5313,7 +5236,7 @@
       </w:pPr>
     </w:lvl>
   </w:abstractNum>
-  <w:abstractNum w:abstractNumId="10" w15:restartNumberingAfterBreak="0">
+  <w:abstractNum w:abstractNumId="11" w15:restartNumberingAfterBreak="0">
     <w:nsid w:val="345A1EFE"/>
     <w:multiLevelType w:val="multilevel"/>
     <w:tmpl w:val="7A20B2CA"/>
@@ -5462,7 +5385,7 @@
       </w:rPr>
     </w:lvl>
   </w:abstractNum>
-  <w:abstractNum w:abstractNumId="11" w15:restartNumberingAfterBreak="0">
+  <w:abstractNum w:abstractNumId="12" w15:restartNumberingAfterBreak="0">
     <w:nsid w:val="36094023"/>
     <w:multiLevelType w:val="multilevel"/>
     <w:tmpl w:val="74DA7418"/>
@@ -5611,7 +5534,7 @@
       </w:rPr>
     </w:lvl>
   </w:abstractNum>
-  <w:abstractNum w:abstractNumId="12" w15:restartNumberingAfterBreak="0">
+  <w:abstractNum w:abstractNumId="13" w15:restartNumberingAfterBreak="0">
     <w:nsid w:val="424F1D64"/>
     <w:multiLevelType w:val="hybridMultilevel"/>
     <w:tmpl w:val="BBAAF25E"/>
@@ -5700,7 +5623,7 @@
       </w:pPr>
     </w:lvl>
   </w:abstractNum>
-  <w:abstractNum w:abstractNumId="13" w15:restartNumberingAfterBreak="0">
+  <w:abstractNum w:abstractNumId="14" w15:restartNumberingAfterBreak="0">
     <w:nsid w:val="4281059D"/>
     <w:multiLevelType w:val="multilevel"/>
     <w:tmpl w:val="4281059D"/>
@@ -5786,7 +5709,7 @@
       </w:pPr>
     </w:lvl>
   </w:abstractNum>
-  <w:abstractNum w:abstractNumId="14" w15:restartNumberingAfterBreak="0">
+  <w:abstractNum w:abstractNumId="15" w15:restartNumberingAfterBreak="0">
     <w:nsid w:val="42FE570A"/>
     <w:multiLevelType w:val="multilevel"/>
     <w:tmpl w:val="42FE570A"/>
@@ -5953,7 +5876,7 @@
       </w:rPr>
     </w:lvl>
   </w:abstractNum>
-  <w:abstractNum w:abstractNumId="15" w15:restartNumberingAfterBreak="0">
+  <w:abstractNum w:abstractNumId="16" w15:restartNumberingAfterBreak="0">
     <w:nsid w:val="463C3DB5"/>
     <w:multiLevelType w:val="multilevel"/>
     <w:tmpl w:val="463C3DB5"/>
@@ -6097,7 +6020,7 @@
       </w:rPr>
     </w:lvl>
   </w:abstractNum>
-  <w:abstractNum w:abstractNumId="16" w15:restartNumberingAfterBreak="0">
+  <w:abstractNum w:abstractNumId="17" w15:restartNumberingAfterBreak="0">
     <w:nsid w:val="4752559E"/>
     <w:multiLevelType w:val="multilevel"/>
     <w:tmpl w:val="4752559E"/>
@@ -6186,7 +6109,7 @@
       </w:pPr>
     </w:lvl>
   </w:abstractNum>
-  <w:abstractNum w:abstractNumId="17" w15:restartNumberingAfterBreak="0">
+  <w:abstractNum w:abstractNumId="18" w15:restartNumberingAfterBreak="0">
     <w:nsid w:val="4DDA66D1"/>
     <w:multiLevelType w:val="multilevel"/>
     <w:tmpl w:val="4DDA66D1"/>
@@ -6438,7 +6361,7 @@
       </w:rPr>
     </w:lvl>
   </w:abstractNum>
-  <w:abstractNum w:abstractNumId="18" w15:restartNumberingAfterBreak="0">
+  <w:abstractNum w:abstractNumId="19" w15:restartNumberingAfterBreak="0">
     <w:nsid w:val="53E827B9"/>
     <w:multiLevelType w:val="multilevel"/>
     <w:tmpl w:val="53E827B9"/>
@@ -6551,7 +6474,7 @@
       </w:rPr>
     </w:lvl>
   </w:abstractNum>
-  <w:abstractNum w:abstractNumId="19" w15:restartNumberingAfterBreak="0">
+  <w:abstractNum w:abstractNumId="20" w15:restartNumberingAfterBreak="0">
     <w:nsid w:val="56C04D8F"/>
     <w:multiLevelType w:val="multilevel"/>
     <w:tmpl w:val="56C04D8F"/>
@@ -6671,7 +6594,7 @@
       </w:rPr>
     </w:lvl>
   </w:abstractNum>
-  <w:abstractNum w:abstractNumId="20" w15:restartNumberingAfterBreak="0">
+  <w:abstractNum w:abstractNumId="21" w15:restartNumberingAfterBreak="0">
     <w:nsid w:val="667437AC"/>
     <w:multiLevelType w:val="multilevel"/>
     <w:tmpl w:val="667437AC"/>
@@ -6815,7 +6738,7 @@
       </w:rPr>
     </w:lvl>
   </w:abstractNum>
-  <w:abstractNum w:abstractNumId="21" w15:restartNumberingAfterBreak="0">
+  <w:abstractNum w:abstractNumId="22" w15:restartNumberingAfterBreak="0">
     <w:nsid w:val="66CF57CF"/>
     <w:multiLevelType w:val="multilevel"/>
     <w:tmpl w:val="F3AEE172"/>
@@ -6964,7 +6887,7 @@
       </w:rPr>
     </w:lvl>
   </w:abstractNum>
-  <w:abstractNum w:abstractNumId="22" w15:restartNumberingAfterBreak="0">
+  <w:abstractNum w:abstractNumId="23" w15:restartNumberingAfterBreak="0">
     <w:nsid w:val="67DE040F"/>
     <w:multiLevelType w:val="multilevel"/>
     <w:tmpl w:val="67DE040F"/>
@@ -7078,7 +7001,7 @@
       </w:rPr>
     </w:lvl>
   </w:abstractNum>
-  <w:abstractNum w:abstractNumId="23" w15:restartNumberingAfterBreak="0">
+  <w:abstractNum w:abstractNumId="24" w15:restartNumberingAfterBreak="0">
     <w:nsid w:val="6BB66D97"/>
     <w:multiLevelType w:val="multilevel"/>
     <w:tmpl w:val="0E1E0CD0"/>
@@ -7191,7 +7114,7 @@
       </w:rPr>
     </w:lvl>
   </w:abstractNum>
-  <w:abstractNum w:abstractNumId="24" w15:restartNumberingAfterBreak="0">
+  <w:abstractNum w:abstractNumId="25" w15:restartNumberingAfterBreak="0">
     <w:nsid w:val="708C7AD2"/>
     <w:multiLevelType w:val="multilevel"/>
     <w:tmpl w:val="708C7AD2"/>
@@ -7281,7 +7204,7 @@
       </w:pPr>
     </w:lvl>
   </w:abstractNum>
-  <w:abstractNum w:abstractNumId="25" w15:restartNumberingAfterBreak="0">
+  <w:abstractNum w:abstractNumId="26" w15:restartNumberingAfterBreak="0">
     <w:nsid w:val="72347E6A"/>
     <w:multiLevelType w:val="multilevel"/>
     <w:tmpl w:val="72347E6A"/>
@@ -7422,7 +7345,7 @@
       </w:rPr>
     </w:lvl>
   </w:abstractNum>
-  <w:abstractNum w:abstractNumId="26" w15:restartNumberingAfterBreak="0">
+  <w:abstractNum w:abstractNumId="27" w15:restartNumberingAfterBreak="0">
     <w:nsid w:val="73B067F6"/>
     <w:multiLevelType w:val="multilevel"/>
     <w:tmpl w:val="73B067F6"/>
@@ -7537,7 +7460,7 @@
       </w:rPr>
     </w:lvl>
   </w:abstractNum>
-  <w:abstractNum w:abstractNumId="27" w15:restartNumberingAfterBreak="0">
+  <w:abstractNum w:abstractNumId="28" w15:restartNumberingAfterBreak="0">
     <w:nsid w:val="748276DB"/>
     <w:multiLevelType w:val="multilevel"/>
     <w:tmpl w:val="04A22A32"/>
@@ -7687,94 +7610,97 @@
     </w:lvl>
   </w:abstractNum>
   <w:num w:numId="1" w16cid:durableId="168639135">
+    <w:abstractNumId w:val="3"/>
+  </w:num>
+  <w:num w:numId="2" w16cid:durableId="2026007838">
+    <w:abstractNumId w:val="26"/>
+  </w:num>
+  <w:num w:numId="3" w16cid:durableId="1871869836">
+    <w:abstractNumId w:val="7"/>
+  </w:num>
+  <w:num w:numId="4" w16cid:durableId="216549844">
+    <w:abstractNumId w:val="15"/>
+  </w:num>
+  <w:num w:numId="5" w16cid:durableId="1905287298">
+    <w:abstractNumId w:val="20"/>
+  </w:num>
+  <w:num w:numId="6" w16cid:durableId="2013947913">
+    <w:abstractNumId w:val="4"/>
+  </w:num>
+  <w:num w:numId="7" w16cid:durableId="127206705">
+    <w:abstractNumId w:val="5"/>
+  </w:num>
+  <w:num w:numId="8" w16cid:durableId="132060881">
+    <w:abstractNumId w:val="16"/>
+  </w:num>
+  <w:num w:numId="9" w16cid:durableId="1377855835">
+    <w:abstractNumId w:val="6"/>
+  </w:num>
+  <w:num w:numId="10" w16cid:durableId="1051268832">
+    <w:abstractNumId w:val="21"/>
+  </w:num>
+  <w:num w:numId="11" w16cid:durableId="79911342">
+    <w:abstractNumId w:val="18"/>
+  </w:num>
+  <w:num w:numId="12" w16cid:durableId="327632030">
+    <w:abstractNumId w:val="25"/>
+  </w:num>
+  <w:num w:numId="13" w16cid:durableId="1000500585">
+    <w:abstractNumId w:val="23"/>
+  </w:num>
+  <w:num w:numId="14" w16cid:durableId="2084180253">
+    <w:abstractNumId w:val="27"/>
+  </w:num>
+  <w:num w:numId="15" w16cid:durableId="723990405">
+    <w:abstractNumId w:val="19"/>
+  </w:num>
+  <w:num w:numId="16" w16cid:durableId="192117472">
+    <w:abstractNumId w:val="17"/>
+  </w:num>
+  <w:num w:numId="17" w16cid:durableId="159661373">
+    <w:abstractNumId w:val="1"/>
+  </w:num>
+  <w:num w:numId="18" w16cid:durableId="1162546346">
+    <w:abstractNumId w:val="14"/>
+  </w:num>
+  <w:num w:numId="19" w16cid:durableId="247426011">
+    <w:abstractNumId w:val="22"/>
+  </w:num>
+  <w:num w:numId="20" w16cid:durableId="1614247481">
+    <w:abstractNumId w:val="10"/>
+  </w:num>
+  <w:num w:numId="21" w16cid:durableId="1915116023">
+    <w:abstractNumId w:val="12"/>
+  </w:num>
+  <w:num w:numId="22" w16cid:durableId="1350986347">
+    <w:abstractNumId w:val="9"/>
+  </w:num>
+  <w:num w:numId="23" w16cid:durableId="1009910143">
+    <w:abstractNumId w:val="13"/>
+  </w:num>
+  <w:num w:numId="24" w16cid:durableId="202255650">
+    <w:abstractNumId w:val="24"/>
+  </w:num>
+  <w:num w:numId="25" w16cid:durableId="975329617">
+    <w:abstractNumId w:val="28"/>
+  </w:num>
+  <w:num w:numId="26" w16cid:durableId="1402484687">
     <w:abstractNumId w:val="2"/>
   </w:num>
-  <w:num w:numId="2" w16cid:durableId="2026007838">
-    <w:abstractNumId w:val="25"/>
-  </w:num>
-  <w:num w:numId="3" w16cid:durableId="1871869836">
-    <w:abstractNumId w:val="6"/>
-  </w:num>
-  <w:num w:numId="4" w16cid:durableId="216549844">
-    <w:abstractNumId w:val="14"/>
-  </w:num>
-  <w:num w:numId="5" w16cid:durableId="1905287298">
-    <w:abstractNumId w:val="19"/>
-  </w:num>
-  <w:num w:numId="6" w16cid:durableId="2013947913">
-    <w:abstractNumId w:val="3"/>
-  </w:num>
-  <w:num w:numId="7" w16cid:durableId="127206705">
-    <w:abstractNumId w:val="4"/>
-  </w:num>
-  <w:num w:numId="8" w16cid:durableId="132060881">
-    <w:abstractNumId w:val="15"/>
-  </w:num>
-  <w:num w:numId="9" w16cid:durableId="1377855835">
-    <w:abstractNumId w:val="5"/>
-  </w:num>
-  <w:num w:numId="10" w16cid:durableId="1051268832">
-    <w:abstractNumId w:val="20"/>
-  </w:num>
-  <w:num w:numId="11" w16cid:durableId="79911342">
-    <w:abstractNumId w:val="17"/>
-  </w:num>
-  <w:num w:numId="12" w16cid:durableId="327632030">
-    <w:abstractNumId w:val="24"/>
-  </w:num>
-  <w:num w:numId="13" w16cid:durableId="1000500585">
-    <w:abstractNumId w:val="22"/>
-  </w:num>
-  <w:num w:numId="14" w16cid:durableId="2084180253">
-    <w:abstractNumId w:val="26"/>
-  </w:num>
-  <w:num w:numId="15" w16cid:durableId="723990405">
-    <w:abstractNumId w:val="18"/>
-  </w:num>
-  <w:num w:numId="16" w16cid:durableId="192117472">
-    <w:abstractNumId w:val="16"/>
-  </w:num>
-  <w:num w:numId="17" w16cid:durableId="159661373">
-    <w:abstractNumId w:val="0"/>
-  </w:num>
-  <w:num w:numId="18" w16cid:durableId="1162546346">
-    <w:abstractNumId w:val="13"/>
-  </w:num>
-  <w:num w:numId="19" w16cid:durableId="247426011">
-    <w:abstractNumId w:val="21"/>
-  </w:num>
-  <w:num w:numId="20" w16cid:durableId="1614247481">
-    <w:abstractNumId w:val="9"/>
-  </w:num>
-  <w:num w:numId="21" w16cid:durableId="1915116023">
+  <w:num w:numId="27" w16cid:durableId="1722827067">
     <w:abstractNumId w:val="11"/>
   </w:num>
-  <w:num w:numId="22" w16cid:durableId="1350986347">
+  <w:num w:numId="28" w16cid:durableId="1189490953">
     <w:abstractNumId w:val="8"/>
   </w:num>
-  <w:num w:numId="23" w16cid:durableId="1009910143">
-    <w:abstractNumId w:val="12"/>
-  </w:num>
-  <w:num w:numId="24" w16cid:durableId="202255650">
-    <w:abstractNumId w:val="23"/>
-  </w:num>
-  <w:num w:numId="25" w16cid:durableId="975329617">
-    <w:abstractNumId w:val="27"/>
-  </w:num>
-  <w:num w:numId="26" w16cid:durableId="1402484687">
-    <w:abstractNumId w:val="1"/>
-  </w:num>
-  <w:num w:numId="27" w16cid:durableId="1722827067">
-    <w:abstractNumId w:val="10"/>
-  </w:num>
-  <w:num w:numId="28" w16cid:durableId="1189490953">
-    <w:abstractNumId w:val="7"/>
+  <w:num w:numId="29" w16cid:durableId="259220862">
+    <w:abstractNumId w:val="0"/>
   </w:num>
 </w:numbering>
 </file>
 
 <file path=word/styles.xml><?xml version="1.0" encoding="utf-8"?>
-<w:styles xmlns:mc="http://schemas.openxmlformats.org/markup-compatibility/2006" xmlns:r="http://schemas.openxmlformats.org/officeDocument/2006/relationships" xmlns:w="http://schemas.openxmlformats.org/wordprocessingml/2006/main" xmlns:w14="http://schemas.microsoft.com/office/word/2010/wordml" xmlns:w15="http://schemas.microsoft.com/office/word/2012/wordml" xmlns:w16cex="http://schemas.microsoft.com/office/word/2018/wordml/cex" xmlns:w16cid="http://schemas.microsoft.com/office/word/2016/wordml/cid" xmlns:w16="http://schemas.microsoft.com/office/word/2018/wordml" xmlns:w16du="http://schemas.microsoft.com/office/word/2023/wordml/word16du" xmlns:w16sdtdh="http://schemas.microsoft.com/office/word/2020/wordml/sdtdatahash" xmlns:w16sdtfl="http://schemas.microsoft.com/office/word/2024/wordml/sdtformatlock" xmlns:w16se="http://schemas.microsoft.com/office/word/2015/wordml/symex" mc:Ignorable="w14 w15 w16se w16cid w16 w16cex w16sdtdh w16sdtfl w16du">
+<w:styles xmlns:mc="http://schemas.openxmlformats.org/markup-compatibility/2006" xmlns:r="http://schemas.openxmlformats.org/officeDocument/2006/relationships" xmlns:w="http://schemas.openxmlformats.org/wordprocessingml/2006/main" xmlns:w14="http://schemas.microsoft.com/office/word/2010/wordml" xmlns:w15="http://schemas.microsoft.com/office/word/2012/wordml" xmlns:w16cex="http://schemas.microsoft.com/office/word/2018/wordml/cex" xmlns:w16cid="http://schemas.microsoft.com/office/word/2016/wordml/cid" xmlns:w16="http://schemas.microsoft.com/office/word/2018/wordml" xmlns:w16sdtdh="http://schemas.microsoft.com/office/word/2020/wordml/sdtdatahash" xmlns:w16se="http://schemas.microsoft.com/office/word/2015/wordml/symex" mc:Ignorable="w14 w15 w16se w16cid w16 w16cex w16sdtdh">
   <w:docDefaults>
     <w:rPrDefault>
       <w:rPr>
@@ -14373,6 +14299,9 @@
     <w:trPr>
       <w:cantSplit/>
     </w:trPr>
+    <w:tcPr>
+      <w:shd w:val="clear" w:color="auto" w:fill="auto"/>
+    </w:tcPr>
     <w:tblStylePr w:type="firstRow">
       <w:rPr>
         <w:b w:val="0"/>
@@ -14982,28 +14911,6 @@
 </file>
 
 <file path=customXml/item1.xml><?xml version="1.0" encoding="utf-8"?>
-<?mso-contentType ?>
-<FormTemplates xmlns="http://schemas.microsoft.com/sharepoint/v3/contenttype/forms">
-  <Display>DocumentLibraryForm</Display>
-  <Edit>DocumentLibraryForm</Edit>
-  <New>DocumentLibraryForm</New>
-</FormTemplates>
-</file>
-
-<file path=customXml/item2.xml><?xml version="1.0" encoding="utf-8"?>
-<s:customData xmlns="http://www.wps.cn/officeDocument/2013/wpsCustomData" xmlns:s="http://www.wps.cn/officeDocument/2013/wpsCustomData">
-  <customSectProps>
-    <customSectPr/>
-    <customSectPr/>
-    <customSectPr/>
-  </customSectProps>
-  <customShpExts>
-    <customShpInfo spid="_x0000_s1026" textRotate="1"/>
-  </customShpExts>
-</s:customData>
-</file>
-
-<file path=customXml/item3.xml><?xml version="1.0" encoding="utf-8"?>
 <ct:contentTypeSchema xmlns:ct="http://schemas.microsoft.com/office/2006/metadata/contentType" xmlns:ma="http://schemas.microsoft.com/office/2006/metadata/properties/metaAttributes" ma:contentTypeID="0x010100CC226774B8D87F4D92D9D1F6859ED44E" ma:contentTypeDescription="Create a new document." ma:contentTypeVersion="0" ma:contentTypeName="Document" ma:_="" ct:_="" ma:versionID="2405c1ce63a3409bcef189279c704bc6" ma:contentTypeScope="">
   <xsd:schema xmlns:xs="http://www.w3.org/2001/XMLSchema" xmlns:xsd="http://www.w3.org/2001/XMLSchema" xmlns:p="http://schemas.microsoft.com/office/2006/metadata/properties" ma:fieldsID="c64490b4aec6201516c3a874156f37b2" targetNamespace="http://schemas.microsoft.com/office/2006/metadata/properties" ma:root="true">
     <xsd:element name="properties">
@@ -15117,33 +15024,39 @@
 </ct:contentTypeSchema>
 </file>
 
+<file path=customXml/item2.xml><?xml version="1.0" encoding="utf-8"?>
+<s:customData xmlns="http://www.wps.cn/officeDocument/2013/wpsCustomData" xmlns:s="http://www.wps.cn/officeDocument/2013/wpsCustomData">
+  <customSectProps>
+    <customSectPr/>
+    <customSectPr/>
+    <customSectPr/>
+  </customSectProps>
+  <customShpExts>
+    <customShpInfo spid="_x0000_s1026" textRotate="1"/>
+  </customShpExts>
+</s:customData>
+</file>
+
+<file path=customXml/item3.xml><?xml version="1.0" encoding="utf-8"?>
+<?mso-contentType ?>
+<FormTemplates xmlns="http://schemas.microsoft.com/sharepoint/v3/contenttype/forms">
+  <Display>DocumentLibraryForm</Display>
+  <Edit>DocumentLibraryForm</Edit>
+  <New>DocumentLibraryForm</New>
+</FormTemplates>
+</file>
+
 <file path=customXml/item4.xml><?xml version="1.0" encoding="utf-8"?>
+<b:Sources xmlns="http://schemas.openxmlformats.org/officeDocument/2006/bibliography" xmlns:b="http://schemas.openxmlformats.org/officeDocument/2006/bibliography" StyleName="APA" SelectedStyle="\APA.XSL"/>
+</file>
+
+<file path=customXml/item5.xml><?xml version="1.0" encoding="utf-8"?>
 <p:properties xmlns:xsi="http://www.w3.org/2001/XMLSchema-instance" xmlns:p="http://schemas.microsoft.com/office/2006/metadata/properties" xmlns:pc="http://schemas.microsoft.com/office/infopath/2007/PartnerControls">
   <documentManagement/>
 </p:properties>
 </file>
 
-<file path=customXml/item5.xml><?xml version="1.0" encoding="utf-8"?>
-<b:Sources xmlns="http://schemas.openxmlformats.org/officeDocument/2006/bibliography" xmlns:b="http://schemas.openxmlformats.org/officeDocument/2006/bibliography" StyleName="APA" SelectedStyle="\APA.XSL"/>
-</file>
-
 <file path=customXml/itemProps1.xml><?xml version="1.0" encoding="utf-8"?>
-<ds:datastoreItem xmlns:ds="http://schemas.openxmlformats.org/officeDocument/2006/customXml" ds:itemID="{EEA82ABF-3C64-4AD6-A3F8-BF7B6BBD7965}">
-  <ds:schemaRefs>
-    <ds:schemaRef ds:uri="http://schemas.microsoft.com/sharepoint/v3/contenttype/forms"/>
-  </ds:schemaRefs>
-</ds:datastoreItem>
-</file>
-
-<file path=customXml/itemProps2.xml><?xml version="1.0" encoding="utf-8"?>
-<ds:datastoreItem xmlns:ds="http://schemas.openxmlformats.org/officeDocument/2006/customXml" ds:itemID="{B1977F7D-205B-4081-913C-38D41E755F92}">
-  <ds:schemaRefs>
-    <ds:schemaRef ds:uri="http://www.wps.cn/officeDocument/2013/wpsCustomData"/>
-  </ds:schemaRefs>
-</ds:datastoreItem>
-</file>
-
-<file path=customXml/itemProps3.xml><?xml version="1.0" encoding="utf-8"?>
 <ds:datastoreItem xmlns:ds="http://schemas.openxmlformats.org/officeDocument/2006/customXml" ds:itemID="{45D7D905-E2AE-4379-91E5-B62BCFCA4D08}">
   <ds:schemaRefs>
     <ds:schemaRef ds:uri="http://schemas.microsoft.com/office/2006/metadata/contentType"/>
@@ -15159,19 +15072,35 @@
 </ds:datastoreItem>
 </file>
 
+<file path=customXml/itemProps2.xml><?xml version="1.0" encoding="utf-8"?>
+<ds:datastoreItem xmlns:ds="http://schemas.openxmlformats.org/officeDocument/2006/customXml" ds:itemID="{B1977F7D-205B-4081-913C-38D41E755F92}">
+  <ds:schemaRefs>
+    <ds:schemaRef ds:uri="http://www.wps.cn/officeDocument/2013/wpsCustomData"/>
+  </ds:schemaRefs>
+</ds:datastoreItem>
+</file>
+
+<file path=customXml/itemProps3.xml><?xml version="1.0" encoding="utf-8"?>
+<ds:datastoreItem xmlns:ds="http://schemas.openxmlformats.org/officeDocument/2006/customXml" ds:itemID="{EEA82ABF-3C64-4AD6-A3F8-BF7B6BBD7965}">
+  <ds:schemaRefs>
+    <ds:schemaRef ds:uri="http://schemas.microsoft.com/sharepoint/v3/contenttype/forms"/>
+  </ds:schemaRefs>
+</ds:datastoreItem>
+</file>
+
 <file path=customXml/itemProps4.xml><?xml version="1.0" encoding="utf-8"?>
+<ds:datastoreItem xmlns:ds="http://schemas.openxmlformats.org/officeDocument/2006/customXml" ds:itemID="{04971A66-DA16-41DE-826A-1C5FA64A249A}">
+  <ds:schemaRefs>
+    <ds:schemaRef ds:uri="http://schemas.openxmlformats.org/officeDocument/2006/bibliography"/>
+  </ds:schemaRefs>
+</ds:datastoreItem>
+</file>
+
+<file path=customXml/itemProps5.xml><?xml version="1.0" encoding="utf-8"?>
 <ds:datastoreItem xmlns:ds="http://schemas.openxmlformats.org/officeDocument/2006/customXml" ds:itemID="{BC21252C-4A9D-4501-ACF4-B5A790D1D626}">
   <ds:schemaRefs>
     <ds:schemaRef ds:uri="http://schemas.microsoft.com/office/2006/metadata/properties"/>
     <ds:schemaRef ds:uri="http://schemas.microsoft.com/office/infopath/2007/PartnerControls"/>
   </ds:schemaRefs>
 </ds:datastoreItem>
-</file>
-
-<file path=customXml/itemProps5.xml><?xml version="1.0" encoding="utf-8"?>
-<ds:datastoreItem xmlns:ds="http://schemas.openxmlformats.org/officeDocument/2006/customXml" ds:itemID="{04971A66-DA16-41DE-826A-1C5FA64A249A}">
-  <ds:schemaRefs>
-    <ds:schemaRef ds:uri="http://schemas.openxmlformats.org/officeDocument/2006/bibliography"/>
-  </ds:schemaRefs>
-</ds:datastoreItem>
 </file>
</xml_diff>